<commit_message>
Update author affiliations, fix figure placement, and minor text edits in NHB draft
</commit_message>
<xml_diff>
--- a/NHB-draft.docx
+++ b/NHB-draft.docx
@@ -527,33 +527,33 @@
           <w:rFonts w:cs="Times New Roman"/>
           <w:vertAlign w:val="superscript"/>
         </w:rPr>
+        <w:t>3</w:t>
+      </w:r>
+      <w:r>
+        <w:rPr>
+          <w:rFonts w:cs="Times New Roman"/>
+        </w:rPr>
+        <w:t>, Maya Christiane Flensborg Jensen</w:t>
+      </w:r>
+      <w:r>
+        <w:rPr>
+          <w:rFonts w:cs="Times New Roman"/>
+          <w:vertAlign w:val="superscript"/>
+        </w:rPr>
         <w:t>1</w:t>
       </w:r>
       <w:r>
         <w:rPr>
           <w:rFonts w:cs="Times New Roman"/>
         </w:rPr>
-        <w:t>, Maya Christiane Flensborg Jensen</w:t>
+        <w:t>, Elizabeth Bengtsen</w:t>
       </w:r>
       <w:r>
         <w:rPr>
           <w:rFonts w:cs="Times New Roman"/>
           <w:vertAlign w:val="superscript"/>
         </w:rPr>
-        <w:t>1</w:t>
-      </w:r>
-      <w:r>
-        <w:rPr>
-          <w:rFonts w:cs="Times New Roman"/>
-        </w:rPr>
-        <w:t>, Elizabeth Bengtsen</w:t>
-      </w:r>
-      <w:r>
-        <w:rPr>
-          <w:rFonts w:cs="Times New Roman"/>
-          <w:vertAlign w:val="superscript"/>
-        </w:rPr>
-        <w:t>1</w:t>
+        <w:t>3</w:t>
       </w:r>
       <w:r>
         <w:rPr>
@@ -655,6 +655,43 @@
         </w:rPr>
         <w:t>, Denmark</w:t>
       </w:r>
+      <w:r>
+        <w:rPr>
+          <w:rFonts w:cs="Times New Roman"/>
+        </w:rPr>
+        <w:tab/>
+      </w:r>
+      <w:r>
+        <w:rPr>
+          <w:rFonts w:cs="Times New Roman"/>
+        </w:rPr>
+        <w:br/>
+      </w:r>
+      <w:r>
+        <w:rPr>
+          <w:rFonts w:cs="Times New Roman"/>
+          <w:vertAlign w:val="superscript"/>
+        </w:rPr>
+        <w:t xml:space="preserve">3 </w:t>
+      </w:r>
+      <w:r>
+        <w:rPr>
+          <w:rFonts w:cs="Times New Roman"/>
+        </w:rPr>
+        <w:t>Independent researcher</w:t>
+      </w:r>
+      <w:r>
+        <w:rPr>
+          <w:rFonts w:cs="Times New Roman"/>
+        </w:rPr>
+        <w:tab/>
+      </w:r>
+      <w:r>
+        <w:rPr>
+          <w:rFonts w:cs="Times New Roman"/>
+        </w:rPr>
+        <w:br/>
+      </w:r>
     </w:p>
     <w:p>
       <w:pPr>
@@ -728,19 +765,6 @@
           <w:rFonts w:cs="Times New Roman"/>
         </w:rPr>
       </w:pPr>
-    </w:p>
-    <w:p>
-      <w:pPr>
-        <w:rPr>
-          <w:rFonts w:cs="Times New Roman"/>
-        </w:rPr>
-      </w:pPr>
-      <w:r>
-        <w:rPr>
-          <w:rFonts w:cs="Times New Roman"/>
-        </w:rPr>
-        <w:br w:type="page"/>
-      </w:r>
     </w:p>
     <w:p>
       <w:pPr>
@@ -2004,85 +2028,203 @@
           <w:bCs/>
         </w:rPr>
       </w:pPr>
-      <w:commentRangeStart w:id="0"/>
-      <w:r>
+    </w:p>
+    <w:p>
+      <w:pPr>
         <w:rPr>
           <w:rFonts w:eastAsia="Times New Roman"/>
           <w:b/>
           <w:bCs/>
         </w:rPr>
-        <w:t>FIG</w:t>
-      </w:r>
-      <w:r>
+      </w:pPr>
+    </w:p>
+    <w:p>
+      <w:pPr>
         <w:rPr>
           <w:rFonts w:eastAsia="Times New Roman"/>
           <w:b/>
           <w:bCs/>
         </w:rPr>
-        <w:t xml:space="preserve">. 1 | </w:t>
-      </w:r>
-      <w:r>
+      </w:pPr>
+    </w:p>
+    <w:p>
+      <w:pPr>
         <w:rPr>
           <w:rFonts w:eastAsia="Times New Roman"/>
           <w:b/>
           <w:bCs/>
         </w:rPr>
-        <w:t>Flow chart of the screening process</w:t>
-      </w:r>
-      <w:r>
+      </w:pPr>
+    </w:p>
+    <w:p>
+      <w:pPr>
         <w:rPr>
           <w:rFonts w:eastAsia="Times New Roman"/>
           <w:b/>
           <w:bCs/>
         </w:rPr>
-        <w:t xml:space="preserve">, following the </w:t>
-      </w:r>
-      <w:r>
+      </w:pPr>
+    </w:p>
+    <w:p>
+      <w:pPr>
         <w:rPr>
           <w:rFonts w:eastAsia="Times New Roman"/>
           <w:b/>
           <w:bCs/>
         </w:rPr>
-        <w:t>Preferred Reporting Items for Systematic Reviews and Meta-Analyses</w:t>
-      </w:r>
-      <w:r>
+      </w:pPr>
+    </w:p>
+    <w:p>
+      <w:pPr>
         <w:rPr>
           <w:rFonts w:eastAsia="Times New Roman"/>
           <w:b/>
           <w:bCs/>
         </w:rPr>
-        <w:t xml:space="preserve"> </w:t>
-      </w:r>
-      <w:r>
+      </w:pPr>
+    </w:p>
+    <w:p>
+      <w:pPr>
         <w:rPr>
           <w:rFonts w:eastAsia="Times New Roman"/>
           <w:b/>
           <w:bCs/>
         </w:rPr>
-        <w:t>(PRISMA) guideline</w:t>
-      </w:r>
-      <w:r>
+      </w:pPr>
+    </w:p>
+    <w:p>
+      <w:pPr>
         <w:rPr>
           <w:rFonts w:eastAsia="Times New Roman"/>
           <w:b/>
           <w:bCs/>
         </w:rPr>
+      </w:pPr>
+    </w:p>
+    <w:p>
+      <w:pPr>
+        <w:rPr>
+          <w:rFonts w:eastAsia="Times New Roman"/>
+          <w:b/>
+          <w:bCs/>
+        </w:rPr>
+      </w:pPr>
+    </w:p>
+    <w:p>
+      <w:pPr>
+        <w:rPr>
+          <w:rFonts w:eastAsia="Times New Roman"/>
+          <w:b/>
+          <w:bCs/>
+        </w:rPr>
+      </w:pPr>
+    </w:p>
+    <w:p>
+      <w:pPr>
+        <w:rPr>
+          <w:rFonts w:eastAsia="Times New Roman"/>
+          <w:b/>
+          <w:bCs/>
+        </w:rPr>
+      </w:pPr>
+    </w:p>
+    <w:p>
+      <w:pPr>
+        <w:rPr>
+          <w:rFonts w:eastAsia="Times New Roman"/>
+          <w:b/>
+          <w:bCs/>
+        </w:rPr>
+      </w:pPr>
+    </w:p>
+    <w:p>
+      <w:pPr>
+        <w:rPr>
+          <w:rFonts w:eastAsia="Times New Roman"/>
+          <w:b/>
+          <w:bCs/>
+        </w:rPr>
+      </w:pPr>
+    </w:p>
+    <w:p>
+      <w:pPr>
+        <w:rPr>
+          <w:rFonts w:eastAsia="Times New Roman"/>
+          <w:b/>
+          <w:bCs/>
+        </w:rPr>
+      </w:pPr>
+      <w:r>
+        <w:rPr>
+          <w:rFonts w:eastAsia="Times New Roman"/>
+          <w:b/>
+          <w:bCs/>
+        </w:rPr>
+        <w:lastRenderedPageBreak/>
+        <w:t>FIG</w:t>
+      </w:r>
+      <w:r>
+        <w:rPr>
+          <w:rFonts w:eastAsia="Times New Roman"/>
+          <w:b/>
+          <w:bCs/>
+        </w:rPr>
+        <w:t xml:space="preserve">. 1 | </w:t>
+      </w:r>
+      <w:r>
+        <w:rPr>
+          <w:rFonts w:eastAsia="Times New Roman"/>
+          <w:b/>
+          <w:bCs/>
+        </w:rPr>
+        <w:t>Flow chart of the screening process</w:t>
+      </w:r>
+      <w:r>
+        <w:rPr>
+          <w:rFonts w:eastAsia="Times New Roman"/>
+          <w:b/>
+          <w:bCs/>
+        </w:rPr>
+        <w:t xml:space="preserve">, following the </w:t>
+      </w:r>
+      <w:r>
+        <w:rPr>
+          <w:rFonts w:eastAsia="Times New Roman"/>
+          <w:b/>
+          <w:bCs/>
+        </w:rPr>
+        <w:t>Preferred Reporting Items for Systematic Reviews and Meta-Analyses</w:t>
+      </w:r>
+      <w:r>
+        <w:rPr>
+          <w:rFonts w:eastAsia="Times New Roman"/>
+          <w:b/>
+          <w:bCs/>
+        </w:rPr>
+        <w:t xml:space="preserve"> </w:t>
+      </w:r>
+      <w:r>
+        <w:rPr>
+          <w:rFonts w:eastAsia="Times New Roman"/>
+          <w:b/>
+          <w:bCs/>
+        </w:rPr>
+        <w:t>(PRISMA) guideline</w:t>
+      </w:r>
+      <w:r>
+        <w:rPr>
+          <w:rFonts w:eastAsia="Times New Roman"/>
+          <w:b/>
+          <w:bCs/>
+        </w:rPr>
         <w:t>.</w:t>
       </w:r>
-      <w:commentRangeEnd w:id="0"/>
-      <w:r>
-        <w:rPr>
-          <w:rStyle w:val="CommentReference"/>
-        </w:rPr>
-        <w:commentReference w:id="0"/>
-      </w:r>
     </w:p>
     <w:p>
       <w:r>
         <w:rPr>
           <w:noProof/>
         </w:rPr>
-        <w:lastRenderedPageBreak/>
         <w:drawing>
           <wp:inline distT="0" distB="0" distL="0" distR="0" wp14:anchorId="5957B785" wp14:editId="15B975D3">
             <wp:extent cx="4191609" cy="4328221"/>
@@ -2099,7 +2241,7 @@
                     <pic:cNvPicPr/>
                   </pic:nvPicPr>
                   <pic:blipFill>
-                    <a:blip r:embed="rId12"/>
+                    <a:blip r:embed="rId8"/>
                     <a:stretch>
                       <a:fillRect/>
                     </a:stretch>
@@ -2197,22 +2339,6 @@
     <w:p>
       <w:pPr>
         <w:rPr>
-          <w:b/>
-          <w:bCs/>
-        </w:rPr>
-      </w:pPr>
-    </w:p>
-    <w:p>
-      <w:pPr>
-        <w:rPr>
-          <w:b/>
-          <w:bCs/>
-        </w:rPr>
-      </w:pPr>
-    </w:p>
-    <w:p>
-      <w:pPr>
-        <w:rPr>
           <w:rFonts w:eastAsia="Times New Roman"/>
           <w:b/>
           <w:bCs/>
@@ -2254,7 +2380,6 @@
       </w:r>
     </w:p>
     <w:p>
-      <w:commentRangeStart w:id="1"/>
       <w:r>
         <w:rPr>
           <w:noProof/>
@@ -2277,7 +2402,7 @@
                     </pic:cNvPicPr>
                   </pic:nvPicPr>
                   <pic:blipFill>
-                    <a:blip r:embed="rId13" cstate="print">
+                    <a:blip r:embed="rId9" cstate="print">
                       <a:extLst>
                         <a:ext uri="{28A0092B-C50C-407E-A947-70E740481C1C}">
                           <a14:useLocalDpi xmlns:a14="http://schemas.microsoft.com/office/drawing/2010/main" val="0"/>
@@ -2308,13 +2433,6 @@
           </wp:inline>
         </w:drawing>
       </w:r>
-      <w:commentRangeEnd w:id="1"/>
-      <w:r>
-        <w:rPr>
-          <w:rStyle w:val="CommentReference"/>
-        </w:rPr>
-        <w:commentReference w:id="1"/>
-      </w:r>
     </w:p>
     <w:p>
       <w:pPr>
@@ -2356,7 +2474,6 @@
           <w:bCs/>
         </w:rPr>
       </w:pPr>
-      <w:commentRangeStart w:id="2"/>
       <w:r>
         <w:rPr>
           <w:b/>
@@ -2412,13 +2529,6 @@
           <w:bCs/>
         </w:rPr>
         <w:t>s</w:t>
-      </w:r>
-      <w:commentRangeEnd w:id="2"/>
-      <w:r>
-        <w:rPr>
-          <w:rStyle w:val="CommentReference"/>
-        </w:rPr>
-        <w:commentReference w:id="2"/>
       </w:r>
     </w:p>
     <w:tbl>
@@ -4688,33 +4798,55 @@
         <w:rPr>
           <w:rFonts w:cs="Times New Roman"/>
         </w:rPr>
-        <w:t xml:space="preserve"> Find a </w:t>
-      </w:r>
-      <w:proofErr w:type="gramStart"/>
-      <w:r>
-        <w:rPr>
-          <w:rFonts w:cs="Times New Roman"/>
-        </w:rPr>
-        <w:t xml:space="preserve">full descriptions of </w:t>
-      </w:r>
-      <w:r>
-        <w:rPr>
-          <w:rFonts w:cs="Times New Roman"/>
-        </w:rPr>
-        <w:t>the included participant</w:t>
-      </w:r>
-      <w:proofErr w:type="gramEnd"/>
-      <w:r>
-        <w:rPr>
-          <w:rFonts w:cs="Times New Roman"/>
-        </w:rPr>
-        <w:t xml:space="preserve"> by primary type of mental disorder and primary indicator of marginalization</w:t>
-      </w:r>
-      <w:r>
-        <w:rPr>
-          <w:rFonts w:cs="Times New Roman"/>
-        </w:rPr>
-        <w:t xml:space="preserve"> the Supplementary Material Figure S1.</w:t>
+        <w:t xml:space="preserve"> Find a full </w:t>
+      </w:r>
+      <w:r>
+        <w:rPr>
+          <w:rFonts w:cs="Times New Roman"/>
+        </w:rPr>
+        <w:t>description</w:t>
+      </w:r>
+      <w:r>
+        <w:rPr>
+          <w:rFonts w:cs="Times New Roman"/>
+        </w:rPr>
+        <w:t xml:space="preserve"> of the included participant</w:t>
+      </w:r>
+      <w:r>
+        <w:rPr>
+          <w:rFonts w:cs="Times New Roman"/>
+        </w:rPr>
+        <w:t>s</w:t>
+      </w:r>
+      <w:r>
+        <w:rPr>
+          <w:rFonts w:cs="Times New Roman"/>
+        </w:rPr>
+        <w:t xml:space="preserve"> by primary type of mental disorder and primary indicator of </w:t>
+      </w:r>
+      <w:r>
+        <w:rPr>
+          <w:rFonts w:cs="Times New Roman"/>
+        </w:rPr>
+        <w:t xml:space="preserve">social </w:t>
+      </w:r>
+      <w:r>
+        <w:rPr>
+          <w:rFonts w:cs="Times New Roman"/>
+        </w:rPr>
+        <w:t xml:space="preserve">marginalization </w:t>
+      </w:r>
+      <w:r>
+        <w:rPr>
+          <w:rFonts w:cs="Times New Roman"/>
+        </w:rPr>
+        <w:t xml:space="preserve">in </w:t>
+      </w:r>
+      <w:r>
+        <w:rPr>
+          <w:rFonts w:cs="Times New Roman"/>
+        </w:rPr>
+        <w:t>the Supplementary Material Figure S1.</w:t>
       </w:r>
     </w:p>
     <w:p/>
@@ -5051,13 +5183,6 @@
     </w:p>
     <w:p>
       <w:pPr>
-        <w:rPr>
-          <w:rFonts w:cs="Times New Roman"/>
-        </w:rPr>
-      </w:pPr>
-    </w:p>
-    <w:p>
-      <w:pPr>
         <w:jc w:val="both"/>
       </w:pPr>
       <w:r>
@@ -5091,20 +5216,12 @@
       <w:r>
         <w:t xml:space="preserve"> </w:t>
       </w:r>
-      <w:commentRangeStart w:id="3"/>
       <w:r>
         <w:rPr>
           <w:b/>
           <w:bCs/>
         </w:rPr>
         <w:t>Descriptive percentages for the included studies with reintegration outcomes</w:t>
-      </w:r>
-      <w:commentRangeEnd w:id="3"/>
-      <w:r>
-        <w:rPr>
-          <w:rStyle w:val="CommentReference"/>
-        </w:rPr>
-        <w:commentReference w:id="3"/>
       </w:r>
     </w:p>
     <w:tbl>
@@ -9881,7 +9998,6 @@
                 <w:sz w:val="18"/>
                 <w:szCs w:val="18"/>
               </w:rPr>
-              <w:lastRenderedPageBreak/>
               <w:t>Intervention type</w:t>
             </w:r>
           </w:p>
@@ -9920,6 +10036,7 @@
                 <w:sz w:val="18"/>
                 <w:szCs w:val="18"/>
               </w:rPr>
+              <w:lastRenderedPageBreak/>
               <w:t>CBT</w:t>
             </w:r>
           </w:p>
@@ -14747,7 +14864,6 @@
           <w:bCs/>
         </w:rPr>
       </w:pPr>
-      <w:commentRangeStart w:id="4"/>
       <w:r>
         <w:rPr>
           <w:rFonts w:cs="Times New Roman"/>
@@ -14814,13 +14930,6 @@
         </w:rPr>
         <w:t xml:space="preserve"> of randomized controlled trials. </w:t>
       </w:r>
-      <w:commentRangeEnd w:id="4"/>
-      <w:r>
-        <w:rPr>
-          <w:rStyle w:val="CommentReference"/>
-        </w:rPr>
-        <w:commentReference w:id="4"/>
-      </w:r>
     </w:p>
     <w:p>
       <w:r>
@@ -14828,9 +14937,9 @@
           <w:noProof/>
         </w:rPr>
         <w:drawing>
-          <wp:inline distT="0" distB="0" distL="0" distR="0" wp14:anchorId="7FEC1F08" wp14:editId="3688E697">
-            <wp:extent cx="4330598" cy="2486660"/>
-            <wp:effectExtent l="0" t="0" r="0" b="8890"/>
+          <wp:inline distT="0" distB="0" distL="0" distR="0" wp14:anchorId="7FEC1F08" wp14:editId="26B27832">
+            <wp:extent cx="5340096" cy="3066321"/>
+            <wp:effectExtent l="0" t="0" r="0" b="1270"/>
             <wp:docPr id="4" name="Picture 4"/>
             <wp:cNvGraphicFramePr>
               <a:graphicFrameLocks xmlns:a="http://schemas.openxmlformats.org/drawingml/2006/main" noChangeAspect="1"/>
@@ -14843,7 +14952,7 @@
                     <pic:cNvPicPr/>
                   </pic:nvPicPr>
                   <pic:blipFill>
-                    <a:blip r:embed="rId14" cstate="print">
+                    <a:blip r:embed="rId10" cstate="print">
                       <a:extLst>
                         <a:ext uri="{28A0092B-C50C-407E-A947-70E740481C1C}">
                           <a14:useLocalDpi xmlns:a14="http://schemas.microsoft.com/office/drawing/2010/main" val="0"/>
@@ -14857,7 +14966,7 @@
                   <pic:spPr>
                     <a:xfrm>
                       <a:off x="0" y="0"/>
-                      <a:ext cx="4353159" cy="2499615"/>
+                      <a:ext cx="5395323" cy="3098033"/>
                     </a:xfrm>
                     <a:prstGeom prst="rect">
                       <a:avLst/>
@@ -14962,11 +15071,6 @@
       <w:pPr>
         <w:jc w:val="both"/>
       </w:pPr>
-    </w:p>
-    <w:p>
-      <w:pPr>
-        <w:jc w:val="both"/>
-      </w:pPr>
       <w:r>
         <w:lastRenderedPageBreak/>
         <w:t>Risk of bias was generally higher among non-randomized studies assessed with</w:t>
@@ -15289,12 +15393,84 @@
           <w:bCs/>
         </w:rPr>
       </w:pPr>
-      <w:commentRangeStart w:id="5"/>
-      <w:r>
+    </w:p>
+    <w:p>
+      <w:pPr>
         <w:rPr>
           <w:b/>
           <w:bCs/>
         </w:rPr>
+      </w:pPr>
+    </w:p>
+    <w:p>
+      <w:pPr>
+        <w:rPr>
+          <w:b/>
+          <w:bCs/>
+        </w:rPr>
+      </w:pPr>
+    </w:p>
+    <w:p>
+      <w:pPr>
+        <w:rPr>
+          <w:b/>
+          <w:bCs/>
+        </w:rPr>
+      </w:pPr>
+    </w:p>
+    <w:p>
+      <w:pPr>
+        <w:rPr>
+          <w:b/>
+          <w:bCs/>
+        </w:rPr>
+      </w:pPr>
+    </w:p>
+    <w:p>
+      <w:pPr>
+        <w:rPr>
+          <w:b/>
+          <w:bCs/>
+        </w:rPr>
+      </w:pPr>
+    </w:p>
+    <w:p>
+      <w:pPr>
+        <w:rPr>
+          <w:b/>
+          <w:bCs/>
+        </w:rPr>
+      </w:pPr>
+    </w:p>
+    <w:p>
+      <w:pPr>
+        <w:rPr>
+          <w:b/>
+          <w:bCs/>
+        </w:rPr>
+      </w:pPr>
+    </w:p>
+    <w:p>
+      <w:pPr>
+        <w:rPr>
+          <w:b/>
+          <w:bCs/>
+        </w:rPr>
+      </w:pPr>
+    </w:p>
+    <w:p>
+      <w:pPr>
+        <w:rPr>
+          <w:b/>
+          <w:bCs/>
+        </w:rPr>
+      </w:pPr>
+      <w:r>
+        <w:rPr>
+          <w:b/>
+          <w:bCs/>
+        </w:rPr>
+        <w:lastRenderedPageBreak/>
         <w:t>F</w:t>
       </w:r>
       <w:r>
@@ -15326,13 +15502,6 @@
         </w:rPr>
         <w:t>Effect size forest plot across dependent effect sizes by type of outcome</w:t>
       </w:r>
-      <w:commentRangeEnd w:id="5"/>
-      <w:r>
-        <w:rPr>
-          <w:rStyle w:val="CommentReference"/>
-        </w:rPr>
-        <w:commentReference w:id="5"/>
-      </w:r>
     </w:p>
     <w:p>
       <w:r>
@@ -15341,7 +15510,6 @@
           <w:sz w:val="16"/>
           <w:szCs w:val="16"/>
         </w:rPr>
-        <w:lastRenderedPageBreak/>
         <w:drawing>
           <wp:inline distT="0" distB="0" distL="0" distR="0" wp14:anchorId="14580E1B" wp14:editId="0915B547">
             <wp:extent cx="4784140" cy="5262458"/>
@@ -15358,7 +15526,7 @@
                     <pic:cNvPicPr/>
                   </pic:nvPicPr>
                   <pic:blipFill>
-                    <a:blip r:embed="rId15" cstate="print">
+                    <a:blip r:embed="rId11" cstate="print">
                       <a:extLst>
                         <a:ext uri="{28A0092B-C50C-407E-A947-70E740481C1C}">
                           <a14:useLocalDpi xmlns:a14="http://schemas.microsoft.com/office/drawing/2010/main" val="0"/>
@@ -15423,11 +15591,36 @@
           <w:bCs/>
         </w:rPr>
       </w:pPr>
-      <w:r>
+    </w:p>
+    <w:p>
+      <w:pPr>
         <w:rPr>
           <w:b/>
           <w:bCs/>
         </w:rPr>
+      </w:pPr>
+    </w:p>
+    <w:p>
+      <w:pPr>
+        <w:rPr>
+          <w:b/>
+          <w:bCs/>
+        </w:rPr>
+      </w:pPr>
+    </w:p>
+    <w:p>
+      <w:pPr>
+        <w:rPr>
+          <w:b/>
+          <w:bCs/>
+        </w:rPr>
+      </w:pPr>
+      <w:r>
+        <w:rPr>
+          <w:b/>
+          <w:bCs/>
+        </w:rPr>
+        <w:lastRenderedPageBreak/>
         <w:t xml:space="preserve">Fig. </w:t>
       </w:r>
       <w:r>
@@ -15459,14 +15652,12 @@
           <w:rFonts w:cs="Times New Roman"/>
         </w:rPr>
       </w:pPr>
-      <w:commentRangeStart w:id="6"/>
       <w:r>
         <w:rPr>
           <w:noProof/>
           <w:sz w:val="16"/>
           <w:szCs w:val="16"/>
         </w:rPr>
-        <w:lastRenderedPageBreak/>
         <w:drawing>
           <wp:inline distT="0" distB="0" distL="0" distR="0" wp14:anchorId="1C843562" wp14:editId="42426B28">
             <wp:extent cx="4506163" cy="4205662"/>
@@ -15483,7 +15674,7 @@
                     <pic:cNvPicPr/>
                   </pic:nvPicPr>
                   <pic:blipFill>
-                    <a:blip r:embed="rId16" cstate="print">
+                    <a:blip r:embed="rId12" cstate="print">
                       <a:extLst>
                         <a:ext uri="{28A0092B-C50C-407E-A947-70E740481C1C}">
                           <a14:useLocalDpi xmlns:a14="http://schemas.microsoft.com/office/drawing/2010/main" val="0"/>
@@ -15509,13 +15700,6 @@
           </wp:inline>
         </w:drawing>
       </w:r>
-      <w:commentRangeEnd w:id="6"/>
-      <w:r>
-        <w:rPr>
-          <w:rStyle w:val="CommentReference"/>
-        </w:rPr>
-        <w:commentReference w:id="6"/>
-      </w:r>
     </w:p>
     <w:p>
       <w:pPr>
@@ -15760,7 +15944,11 @@
         <w:t>,</w:t>
       </w:r>
       <w:r>
-        <w:t xml:space="preserve"> or implementation context, may be especially important for mental health effects. The 67% prediction interval ranged from −0.120 to 0.549, with approximately 74% of future studies expected to show positive effects.</w:t>
+        <w:t xml:space="preserve"> or implementation context, may be especially important for mental health effects. The 67% prediction </w:t>
+      </w:r>
+      <w:r>
+        <w:lastRenderedPageBreak/>
+        <w:t>interval ranged from −0.120 to 0.549, with approximately 74% of future studies expected to show positive effects.</w:t>
       </w:r>
       <w:r>
         <w:t xml:space="preserve"> </w:t>
@@ -15771,7 +15959,6 @@
         <w:jc w:val="both"/>
       </w:pPr>
       <w:r>
-        <w:lastRenderedPageBreak/>
         <w:t>Overall, the predictive distributions indicate that group-based interventions are likely to produce positive effects in most future studies, particularly for social reintegration. However, the wider prediction interval for mental health suggests that effects on clinical outcomes are less stable and may depend more strongly on study context, population</w:t>
       </w:r>
       <w:r>
@@ -15926,19 +16113,13 @@
         <w:t>Overall, publication bias does not appear to be a major concern, likely aided by the high proportion of preregistered studies.</w:t>
       </w:r>
       <w:r>
-        <w:t xml:space="preserve"> </w:t>
-      </w:r>
-      <w:r>
-        <w:t>See the Supplementary Table S</w:t>
+        <w:t xml:space="preserve"> See the Supplementary Table S</w:t>
       </w:r>
       <w:r>
         <w:t>5</w:t>
       </w:r>
       <w:r>
-        <w:t xml:space="preserve"> for publication-bias adjusted overall average effects.</w:t>
-      </w:r>
-      <w:r>
-        <w:t xml:space="preserve"> Moreover, all publication bias tests and visualizations can be found in the Online Appendix E.</w:t>
+        <w:t xml:space="preserve"> for publication-bias adjusted overall average effects. Moreover, all publication bias tests and visualizations can be found in the Online Appendix E.</w:t>
       </w:r>
     </w:p>
     <w:p>
@@ -15949,27 +16130,33 @@
           <w:bCs/>
         </w:rPr>
       </w:pPr>
-      <w:r>
+    </w:p>
+    <w:p>
+      <w:pPr>
+        <w:jc w:val="both"/>
         <w:rPr>
           <w:b/>
           <w:bCs/>
         </w:rPr>
-        <w:t xml:space="preserve">Fig. </w:t>
-      </w:r>
-      <w:r>
+      </w:pPr>
+    </w:p>
+    <w:p>
+      <w:pPr>
+        <w:jc w:val="both"/>
         <w:rPr>
           <w:b/>
           <w:bCs/>
         </w:rPr>
-        <w:t>6</w:t>
-      </w:r>
-      <w:r>
+      </w:pPr>
+    </w:p>
+    <w:p>
+      <w:pPr>
+        <w:jc w:val="both"/>
         <w:rPr>
           <w:b/>
           <w:bCs/>
         </w:rPr>
-        <w:t xml:space="preserve"> | Funnel plot across registration status and type of outcome </w:t>
-      </w:r>
+      </w:pPr>
     </w:p>
     <w:p>
       <w:pPr>
@@ -15979,14 +16166,61 @@
           <w:bCs/>
         </w:rPr>
       </w:pPr>
-      <w:commentRangeStart w:id="7"/>
+    </w:p>
+    <w:p>
+      <w:pPr>
+        <w:jc w:val="both"/>
+        <w:rPr>
+          <w:b/>
+          <w:bCs/>
+        </w:rPr>
+      </w:pPr>
+    </w:p>
+    <w:p>
+      <w:pPr>
+        <w:jc w:val="both"/>
+        <w:rPr>
+          <w:b/>
+          <w:bCs/>
+        </w:rPr>
+      </w:pPr>
+      <w:r>
+        <w:rPr>
+          <w:b/>
+          <w:bCs/>
+        </w:rPr>
+        <w:lastRenderedPageBreak/>
+        <w:t xml:space="preserve">Fig. </w:t>
+      </w:r>
+      <w:r>
+        <w:rPr>
+          <w:b/>
+          <w:bCs/>
+        </w:rPr>
+        <w:t>6</w:t>
+      </w:r>
+      <w:r>
+        <w:rPr>
+          <w:b/>
+          <w:bCs/>
+        </w:rPr>
+        <w:t xml:space="preserve"> | Funnel plot across registration status and type of outcome </w:t>
+      </w:r>
+    </w:p>
+    <w:p>
+      <w:pPr>
+        <w:jc w:val="both"/>
+        <w:rPr>
+          <w:b/>
+          <w:bCs/>
+        </w:rPr>
+      </w:pPr>
       <w:r>
         <w:rPr>
           <w:b/>
           <w:bCs/>
           <w:noProof/>
         </w:rPr>
-        <w:lastRenderedPageBreak/>
         <w:drawing>
           <wp:inline distT="0" distB="0" distL="0" distR="0" wp14:anchorId="02322B93" wp14:editId="116C979B">
             <wp:extent cx="4828032" cy="3713871"/>
@@ -16003,7 +16237,7 @@
                     <pic:cNvPicPr/>
                   </pic:nvPicPr>
                   <pic:blipFill>
-                    <a:blip r:embed="rId17" cstate="print">
+                    <a:blip r:embed="rId13" cstate="print">
                       <a:extLst>
                         <a:ext uri="{28A0092B-C50C-407E-A947-70E740481C1C}">
                           <a14:useLocalDpi xmlns:a14="http://schemas.microsoft.com/office/drawing/2010/main" val="0"/>
@@ -16029,13 +16263,6 @@
           </wp:inline>
         </w:drawing>
       </w:r>
-      <w:commentRangeEnd w:id="7"/>
-      <w:r>
-        <w:rPr>
-          <w:rStyle w:val="CommentReference"/>
-        </w:rPr>
-        <w:commentReference w:id="7"/>
-      </w:r>
     </w:p>
     <w:p>
       <w:pPr>
@@ -17144,8 +17371,8 @@
         </w:rPr>
         <w:t xml:space="preserve"> of studies </w:t>
       </w:r>
-      <w:bookmarkStart w:id="8" w:name="ELECTRONIC_SEARCHES"/>
-      <w:bookmarkEnd w:id="8"/>
+      <w:bookmarkStart w:id="0" w:name="ELECTRONIC_SEARCHES"/>
+      <w:bookmarkEnd w:id="0"/>
       <w:r>
         <w:t> </w:t>
       </w:r>
@@ -17538,8 +17765,8 @@
         </w:rPr>
         <w:t xml:space="preserve"> retrieved in full text. </w:t>
       </w:r>
-      <w:bookmarkStart w:id="9" w:name="DATA_EXTRACTION"/>
-      <w:bookmarkEnd w:id="9"/>
+      <w:bookmarkStart w:id="1" w:name="DATA_EXTRACTION"/>
+      <w:bookmarkEnd w:id="1"/>
     </w:p>
     <w:p>
       <w:pPr>
@@ -17910,7 +18137,7 @@
       <w:r>
         <w:t xml:space="preserve">All formulas behind this calculation can be found at </w:t>
       </w:r>
-      <w:hyperlink r:id="rId18" w:history="1">
+      <w:hyperlink r:id="rId14" w:history="1">
         <w:r>
           <w:rPr>
             <w:rStyle w:val="Hyperlink"/>
@@ -18523,7 +18750,7 @@
       <w:r>
         <w:t xml:space="preserve"> behind this study can be found at </w:t>
       </w:r>
-      <w:hyperlink r:id="rId19" w:history="1">
+      <w:hyperlink r:id="rId15" w:history="1">
         <w:r>
           <w:rPr>
             <w:rStyle w:val="Hyperlink"/>
@@ -18583,7 +18810,7 @@
       <w:r>
         <w:t xml:space="preserve"> stored at </w:t>
       </w:r>
-      <w:hyperlink r:id="rId20" w:history="1">
+      <w:hyperlink r:id="rId16" w:history="1">
         <w:r>
           <w:rPr>
             <w:rStyle w:val="Hyperlink"/>
@@ -23122,7 +23349,7 @@
       </w:pPr>
     </w:p>
     <w:sectPr>
-      <w:headerReference w:type="default" r:id="rId21"/>
+      <w:headerReference w:type="default" r:id="rId17"/>
       <w:pgSz w:w="12240" w:h="15840"/>
       <w:pgMar w:top="1701" w:right="1134" w:bottom="1701" w:left="1134" w:header="708" w:footer="708" w:gutter="0"/>
       <w:cols w:space="708"/>
@@ -23130,181 +23357,6 @@
     </w:sectPr>
   </w:body>
 </w:document>
-</file>
-
-<file path=word/comments.xml><?xml version="1.0" encoding="utf-8"?>
-<w:comments xmlns:wpc="http://schemas.microsoft.com/office/word/2010/wordprocessingCanvas" xmlns:cx="http://schemas.microsoft.com/office/drawing/2014/chartex" xmlns:cx1="http://schemas.microsoft.com/office/drawing/2015/9/8/chartex" xmlns:cx2="http://schemas.microsoft.com/office/drawing/2015/10/21/chartex" xmlns:cx3="http://schemas.microsoft.com/office/drawing/2016/5/9/chartex" xmlns:cx4="http://schemas.microsoft.com/office/drawing/2016/5/10/chartex" xmlns:cx5="http://schemas.microsoft.com/office/drawing/2016/5/11/chartex" xmlns:cx6="http://schemas.microsoft.com/office/drawing/2016/5/12/chartex" xmlns:cx7="http://schemas.microsoft.com/office/drawing/2016/5/13/chartex" xmlns:cx8="http://schemas.microsoft.com/office/drawing/2016/5/14/chartex" xmlns:mc="http://schemas.openxmlformats.org/markup-compatibility/2006" xmlns:aink="http://schemas.microsoft.com/office/drawing/2016/ink" xmlns:am3d="http://schemas.microsoft.com/office/drawing/2017/model3d" xmlns:o="urn:schemas-microsoft-com:office:office" xmlns:oel="http://schemas.microsoft.com/office/2019/extlst" xmlns:r="http://schemas.openxmlformats.org/officeDocument/2006/relationships" xmlns:m="http://schemas.openxmlformats.org/officeDocument/2006/math" xmlns:v="urn:schemas-microsoft-com:vml" xmlns:wp14="http://schemas.microsoft.com/office/word/2010/wordprocessingDrawing" xmlns:wp="http://schemas.openxmlformats.org/drawingml/2006/wordprocessingDrawing" xmlns:w10="urn:schemas-microsoft-com:office:word" xmlns:w="http://schemas.openxmlformats.org/wordprocessingml/2006/main" xmlns:w14="http://schemas.microsoft.com/office/word/2010/wordml" xmlns:w15="http://schemas.microsoft.com/office/word/2012/wordml" xmlns:w16cex="http://schemas.microsoft.com/office/word/2018/wordml/cex" xmlns:w16cid="http://schemas.microsoft.com/office/word/2016/wordml/cid" xmlns:w16="http://schemas.microsoft.com/office/word/2018/wordml" xmlns:w16sdtdh="http://schemas.microsoft.com/office/word/2020/wordml/sdtdatahash" xmlns:w16se="http://schemas.microsoft.com/office/word/2015/wordml/symex" xmlns:wpg="http://schemas.microsoft.com/office/word/2010/wordprocessingGroup" xmlns:wpi="http://schemas.microsoft.com/office/word/2010/wordprocessingInk" xmlns:wne="http://schemas.microsoft.com/office/word/2006/wordml" xmlns:wps="http://schemas.microsoft.com/office/word/2010/wordprocessingShape" mc:Ignorable="w14 w15 w16se w16cid w16 w16cex w16sdtdh wp14">
-  <w:comment w:id="0" w:author="Mikkel Helding Vembye" w:date="2026-05-07T10:57:00Z" w:initials="MHV">
-    <w:p>
-      <w:pPr>
-        <w:pStyle w:val="CommentText"/>
-      </w:pPr>
-      <w:r>
-        <w:rPr>
-          <w:rStyle w:val="CommentReference"/>
-        </w:rPr>
-        <w:annotationRef/>
-      </w:r>
-      <w:r>
-        <w:t>1</w:t>
-      </w:r>
-    </w:p>
-  </w:comment>
-  <w:comment w:id="1" w:author="Mikkel Helding Vembye" w:date="2026-05-07T11:40:00Z" w:initials="MHV">
-    <w:p>
-      <w:pPr>
-        <w:pStyle w:val="CommentText"/>
-      </w:pPr>
-      <w:r>
-        <w:rPr>
-          <w:rStyle w:val="CommentReference"/>
-        </w:rPr>
-        <w:annotationRef/>
-      </w:r>
-      <w:r>
-        <w:t>2</w:t>
-      </w:r>
-    </w:p>
-  </w:comment>
-  <w:comment w:id="2" w:author="Mikkel Helding Vembye" w:date="2026-05-07T10:57:00Z" w:initials="MHV">
-    <w:p>
-      <w:pPr>
-        <w:pStyle w:val="CommentText"/>
-      </w:pPr>
-      <w:r>
-        <w:rPr>
-          <w:rStyle w:val="CommentReference"/>
-        </w:rPr>
-        <w:annotationRef/>
-      </w:r>
-      <w:r>
-        <w:t>3</w:t>
-      </w:r>
-    </w:p>
-  </w:comment>
-  <w:comment w:id="3" w:author="Mikkel Helding Vembye" w:date="2026-05-07T10:57:00Z" w:initials="MHV">
-    <w:p>
-      <w:pPr>
-        <w:pStyle w:val="CommentText"/>
-      </w:pPr>
-      <w:r>
-        <w:rPr>
-          <w:rStyle w:val="CommentReference"/>
-        </w:rPr>
-        <w:annotationRef/>
-      </w:r>
-      <w:r>
-        <w:rPr>
-          <w:rStyle w:val="CommentReference"/>
-        </w:rPr>
-        <w:t>4</w:t>
-      </w:r>
-    </w:p>
-  </w:comment>
-  <w:comment w:id="4" w:author="Mikkel Helding Vembye" w:date="2026-05-07T10:57:00Z" w:initials="MHV">
-    <w:p>
-      <w:pPr>
-        <w:pStyle w:val="CommentText"/>
-      </w:pPr>
-      <w:r>
-        <w:rPr>
-          <w:rStyle w:val="CommentReference"/>
-        </w:rPr>
-        <w:annotationRef/>
-      </w:r>
-      <w:r>
-        <w:t>5</w:t>
-      </w:r>
-    </w:p>
-  </w:comment>
-  <w:comment w:id="5" w:author="Mikkel Helding Vembye" w:date="2026-05-07T10:58:00Z" w:initials="MHV">
-    <w:p>
-      <w:pPr>
-        <w:pStyle w:val="CommentText"/>
-      </w:pPr>
-      <w:r>
-        <w:rPr>
-          <w:rStyle w:val="CommentReference"/>
-        </w:rPr>
-        <w:annotationRef/>
-      </w:r>
-      <w:r>
-        <w:t>6</w:t>
-      </w:r>
-    </w:p>
-  </w:comment>
-  <w:comment w:id="6" w:author="Mikkel Helding Vembye" w:date="2026-05-07T10:58:00Z" w:initials="MHV">
-    <w:p>
-      <w:pPr>
-        <w:pStyle w:val="CommentText"/>
-      </w:pPr>
-      <w:r>
-        <w:rPr>
-          <w:rStyle w:val="CommentReference"/>
-        </w:rPr>
-        <w:annotationRef/>
-      </w:r>
-      <w:r>
-        <w:t>7</w:t>
-      </w:r>
-    </w:p>
-  </w:comment>
-  <w:comment w:id="7" w:author="Mikkel Helding Vembye" w:date="2026-05-07T10:58:00Z" w:initials="MHV">
-    <w:p>
-      <w:pPr>
-        <w:pStyle w:val="CommentText"/>
-      </w:pPr>
-      <w:r>
-        <w:rPr>
-          <w:rStyle w:val="CommentReference"/>
-        </w:rPr>
-        <w:annotationRef/>
-      </w:r>
-      <w:r>
-        <w:t>8</w:t>
-      </w:r>
-    </w:p>
-  </w:comment>
-</w:comments>
-</file>
-
-<file path=word/commentsExtended.xml><?xml version="1.0" encoding="utf-8"?>
-<w15:commentsEx xmlns:wpc="http://schemas.microsoft.com/office/word/2010/wordprocessingCanvas" xmlns:cx="http://schemas.microsoft.com/office/drawing/2014/chartex" xmlns:cx1="http://schemas.microsoft.com/office/drawing/2015/9/8/chartex" xmlns:cx2="http://schemas.microsoft.com/office/drawing/2015/10/21/chartex" xmlns:cx3="http://schemas.microsoft.com/office/drawing/2016/5/9/chartex" xmlns:cx4="http://schemas.microsoft.com/office/drawing/2016/5/10/chartex" xmlns:cx5="http://schemas.microsoft.com/office/drawing/2016/5/11/chartex" xmlns:cx6="http://schemas.microsoft.com/office/drawing/2016/5/12/chartex" xmlns:cx7="http://schemas.microsoft.com/office/drawing/2016/5/13/chartex" xmlns:cx8="http://schemas.microsoft.com/office/drawing/2016/5/14/chartex" xmlns:mc="http://schemas.openxmlformats.org/markup-compatibility/2006" xmlns:aink="http://schemas.microsoft.com/office/drawing/2016/ink" xmlns:am3d="http://schemas.microsoft.com/office/drawing/2017/model3d" xmlns:o="urn:schemas-microsoft-com:office:office" xmlns:oel="http://schemas.microsoft.com/office/2019/extlst" xmlns:r="http://schemas.openxmlformats.org/officeDocument/2006/relationships" xmlns:m="http://schemas.openxmlformats.org/officeDocument/2006/math" xmlns:v="urn:schemas-microsoft-com:vml" xmlns:wp14="http://schemas.microsoft.com/office/word/2010/wordprocessingDrawing" xmlns:wp="http://schemas.openxmlformats.org/drawingml/2006/wordprocessingDrawing" xmlns:w10="urn:schemas-microsoft-com:office:word" xmlns:w="http://schemas.openxmlformats.org/wordprocessingml/2006/main" xmlns:w14="http://schemas.microsoft.com/office/word/2010/wordml" xmlns:w15="http://schemas.microsoft.com/office/word/2012/wordml" xmlns:w16cex="http://schemas.microsoft.com/office/word/2018/wordml/cex" xmlns:w16cid="http://schemas.microsoft.com/office/word/2016/wordml/cid" xmlns:w16="http://schemas.microsoft.com/office/word/2018/wordml" xmlns:w16sdtdh="http://schemas.microsoft.com/office/word/2020/wordml/sdtdatahash" xmlns:w16se="http://schemas.microsoft.com/office/word/2015/wordml/symex" xmlns:wpg="http://schemas.microsoft.com/office/word/2010/wordprocessingGroup" xmlns:wpi="http://schemas.microsoft.com/office/word/2010/wordprocessingInk" xmlns:wne="http://schemas.microsoft.com/office/word/2006/wordml" xmlns:wps="http://schemas.microsoft.com/office/word/2010/wordprocessingShape" mc:Ignorable="w14 w15 w16se w16cid w16 w16cex w16sdtdh wp14">
-  <w15:commentEx w15:paraId="28750D67" w15:done="0"/>
-  <w15:commentEx w15:paraId="340F4E3F" w15:done="0"/>
-  <w15:commentEx w15:paraId="00818A62" w15:done="0"/>
-  <w15:commentEx w15:paraId="636CF877" w15:done="0"/>
-  <w15:commentEx w15:paraId="3DA4B28D" w15:done="0"/>
-  <w15:commentEx w15:paraId="584E546D" w15:done="0"/>
-  <w15:commentEx w15:paraId="4814F5EF" w15:done="0"/>
-  <w15:commentEx w15:paraId="25DEB0EF" w15:done="0"/>
-</w15:commentsEx>
-</file>
-
-<file path=word/commentsExtensible.xml><?xml version="1.0" encoding="utf-8"?>
-<w16cex:commentsExtensible xmlns:wpc="http://schemas.microsoft.com/office/word/2010/wordprocessingCanvas" xmlns:cx="http://schemas.microsoft.com/office/drawing/2014/chartex" xmlns:cx1="http://schemas.microsoft.com/office/drawing/2015/9/8/chartex" xmlns:cx2="http://schemas.microsoft.com/office/drawing/2015/10/21/chartex" xmlns:cx3="http://schemas.microsoft.com/office/drawing/2016/5/9/chartex" xmlns:cx4="http://schemas.microsoft.com/office/drawing/2016/5/10/chartex" xmlns:cx5="http://schemas.microsoft.com/office/drawing/2016/5/11/chartex" xmlns:cx6="http://schemas.microsoft.com/office/drawing/2016/5/12/chartex" xmlns:cx7="http://schemas.microsoft.com/office/drawing/2016/5/13/chartex" xmlns:cx8="http://schemas.microsoft.com/office/drawing/2016/5/14/chartex" xmlns:cr="http://schemas.microsoft.com/office/comments/2020/reactions" xmlns:mc="http://schemas.openxmlformats.org/markup-compatibility/2006" xmlns:aink="http://schemas.microsoft.com/office/drawing/2016/ink" xmlns:am3d="http://schemas.microsoft.com/office/drawing/2017/model3d" xmlns:o="urn:schemas-microsoft-com:office:office" xmlns:oel="http://schemas.microsoft.com/office/2019/extlst" xmlns:r="http://schemas.openxmlformats.org/officeDocument/2006/relationships" xmlns:m="http://schemas.openxmlformats.org/officeDocument/2006/math" xmlns:v="urn:schemas-microsoft-com:vml" xmlns:wp14="http://schemas.microsoft.com/office/word/2010/wordprocessingDrawing" xmlns:wp="http://schemas.openxmlformats.org/drawingml/2006/wordprocessingDrawing" xmlns:w10="urn:schemas-microsoft-com:office:word" xmlns:w="http://schemas.openxmlformats.org/wordprocessingml/2006/main" xmlns:w14="http://schemas.microsoft.com/office/word/2010/wordml" xmlns:w15="http://schemas.microsoft.com/office/word/2012/wordml" xmlns:w16cex="http://schemas.microsoft.com/office/word/2018/wordml/cex" xmlns:w16cid="http://schemas.microsoft.com/office/word/2016/wordml/cid" xmlns:w16="http://schemas.microsoft.com/office/word/2018/wordml" xmlns:w16sdtdh="http://schemas.microsoft.com/office/word/2020/wordml/sdtdatahash" xmlns:w16se="http://schemas.microsoft.com/office/word/2015/wordml/symex" xmlns:wpg="http://schemas.microsoft.com/office/word/2010/wordprocessingGroup" xmlns:wpi="http://schemas.microsoft.com/office/word/2010/wordprocessingInk" xmlns:wne="http://schemas.microsoft.com/office/word/2006/wordml" xmlns:wps="http://schemas.microsoft.com/office/word/2010/wordprocessingShape" mc:Ignorable="w14 w15 w16se w16cid w16 w16cex w16sdtdh cr wp14">
-  <w16cex:commentExtensible w16cex:durableId="671940C6" w16cex:dateUtc="2026-05-07T08:57:00Z"/>
-  <w16cex:commentExtensible w16cex:durableId="2FA4AE9D" w16cex:dateUtc="2026-05-07T09:40:00Z"/>
-  <w16cex:commentExtensible w16cex:durableId="7002807E" w16cex:dateUtc="2026-05-07T08:57:00Z"/>
-  <w16cex:commentExtensible w16cex:durableId="3EBAB7CD" w16cex:dateUtc="2026-05-07T08:57:00Z"/>
-  <w16cex:commentExtensible w16cex:durableId="6095D8C7" w16cex:dateUtc="2026-05-07T08:57:00Z"/>
-  <w16cex:commentExtensible w16cex:durableId="71769F48" w16cex:dateUtc="2026-05-07T08:58:00Z"/>
-  <w16cex:commentExtensible w16cex:durableId="6646F60B" w16cex:dateUtc="2026-05-07T08:58:00Z"/>
-  <w16cex:commentExtensible w16cex:durableId="421FDE00" w16cex:dateUtc="2026-05-07T08:58:00Z"/>
-</w16cex:commentsExtensible>
-</file>
-
-<file path=word/commentsIds.xml><?xml version="1.0" encoding="utf-8"?>
-<w16cid:commentsIds xmlns:wpc="http://schemas.microsoft.com/office/word/2010/wordprocessingCanvas" xmlns:cx="http://schemas.microsoft.com/office/drawing/2014/chartex" xmlns:cx1="http://schemas.microsoft.com/office/drawing/2015/9/8/chartex" xmlns:cx2="http://schemas.microsoft.com/office/drawing/2015/10/21/chartex" xmlns:cx3="http://schemas.microsoft.com/office/drawing/2016/5/9/chartex" xmlns:cx4="http://schemas.microsoft.com/office/drawing/2016/5/10/chartex" xmlns:cx5="http://schemas.microsoft.com/office/drawing/2016/5/11/chartex" xmlns:cx6="http://schemas.microsoft.com/office/drawing/2016/5/12/chartex" xmlns:cx7="http://schemas.microsoft.com/office/drawing/2016/5/13/chartex" xmlns:cx8="http://schemas.microsoft.com/office/drawing/2016/5/14/chartex" xmlns:mc="http://schemas.openxmlformats.org/markup-compatibility/2006" xmlns:aink="http://schemas.microsoft.com/office/drawing/2016/ink" xmlns:am3d="http://schemas.microsoft.com/office/drawing/2017/model3d" xmlns:o="urn:schemas-microsoft-com:office:office" xmlns:oel="http://schemas.microsoft.com/office/2019/extlst" xmlns:r="http://schemas.openxmlformats.org/officeDocument/2006/relationships" xmlns:m="http://schemas.openxmlformats.org/officeDocument/2006/math" xmlns:v="urn:schemas-microsoft-com:vml" xmlns:wp14="http://schemas.microsoft.com/office/word/2010/wordprocessingDrawing" xmlns:wp="http://schemas.openxmlformats.org/drawingml/2006/wordprocessingDrawing" xmlns:w10="urn:schemas-microsoft-com:office:word" xmlns:w="http://schemas.openxmlformats.org/wordprocessingml/2006/main" xmlns:w14="http://schemas.microsoft.com/office/word/2010/wordml" xmlns:w15="http://schemas.microsoft.com/office/word/2012/wordml" xmlns:w16cex="http://schemas.microsoft.com/office/word/2018/wordml/cex" xmlns:w16cid="http://schemas.microsoft.com/office/word/2016/wordml/cid" xmlns:w16="http://schemas.microsoft.com/office/word/2018/wordml" xmlns:w16sdtdh="http://schemas.microsoft.com/office/word/2020/wordml/sdtdatahash" xmlns:w16se="http://schemas.microsoft.com/office/word/2015/wordml/symex" xmlns:wpg="http://schemas.microsoft.com/office/word/2010/wordprocessingGroup" xmlns:wpi="http://schemas.microsoft.com/office/word/2010/wordprocessingInk" xmlns:wne="http://schemas.microsoft.com/office/word/2006/wordml" xmlns:wps="http://schemas.microsoft.com/office/word/2010/wordprocessingShape" mc:Ignorable="w14 w15 w16se w16cid w16 w16cex w16sdtdh wp14">
-  <w16cid:commentId w16cid:paraId="28750D67" w16cid:durableId="671940C6"/>
-  <w16cid:commentId w16cid:paraId="340F4E3F" w16cid:durableId="2FA4AE9D"/>
-  <w16cid:commentId w16cid:paraId="00818A62" w16cid:durableId="7002807E"/>
-  <w16cid:commentId w16cid:paraId="636CF877" w16cid:durableId="3EBAB7CD"/>
-  <w16cid:commentId w16cid:paraId="3DA4B28D" w16cid:durableId="6095D8C7"/>
-  <w16cid:commentId w16cid:paraId="584E546D" w16cid:durableId="71769F48"/>
-  <w16cid:commentId w16cid:paraId="4814F5EF" w16cid:durableId="6646F60B"/>
-  <w16cid:commentId w16cid:paraId="25DEB0EF" w16cid:durableId="421FDE00"/>
-</w16cid:commentsIds>
 </file>
 
 <file path=word/endnotes.xml><?xml version="1.0" encoding="utf-8"?>
@@ -23678,14 +23730,6 @@
     <w:abstractNumId w:val="1"/>
   </w:num>
 </w:numbering>
-</file>
-
-<file path=word/people.xml><?xml version="1.0" encoding="utf-8"?>
-<w15:people xmlns:wpc="http://schemas.microsoft.com/office/word/2010/wordprocessingCanvas" xmlns:cx="http://schemas.microsoft.com/office/drawing/2014/chartex" xmlns:cx1="http://schemas.microsoft.com/office/drawing/2015/9/8/chartex" xmlns:cx2="http://schemas.microsoft.com/office/drawing/2015/10/21/chartex" xmlns:cx3="http://schemas.microsoft.com/office/drawing/2016/5/9/chartex" xmlns:cx4="http://schemas.microsoft.com/office/drawing/2016/5/10/chartex" xmlns:cx5="http://schemas.microsoft.com/office/drawing/2016/5/11/chartex" xmlns:cx6="http://schemas.microsoft.com/office/drawing/2016/5/12/chartex" xmlns:cx7="http://schemas.microsoft.com/office/drawing/2016/5/13/chartex" xmlns:cx8="http://schemas.microsoft.com/office/drawing/2016/5/14/chartex" xmlns:mc="http://schemas.openxmlformats.org/markup-compatibility/2006" xmlns:aink="http://schemas.microsoft.com/office/drawing/2016/ink" xmlns:am3d="http://schemas.microsoft.com/office/drawing/2017/model3d" xmlns:o="urn:schemas-microsoft-com:office:office" xmlns:oel="http://schemas.microsoft.com/office/2019/extlst" xmlns:r="http://schemas.openxmlformats.org/officeDocument/2006/relationships" xmlns:m="http://schemas.openxmlformats.org/officeDocument/2006/math" xmlns:v="urn:schemas-microsoft-com:vml" xmlns:wp14="http://schemas.microsoft.com/office/word/2010/wordprocessingDrawing" xmlns:wp="http://schemas.openxmlformats.org/drawingml/2006/wordprocessingDrawing" xmlns:w10="urn:schemas-microsoft-com:office:word" xmlns:w="http://schemas.openxmlformats.org/wordprocessingml/2006/main" xmlns:w14="http://schemas.microsoft.com/office/word/2010/wordml" xmlns:w15="http://schemas.microsoft.com/office/word/2012/wordml" xmlns:w16cex="http://schemas.microsoft.com/office/word/2018/wordml/cex" xmlns:w16cid="http://schemas.microsoft.com/office/word/2016/wordml/cid" xmlns:w16="http://schemas.microsoft.com/office/word/2018/wordml" xmlns:w16sdtdh="http://schemas.microsoft.com/office/word/2020/wordml/sdtdatahash" xmlns:w16se="http://schemas.microsoft.com/office/word/2015/wordml/symex" xmlns:wpg="http://schemas.microsoft.com/office/word/2010/wordprocessingGroup" xmlns:wpi="http://schemas.microsoft.com/office/word/2010/wordprocessingInk" xmlns:wne="http://schemas.microsoft.com/office/word/2006/wordml" xmlns:wps="http://schemas.microsoft.com/office/word/2010/wordprocessingShape" mc:Ignorable="w14 w15 w16se w16cid w16 w16cex w16sdtdh wp14">
-  <w15:person w15:author="Mikkel Helding Vembye">
-    <w15:presenceInfo w15:providerId="AD" w15:userId="S-1-5-21-2100284113-1573851820-878952375-413702"/>
-  </w15:person>
-</w15:people>
 </file>
 
 <file path=word/styles.xml><?xml version="1.0" encoding="utf-8"?>
@@ -24296,6 +24340,7 @@
   <w:style w:type="character" w:default="1" w:styleId="DefaultParagraphFont">
     <w:name w:val="Default Paragraph Font"/>
     <w:uiPriority w:val="1"/>
+    <w:semiHidden/>
     <w:unhideWhenUsed/>
   </w:style>
   <w:style w:type="table" w:default="1" w:styleId="TableNormal">

</xml_diff>

<commit_message>
Update manuscript figures, data, and supplementary materials for NHB submission
</commit_message>
<xml_diff>
--- a/NHB-draft.docx
+++ b/NHB-draft.docx
@@ -205,7 +205,6 @@
         </w:rPr>
         <w:t xml:space="preserve"> = 0.195, 95% </w:t>
       </w:r>
-      <w:proofErr w:type="gramStart"/>
       <w:r>
         <w:rPr>
           <w:rFonts w:cs="Times New Roman"/>
@@ -220,7 +219,6 @@
         </w:rPr>
         <w:t>[</w:t>
       </w:r>
-      <w:proofErr w:type="gramEnd"/>
       <w:r>
         <w:rPr>
           <w:rFonts w:cs="Times New Roman"/>
@@ -493,21 +491,7 @@
         <w:rPr>
           <w:rFonts w:cs="Times New Roman"/>
         </w:rPr>
-        <w:t xml:space="preserve">, Jakob </w:t>
-      </w:r>
-      <w:proofErr w:type="spellStart"/>
-      <w:r>
-        <w:rPr>
-          <w:rFonts w:cs="Times New Roman"/>
-        </w:rPr>
-        <w:t>Kaarup</w:t>
-      </w:r>
-      <w:proofErr w:type="spellEnd"/>
-      <w:r>
-        <w:rPr>
-          <w:rFonts w:cs="Times New Roman"/>
-        </w:rPr>
-        <w:t xml:space="preserve"> Jensen</w:t>
+        <w:t>, Jakob Kaarup Jensen</w:t>
       </w:r>
       <w:r>
         <w:rPr>
@@ -13801,21 +13785,12 @@
                 <w:szCs w:val="18"/>
               </w:rPr>
             </w:pPr>
-            <w:proofErr w:type="spellStart"/>
-            <w:r>
-              <w:rPr>
-                <w:sz w:val="18"/>
-                <w:szCs w:val="18"/>
-              </w:rPr>
-              <w:t>Posttest</w:t>
-            </w:r>
-            <w:proofErr w:type="spellEnd"/>
-            <w:r>
-              <w:rPr>
-                <w:sz w:val="18"/>
-                <w:szCs w:val="18"/>
-              </w:rPr>
-              <w:t xml:space="preserve"> only ES</w:t>
+            <w:r>
+              <w:rPr>
+                <w:sz w:val="18"/>
+                <w:szCs w:val="18"/>
+              </w:rPr>
+              <w:t>Posttest only ES</w:t>
             </w:r>
           </w:p>
         </w:tc>
@@ -13985,23 +13960,7 @@
                 <w:sz w:val="18"/>
                 <w:szCs w:val="18"/>
               </w:rPr>
-              <w:t>Pre-</w:t>
-            </w:r>
-            <w:proofErr w:type="spellStart"/>
-            <w:r>
-              <w:rPr>
-                <w:sz w:val="18"/>
-                <w:szCs w:val="18"/>
-              </w:rPr>
-              <w:t>posttest</w:t>
-            </w:r>
-            <w:proofErr w:type="spellEnd"/>
-            <w:r>
-              <w:rPr>
-                <w:sz w:val="18"/>
-                <w:szCs w:val="18"/>
-              </w:rPr>
-              <w:t>/covariate adj. ES</w:t>
+              <w:t>Pre-posttest/covariate adj. ES</w:t>
             </w:r>
           </w:p>
         </w:tc>
@@ -14755,11 +14714,9 @@
       <w:r>
         <w:t xml:space="preserve">Cochrane’s </w:t>
       </w:r>
-      <w:proofErr w:type="spellStart"/>
       <w:r>
         <w:t>RoB</w:t>
       </w:r>
-      <w:proofErr w:type="spellEnd"/>
       <w:r>
         <w:t xml:space="preserve"> </w:t>
       </w:r>
@@ -14802,6 +14759,9 @@
         <w:t>3</w:t>
       </w:r>
       <w:r>
+        <w:t xml:space="preserve"> Panel (A)</w:t>
+      </w:r>
+      <w:r>
         <w:t xml:space="preserve"> for </w:t>
       </w:r>
       <w:r>
@@ -14864,71 +14824,1316 @@
           <w:bCs/>
         </w:rPr>
       </w:pPr>
-      <w:r>
+    </w:p>
+    <w:p>
+      <w:pPr>
         <w:rPr>
           <w:rFonts w:cs="Times New Roman"/>
           <w:b/>
           <w:bCs/>
         </w:rPr>
-        <w:t xml:space="preserve">Fig. </w:t>
-      </w:r>
+      </w:pPr>
       <w:r>
         <w:rPr>
           <w:rFonts w:cs="Times New Roman"/>
           <w:b/>
           <w:bCs/>
         </w:rPr>
-        <w:t>3</w:t>
-      </w:r>
-      <w:r>
+        <w:br w:type="page"/>
+      </w:r>
+    </w:p>
+    <w:p>
+      <w:pPr>
+        <w:jc w:val="both"/>
         <w:rPr>
           <w:rFonts w:cs="Times New Roman"/>
           <w:b/>
           <w:bCs/>
         </w:rPr>
-        <w:t xml:space="preserve"> | R</w:t>
-      </w:r>
+      </w:pPr>
       <w:r>
         <w:rPr>
           <w:rFonts w:cs="Times New Roman"/>
           <w:b/>
           <w:bCs/>
-        </w:rPr>
-        <w:t>isk of bias assessment (</w:t>
-      </w:r>
-      <w:proofErr w:type="spellStart"/>
-      <w:r>
-        <w:rPr>
-          <w:rFonts w:cs="Times New Roman"/>
+          <w:noProof/>
+        </w:rPr>
+        <w:lastRenderedPageBreak/>
+        <mc:AlternateContent>
+          <mc:Choice Requires="wps">
+            <w:drawing>
+              <wp:anchor distT="45720" distB="45720" distL="114300" distR="114300" simplePos="0" relativeHeight="251659264" behindDoc="0" locked="0" layoutInCell="1" allowOverlap="1" wp14:anchorId="5B8E7656" wp14:editId="337888E9">
+                <wp:simplePos x="0" y="0"/>
+                <wp:positionH relativeFrom="margin">
+                  <wp:posOffset>-909320</wp:posOffset>
+                </wp:positionH>
+                <wp:positionV relativeFrom="paragraph">
+                  <wp:posOffset>1905000</wp:posOffset>
+                </wp:positionV>
+                <wp:extent cx="8141970" cy="4351020"/>
+                <wp:effectExtent l="0" t="9525" r="1905" b="1905"/>
+                <wp:wrapSquare wrapText="bothSides"/>
+                <wp:docPr id="217" name="Text Box 2"/>
+                <wp:cNvGraphicFramePr>
+                  <a:graphicFrameLocks xmlns:a="http://schemas.openxmlformats.org/drawingml/2006/main"/>
+                </wp:cNvGraphicFramePr>
+                <a:graphic xmlns:a="http://schemas.openxmlformats.org/drawingml/2006/main">
+                  <a:graphicData uri="http://schemas.microsoft.com/office/word/2010/wordprocessingShape">
+                    <wps:wsp>
+                      <wps:cNvSpPr txBox="1">
+                        <a:spLocks noChangeArrowheads="1"/>
+                      </wps:cNvSpPr>
+                      <wps:spPr bwMode="auto">
+                        <a:xfrm rot="16200000">
+                          <a:off x="0" y="0"/>
+                          <a:ext cx="8141970" cy="4351020"/>
+                        </a:xfrm>
+                        <a:prstGeom prst="rect">
+                          <a:avLst/>
+                        </a:prstGeom>
+                        <a:solidFill>
+                          <a:srgbClr val="FFFFFF"/>
+                        </a:solidFill>
+                        <a:ln w="9525">
+                          <a:noFill/>
+                          <a:miter lim="800000"/>
+                          <a:headEnd/>
+                          <a:tailEnd/>
+                        </a:ln>
+                      </wps:spPr>
+                      <wps:txbx>
+                        <w:txbxContent>
+                          <w:p>
+                            <w:pPr>
+                              <w:jc w:val="both"/>
+                            </w:pPr>
+                            <w:r>
+                              <w:rPr>
+                                <w:rFonts w:cs="Times New Roman"/>
+                                <w:b/>
+                                <w:bCs/>
+                              </w:rPr>
+                              <w:t xml:space="preserve">Fig. </w:t>
+                            </w:r>
+                            <w:r>
+                              <w:rPr>
+                                <w:rFonts w:cs="Times New Roman"/>
+                                <w:b/>
+                                <w:bCs/>
+                              </w:rPr>
+                              <w:t>3</w:t>
+                            </w:r>
+                            <w:r>
+                              <w:rPr>
+                                <w:rFonts w:cs="Times New Roman"/>
+                                <w:b/>
+                                <w:bCs/>
+                              </w:rPr>
+                              <w:t xml:space="preserve"> | R</w:t>
+                            </w:r>
+                            <w:r>
+                              <w:rPr>
+                                <w:rFonts w:cs="Times New Roman"/>
+                                <w:b/>
+                                <w:bCs/>
+                              </w:rPr>
+                              <w:t>isk of bias assessments of randomized controlled trials and non-randomized studies</w:t>
+                            </w:r>
+                          </w:p>
+                          <w:tbl>
+                            <w:tblPr>
+                              <w:tblStyle w:val="TableGrid"/>
+                              <w:tblW w:w="12211" w:type="dxa"/>
+                              <w:tblBorders>
+                                <w:top w:val="none" w:sz="0" w:space="0" w:color="auto"/>
+                                <w:left w:val="none" w:sz="0" w:space="0" w:color="auto"/>
+                                <w:bottom w:val="none" w:sz="0" w:space="0" w:color="auto"/>
+                                <w:right w:val="none" w:sz="0" w:space="0" w:color="auto"/>
+                                <w:insideH w:val="none" w:sz="0" w:space="0" w:color="auto"/>
+                                <w:insideV w:val="none" w:sz="0" w:space="0" w:color="auto"/>
+                              </w:tblBorders>
+                              <w:tblLook w:val="04A0" w:firstRow="1" w:lastRow="0" w:firstColumn="1" w:lastColumn="0" w:noHBand="0" w:noVBand="1"/>
+                            </w:tblPr>
+                            <w:tblGrid>
+                              <w:gridCol w:w="5710"/>
+                              <w:gridCol w:w="8715"/>
+                            </w:tblGrid>
+                            <w:tr>
+                              <w:trPr>
+                                <w:trHeight w:val="4568"/>
+                              </w:trPr>
+                              <w:tc>
+                                <w:tcPr>
+                                  <w:tcW w:w="4834" w:type="dxa"/>
+                                </w:tcPr>
+                                <w:p>
+                                  <w:pPr>
+                                    <w:rPr>
+                                      <w:b/>
+                                      <w:bCs/>
+                                      <w:noProof/>
+                                      <w:sz w:val="18"/>
+                                      <w:szCs w:val="18"/>
+                                    </w:rPr>
+                                  </w:pPr>
+                                  <w:r>
+                                    <w:rPr>
+                                      <w:b/>
+                                      <w:bCs/>
+                                      <w:noProof/>
+                                      <w:sz w:val="18"/>
+                                      <w:szCs w:val="18"/>
+                                    </w:rPr>
+                                    <w:t>(A)</w:t>
+                                  </w:r>
+                                </w:p>
+                                <w:p>
+                                  <w:pPr>
+                                    <w:rPr>
+                                      <w:b/>
+                                      <w:bCs/>
+                                      <w:sz w:val="18"/>
+                                      <w:szCs w:val="18"/>
+                                    </w:rPr>
+                                  </w:pPr>
+                                  <w:r>
+                                    <w:rPr>
+                                      <w:b/>
+                                      <w:bCs/>
+                                      <w:noProof/>
+                                      <w:sz w:val="18"/>
+                                      <w:szCs w:val="18"/>
+                                    </w:rPr>
+                                    <w:drawing>
+                                      <wp:inline distT="0" distB="0" distL="0" distR="0" wp14:anchorId="2FDD1868" wp14:editId="5DADCC78">
+                                        <wp:extent cx="3489144" cy="2326234"/>
+                                        <wp:effectExtent l="0" t="0" r="0" b="0"/>
+                                        <wp:docPr id="13" name="Picture 13"/>
+                                        <wp:cNvGraphicFramePr>
+                                          <a:graphicFrameLocks xmlns:a="http://schemas.openxmlformats.org/drawingml/2006/main" noChangeAspect="1"/>
+                                        </wp:cNvGraphicFramePr>
+                                        <a:graphic xmlns:a="http://schemas.openxmlformats.org/drawingml/2006/main">
+                                          <a:graphicData uri="http://schemas.openxmlformats.org/drawingml/2006/picture">
+                                            <pic:pic xmlns:pic="http://schemas.openxmlformats.org/drawingml/2006/picture">
+                                              <pic:nvPicPr>
+                                                <pic:cNvPr id="13" name="Picture 13"/>
+                                                <pic:cNvPicPr/>
+                                              </pic:nvPicPr>
+                                              <pic:blipFill>
+                                                <a:blip r:embed="rId10">
+                                                  <a:extLst>
+                                                    <a:ext uri="{28A0092B-C50C-407E-A947-70E740481C1C}">
+                                                      <a14:useLocalDpi xmlns:a14="http://schemas.microsoft.com/office/drawing/2010/main" val="0"/>
+                                                    </a:ext>
+                                                  </a:extLst>
+                                                </a:blip>
+                                                <a:stretch>
+                                                  <a:fillRect/>
+                                                </a:stretch>
+                                              </pic:blipFill>
+                                              <pic:spPr>
+                                                <a:xfrm>
+                                                  <a:off x="0" y="0"/>
+                                                  <a:ext cx="3501214" cy="2334281"/>
+                                                </a:xfrm>
+                                                <a:prstGeom prst="rect">
+                                                  <a:avLst/>
+                                                </a:prstGeom>
+                                              </pic:spPr>
+                                            </pic:pic>
+                                          </a:graphicData>
+                                        </a:graphic>
+                                      </wp:inline>
+                                    </w:drawing>
+                                  </w:r>
+                                </w:p>
+                                <w:p>
+                                  <w:pPr>
+                                    <w:ind w:right="-4778"/>
+                                  </w:pPr>
+                                </w:p>
+                              </w:tc>
+                              <w:tc>
+                                <w:tcPr>
+                                  <w:tcW w:w="7377" w:type="dxa"/>
+                                </w:tcPr>
+                                <w:p>
+                                  <w:pPr>
+                                    <w:ind w:right="2314"/>
+                                    <w:rPr>
+                                      <w:b/>
+                                      <w:bCs/>
+                                    </w:rPr>
+                                  </w:pPr>
+                                  <w:r>
+                                    <w:rPr>
+                                      <w:b/>
+                                      <w:bCs/>
+                                    </w:rPr>
+                                    <w:t>(B)</w:t>
+                                  </w:r>
+                                </w:p>
+                                <w:p>
+                                  <w:pPr>
+                                    <w:ind w:right="2314"/>
+                                    <w:rPr>
+                                      <w:b/>
+                                      <w:bCs/>
+                                    </w:rPr>
+                                  </w:pPr>
+                                </w:p>
+                                <w:p>
+                                  <w:pPr>
+                                    <w:ind w:right="2314"/>
+                                    <w:rPr>
+                                      <w:b/>
+                                      <w:bCs/>
+                                    </w:rPr>
+                                  </w:pPr>
+                                </w:p>
+                                <w:p>
+                                  <w:pPr>
+                                    <w:ind w:right="2314"/>
+                                    <w:rPr>
+                                      <w:b/>
+                                      <w:bCs/>
+                                    </w:rPr>
+                                  </w:pPr>
+                                </w:p>
+                                <w:p>
+                                  <w:pPr>
+                                    <w:ind w:right="2314"/>
+                                    <w:rPr>
+                                      <w:b/>
+                                      <w:bCs/>
+                                    </w:rPr>
+                                  </w:pPr>
+                                </w:p>
+                                <w:p>
+                                  <w:pPr>
+                                    <w:ind w:right="2314"/>
+                                    <w:rPr>
+                                      <w:b/>
+                                      <w:bCs/>
+                                    </w:rPr>
+                                  </w:pPr>
+                                  <w:r>
+                                    <w:rPr>
+                                      <w:b/>
+                                      <w:bCs/>
+                                      <w:noProof/>
+                                      <w14:ligatures w14:val="standardContextual"/>
+                                    </w:rPr>
+                                    <w:drawing>
+                                      <wp:inline distT="0" distB="0" distL="0" distR="0" wp14:anchorId="2E55F81B" wp14:editId="331BF149">
+                                        <wp:extent cx="3927958" cy="1309421"/>
+                                        <wp:effectExtent l="0" t="0" r="0" b="5080"/>
+                                        <wp:docPr id="18" name="Picture 18"/>
+                                        <wp:cNvGraphicFramePr>
+                                          <a:graphicFrameLocks xmlns:a="http://schemas.openxmlformats.org/drawingml/2006/main" noChangeAspect="1"/>
+                                        </wp:cNvGraphicFramePr>
+                                        <a:graphic xmlns:a="http://schemas.openxmlformats.org/drawingml/2006/main">
+                                          <a:graphicData uri="http://schemas.openxmlformats.org/drawingml/2006/picture">
+                                            <pic:pic xmlns:pic="http://schemas.openxmlformats.org/drawingml/2006/picture">
+                                              <pic:nvPicPr>
+                                                <pic:cNvPr id="18" name="Picture 18"/>
+                                                <pic:cNvPicPr/>
+                                              </pic:nvPicPr>
+                                              <pic:blipFill>
+                                                <a:blip r:embed="rId11">
+                                                  <a:extLst>
+                                                    <a:ext uri="{28A0092B-C50C-407E-A947-70E740481C1C}">
+                                                      <a14:useLocalDpi xmlns:a14="http://schemas.microsoft.com/office/drawing/2010/main" val="0"/>
+                                                    </a:ext>
+                                                  </a:extLst>
+                                                </a:blip>
+                                                <a:stretch>
+                                                  <a:fillRect/>
+                                                </a:stretch>
+                                              </pic:blipFill>
+                                              <pic:spPr>
+                                                <a:xfrm>
+                                                  <a:off x="0" y="0"/>
+                                                  <a:ext cx="3962428" cy="1320912"/>
+                                                </a:xfrm>
+                                                <a:prstGeom prst="rect">
+                                                  <a:avLst/>
+                                                </a:prstGeom>
+                                              </pic:spPr>
+                                            </pic:pic>
+                                          </a:graphicData>
+                                        </a:graphic>
+                                      </wp:inline>
+                                    </w:drawing>
+                                  </w:r>
+                                </w:p>
+                                <w:p>
+                                  <w:pPr>
+                                    <w:rPr>
+                                      <w:i/>
+                                      <w:iCs/>
+                                      <w:sz w:val="18"/>
+                                      <w:szCs w:val="18"/>
+                                    </w:rPr>
+                                  </w:pPr>
+                                </w:p>
+                                <w:p>
+                                  <w:pPr>
+                                    <w:rPr>
+                                      <w:i/>
+                                      <w:iCs/>
+                                      <w:sz w:val="18"/>
+                                      <w:szCs w:val="18"/>
+                                    </w:rPr>
+                                  </w:pPr>
+                                </w:p>
+                                <w:p>
+                                  <w:pPr>
+                                    <w:rPr>
+                                      <w:i/>
+                                      <w:iCs/>
+                                      <w:sz w:val="18"/>
+                                      <w:szCs w:val="18"/>
+                                    </w:rPr>
+                                  </w:pPr>
+                                </w:p>
+                                <w:p>
+                                  <w:pPr>
+                                    <w:rPr>
+                                      <w:i/>
+                                      <w:iCs/>
+                                      <w:sz w:val="18"/>
+                                      <w:szCs w:val="18"/>
+                                    </w:rPr>
+                                  </w:pPr>
+                                </w:p>
+                                <w:p>
+                                  <w:pPr>
+                                    <w:ind w:right="2314"/>
+                                  </w:pPr>
+                                </w:p>
+                              </w:tc>
+                            </w:tr>
+                          </w:tbl>
+                          <w:p>
+                            <w:pPr>
+                              <w:spacing w:line="240" w:lineRule="auto"/>
+                              <w:rPr>
+                                <w:sz w:val="18"/>
+                                <w:szCs w:val="18"/>
+                              </w:rPr>
+                            </w:pPr>
+                            <w:r>
+                              <w:rPr>
+                                <w:sz w:val="18"/>
+                                <w:szCs w:val="18"/>
+                              </w:rPr>
+                              <w:t xml:space="preserve">Note. </w:t>
+                            </w:r>
+                            <w:r>
+                              <w:rPr>
+                                <w:sz w:val="18"/>
+                                <w:szCs w:val="18"/>
+                              </w:rPr>
+                              <w:t>Panel (A)</w:t>
+                            </w:r>
+                            <w:r>
+                              <w:rPr>
+                                <w:rFonts w:eastAsia="Times New Roman"/>
+                                <w:sz w:val="18"/>
+                                <w:szCs w:val="18"/>
+                              </w:rPr>
+                              <w:t xml:space="preserve"> is based on 187 social reintegration effect sizes from 38 studies and 127 mental health effect sizes from 34</w:t>
+                            </w:r>
+                            <w:r>
+                              <w:rPr>
+                                <w:rFonts w:eastAsia="Times New Roman"/>
+                                <w:sz w:val="18"/>
+                                <w:szCs w:val="18"/>
+                              </w:rPr>
+                              <w:t xml:space="preserve"> studies. </w:t>
+                            </w:r>
+                            <w:r>
+                              <w:rPr>
+                                <w:sz w:val="18"/>
+                                <w:szCs w:val="18"/>
+                              </w:rPr>
+                              <w:t xml:space="preserve">Panel (B) </w:t>
+                            </w:r>
+                            <w:r>
+                              <w:rPr>
+                                <w:rFonts w:eastAsia="Times New Roman" w:cs="Times New Roman"/>
+                                <w:sz w:val="18"/>
+                                <w:szCs w:val="18"/>
+                              </w:rPr>
+                              <w:t>is based on 18 social reintegration effect sizes from 8 studies and 17 mental health effect sizes from 8 studies</w:t>
+                            </w:r>
+                            <w:r>
+                              <w:rPr>
+                                <w:rFonts w:eastAsia="Times New Roman" w:cs="Times New Roman"/>
+                                <w:sz w:val="18"/>
+                                <w:szCs w:val="18"/>
+                              </w:rPr>
+                              <w:t xml:space="preserve">. </w:t>
+                            </w:r>
+                            <w:r>
+                              <w:rPr>
+                                <w:rFonts w:eastAsia="Times New Roman"/>
+                                <w:sz w:val="18"/>
+                                <w:szCs w:val="18"/>
+                              </w:rPr>
+                              <w:t>studies.</w:t>
+                            </w:r>
+                          </w:p>
+                        </w:txbxContent>
+                      </wps:txbx>
+                      <wps:bodyPr rot="0" vert="horz" wrap="square" lIns="91440" tIns="45720" rIns="91440" bIns="45720" anchor="t" anchorCtr="0">
+                        <a:noAutofit/>
+                      </wps:bodyPr>
+                    </wps:wsp>
+                  </a:graphicData>
+                </a:graphic>
+                <wp14:sizeRelH relativeFrom="margin">
+                  <wp14:pctWidth>0</wp14:pctWidth>
+                </wp14:sizeRelH>
+                <wp14:sizeRelV relativeFrom="margin">
+                  <wp14:pctHeight>0</wp14:pctHeight>
+                </wp14:sizeRelV>
+              </wp:anchor>
+            </w:drawing>
+          </mc:Choice>
+          <mc:Fallback>
+            <w:pict>
+              <v:shapetype w14:anchorId="5B8E7656" id="_x0000_t202" coordsize="21600,21600" o:spt="202" path="m,l,21600r21600,l21600,xe">
+                <v:stroke joinstyle="miter"/>
+                <v:path gradientshapeok="t" o:connecttype="rect"/>
+              </v:shapetype>
+              <v:shape id="Text Box 2" o:spid="_x0000_s1026" type="#_x0000_t202" style="position:absolute;left:0;text-align:left;margin-left:-71.6pt;margin-top:150pt;width:641.1pt;height:342.6pt;rotation:-90;z-index:251659264;visibility:visible;mso-wrap-style:square;mso-width-percent:0;mso-height-percent:0;mso-wrap-distance-left:9pt;mso-wrap-distance-top:3.6pt;mso-wrap-distance-right:9pt;mso-wrap-distance-bottom:3.6pt;mso-position-horizontal:absolute;mso-position-horizontal-relative:margin;mso-position-vertical:absolute;mso-position-vertical-relative:text;mso-width-percent:0;mso-height-percent:0;mso-width-relative:margin;mso-height-relative:margin;v-text-anchor:top" o:gfxdata="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" stroked="f">
+                <v:textbox>
+                  <w:txbxContent>
+                    <w:p>
+                      <w:pPr>
+                        <w:jc w:val="both"/>
+                      </w:pPr>
+                      <w:r>
+                        <w:rPr>
+                          <w:rFonts w:cs="Times New Roman"/>
+                          <w:b/>
+                          <w:bCs/>
+                        </w:rPr>
+                        <w:t xml:space="preserve">Fig. </w:t>
+                      </w:r>
+                      <w:r>
+                        <w:rPr>
+                          <w:rFonts w:cs="Times New Roman"/>
+                          <w:b/>
+                          <w:bCs/>
+                        </w:rPr>
+                        <w:t>3</w:t>
+                      </w:r>
+                      <w:r>
+                        <w:rPr>
+                          <w:rFonts w:cs="Times New Roman"/>
+                          <w:b/>
+                          <w:bCs/>
+                        </w:rPr>
+                        <w:t xml:space="preserve"> | R</w:t>
+                      </w:r>
+                      <w:r>
+                        <w:rPr>
+                          <w:rFonts w:cs="Times New Roman"/>
+                          <w:b/>
+                          <w:bCs/>
+                        </w:rPr>
+                        <w:t>isk of bias assessments of randomized controlled trials and non-randomized studies</w:t>
+                      </w:r>
+                    </w:p>
+                    <w:tbl>
+                      <w:tblPr>
+                        <w:tblStyle w:val="TableGrid"/>
+                        <w:tblW w:w="12211" w:type="dxa"/>
+                        <w:tblBorders>
+                          <w:top w:val="none" w:sz="0" w:space="0" w:color="auto"/>
+                          <w:left w:val="none" w:sz="0" w:space="0" w:color="auto"/>
+                          <w:bottom w:val="none" w:sz="0" w:space="0" w:color="auto"/>
+                          <w:right w:val="none" w:sz="0" w:space="0" w:color="auto"/>
+                          <w:insideH w:val="none" w:sz="0" w:space="0" w:color="auto"/>
+                          <w:insideV w:val="none" w:sz="0" w:space="0" w:color="auto"/>
+                        </w:tblBorders>
+                        <w:tblLook w:val="04A0" w:firstRow="1" w:lastRow="0" w:firstColumn="1" w:lastColumn="0" w:noHBand="0" w:noVBand="1"/>
+                      </w:tblPr>
+                      <w:tblGrid>
+                        <w:gridCol w:w="5710"/>
+                        <w:gridCol w:w="8715"/>
+                      </w:tblGrid>
+                      <w:tr>
+                        <w:trPr>
+                          <w:trHeight w:val="4568"/>
+                        </w:trPr>
+                        <w:tc>
+                          <w:tcPr>
+                            <w:tcW w:w="4834" w:type="dxa"/>
+                          </w:tcPr>
+                          <w:p>
+                            <w:pPr>
+                              <w:rPr>
+                                <w:b/>
+                                <w:bCs/>
+                                <w:noProof/>
+                                <w:sz w:val="18"/>
+                                <w:szCs w:val="18"/>
+                              </w:rPr>
+                            </w:pPr>
+                            <w:r>
+                              <w:rPr>
+                                <w:b/>
+                                <w:bCs/>
+                                <w:noProof/>
+                                <w:sz w:val="18"/>
+                                <w:szCs w:val="18"/>
+                              </w:rPr>
+                              <w:t>(A)</w:t>
+                            </w:r>
+                          </w:p>
+                          <w:p>
+                            <w:pPr>
+                              <w:rPr>
+                                <w:b/>
+                                <w:bCs/>
+                                <w:sz w:val="18"/>
+                                <w:szCs w:val="18"/>
+                              </w:rPr>
+                            </w:pPr>
+                            <w:r>
+                              <w:rPr>
+                                <w:b/>
+                                <w:bCs/>
+                                <w:noProof/>
+                                <w:sz w:val="18"/>
+                                <w:szCs w:val="18"/>
+                              </w:rPr>
+                              <w:drawing>
+                                <wp:inline distT="0" distB="0" distL="0" distR="0" wp14:anchorId="2FDD1868" wp14:editId="5DADCC78">
+                                  <wp:extent cx="3489144" cy="2326234"/>
+                                  <wp:effectExtent l="0" t="0" r="0" b="0"/>
+                                  <wp:docPr id="13" name="Picture 13"/>
+                                  <wp:cNvGraphicFramePr>
+                                    <a:graphicFrameLocks xmlns:a="http://schemas.openxmlformats.org/drawingml/2006/main" noChangeAspect="1"/>
+                                  </wp:cNvGraphicFramePr>
+                                  <a:graphic xmlns:a="http://schemas.openxmlformats.org/drawingml/2006/main">
+                                    <a:graphicData uri="http://schemas.openxmlformats.org/drawingml/2006/picture">
+                                      <pic:pic xmlns:pic="http://schemas.openxmlformats.org/drawingml/2006/picture">
+                                        <pic:nvPicPr>
+                                          <pic:cNvPr id="13" name="Picture 13"/>
+                                          <pic:cNvPicPr/>
+                                        </pic:nvPicPr>
+                                        <pic:blipFill>
+                                          <a:blip r:embed="rId10">
+                                            <a:extLst>
+                                              <a:ext uri="{28A0092B-C50C-407E-A947-70E740481C1C}">
+                                                <a14:useLocalDpi xmlns:a14="http://schemas.microsoft.com/office/drawing/2010/main" val="0"/>
+                                              </a:ext>
+                                            </a:extLst>
+                                          </a:blip>
+                                          <a:stretch>
+                                            <a:fillRect/>
+                                          </a:stretch>
+                                        </pic:blipFill>
+                                        <pic:spPr>
+                                          <a:xfrm>
+                                            <a:off x="0" y="0"/>
+                                            <a:ext cx="3501214" cy="2334281"/>
+                                          </a:xfrm>
+                                          <a:prstGeom prst="rect">
+                                            <a:avLst/>
+                                          </a:prstGeom>
+                                        </pic:spPr>
+                                      </pic:pic>
+                                    </a:graphicData>
+                                  </a:graphic>
+                                </wp:inline>
+                              </w:drawing>
+                            </w:r>
+                          </w:p>
+                          <w:p>
+                            <w:pPr>
+                              <w:ind w:right="-4778"/>
+                            </w:pPr>
+                          </w:p>
+                        </w:tc>
+                        <w:tc>
+                          <w:tcPr>
+                            <w:tcW w:w="7377" w:type="dxa"/>
+                          </w:tcPr>
+                          <w:p>
+                            <w:pPr>
+                              <w:ind w:right="2314"/>
+                              <w:rPr>
+                                <w:b/>
+                                <w:bCs/>
+                              </w:rPr>
+                            </w:pPr>
+                            <w:r>
+                              <w:rPr>
+                                <w:b/>
+                                <w:bCs/>
+                              </w:rPr>
+                              <w:t>(B)</w:t>
+                            </w:r>
+                          </w:p>
+                          <w:p>
+                            <w:pPr>
+                              <w:ind w:right="2314"/>
+                              <w:rPr>
+                                <w:b/>
+                                <w:bCs/>
+                              </w:rPr>
+                            </w:pPr>
+                          </w:p>
+                          <w:p>
+                            <w:pPr>
+                              <w:ind w:right="2314"/>
+                              <w:rPr>
+                                <w:b/>
+                                <w:bCs/>
+                              </w:rPr>
+                            </w:pPr>
+                          </w:p>
+                          <w:p>
+                            <w:pPr>
+                              <w:ind w:right="2314"/>
+                              <w:rPr>
+                                <w:b/>
+                                <w:bCs/>
+                              </w:rPr>
+                            </w:pPr>
+                          </w:p>
+                          <w:p>
+                            <w:pPr>
+                              <w:ind w:right="2314"/>
+                              <w:rPr>
+                                <w:b/>
+                                <w:bCs/>
+                              </w:rPr>
+                            </w:pPr>
+                          </w:p>
+                          <w:p>
+                            <w:pPr>
+                              <w:ind w:right="2314"/>
+                              <w:rPr>
+                                <w:b/>
+                                <w:bCs/>
+                              </w:rPr>
+                            </w:pPr>
+                            <w:r>
+                              <w:rPr>
+                                <w:b/>
+                                <w:bCs/>
+                                <w:noProof/>
+                                <w14:ligatures w14:val="standardContextual"/>
+                              </w:rPr>
+                              <w:drawing>
+                                <wp:inline distT="0" distB="0" distL="0" distR="0" wp14:anchorId="2E55F81B" wp14:editId="331BF149">
+                                  <wp:extent cx="3927958" cy="1309421"/>
+                                  <wp:effectExtent l="0" t="0" r="0" b="5080"/>
+                                  <wp:docPr id="18" name="Picture 18"/>
+                                  <wp:cNvGraphicFramePr>
+                                    <a:graphicFrameLocks xmlns:a="http://schemas.openxmlformats.org/drawingml/2006/main" noChangeAspect="1"/>
+                                  </wp:cNvGraphicFramePr>
+                                  <a:graphic xmlns:a="http://schemas.openxmlformats.org/drawingml/2006/main">
+                                    <a:graphicData uri="http://schemas.openxmlformats.org/drawingml/2006/picture">
+                                      <pic:pic xmlns:pic="http://schemas.openxmlformats.org/drawingml/2006/picture">
+                                        <pic:nvPicPr>
+                                          <pic:cNvPr id="18" name="Picture 18"/>
+                                          <pic:cNvPicPr/>
+                                        </pic:nvPicPr>
+                                        <pic:blipFill>
+                                          <a:blip r:embed="rId11">
+                                            <a:extLst>
+                                              <a:ext uri="{28A0092B-C50C-407E-A947-70E740481C1C}">
+                                                <a14:useLocalDpi xmlns:a14="http://schemas.microsoft.com/office/drawing/2010/main" val="0"/>
+                                              </a:ext>
+                                            </a:extLst>
+                                          </a:blip>
+                                          <a:stretch>
+                                            <a:fillRect/>
+                                          </a:stretch>
+                                        </pic:blipFill>
+                                        <pic:spPr>
+                                          <a:xfrm>
+                                            <a:off x="0" y="0"/>
+                                            <a:ext cx="3962428" cy="1320912"/>
+                                          </a:xfrm>
+                                          <a:prstGeom prst="rect">
+                                            <a:avLst/>
+                                          </a:prstGeom>
+                                        </pic:spPr>
+                                      </pic:pic>
+                                    </a:graphicData>
+                                  </a:graphic>
+                                </wp:inline>
+                              </w:drawing>
+                            </w:r>
+                          </w:p>
+                          <w:p>
+                            <w:pPr>
+                              <w:rPr>
+                                <w:i/>
+                                <w:iCs/>
+                                <w:sz w:val="18"/>
+                                <w:szCs w:val="18"/>
+                              </w:rPr>
+                            </w:pPr>
+                          </w:p>
+                          <w:p>
+                            <w:pPr>
+                              <w:rPr>
+                                <w:i/>
+                                <w:iCs/>
+                                <w:sz w:val="18"/>
+                                <w:szCs w:val="18"/>
+                              </w:rPr>
+                            </w:pPr>
+                          </w:p>
+                          <w:p>
+                            <w:pPr>
+                              <w:rPr>
+                                <w:i/>
+                                <w:iCs/>
+                                <w:sz w:val="18"/>
+                                <w:szCs w:val="18"/>
+                              </w:rPr>
+                            </w:pPr>
+                          </w:p>
+                          <w:p>
+                            <w:pPr>
+                              <w:rPr>
+                                <w:i/>
+                                <w:iCs/>
+                                <w:sz w:val="18"/>
+                                <w:szCs w:val="18"/>
+                              </w:rPr>
+                            </w:pPr>
+                          </w:p>
+                          <w:p>
+                            <w:pPr>
+                              <w:ind w:right="2314"/>
+                            </w:pPr>
+                          </w:p>
+                        </w:tc>
+                      </w:tr>
+                    </w:tbl>
+                    <w:p>
+                      <w:pPr>
+                        <w:spacing w:line="240" w:lineRule="auto"/>
+                        <w:rPr>
+                          <w:sz w:val="18"/>
+                          <w:szCs w:val="18"/>
+                        </w:rPr>
+                      </w:pPr>
+                      <w:r>
+                        <w:rPr>
+                          <w:sz w:val="18"/>
+                          <w:szCs w:val="18"/>
+                        </w:rPr>
+                        <w:t xml:space="preserve">Note. </w:t>
+                      </w:r>
+                      <w:r>
+                        <w:rPr>
+                          <w:sz w:val="18"/>
+                          <w:szCs w:val="18"/>
+                        </w:rPr>
+                        <w:t>Panel (A)</w:t>
+                      </w:r>
+                      <w:r>
+                        <w:rPr>
+                          <w:rFonts w:eastAsia="Times New Roman"/>
+                          <w:sz w:val="18"/>
+                          <w:szCs w:val="18"/>
+                        </w:rPr>
+                        <w:t xml:space="preserve"> is based on 187 social reintegration effect sizes from 38 studies and 127 mental health effect sizes from 34</w:t>
+                      </w:r>
+                      <w:r>
+                        <w:rPr>
+                          <w:rFonts w:eastAsia="Times New Roman"/>
+                          <w:sz w:val="18"/>
+                          <w:szCs w:val="18"/>
+                        </w:rPr>
+                        <w:t xml:space="preserve"> studies. </w:t>
+                      </w:r>
+                      <w:r>
+                        <w:rPr>
+                          <w:sz w:val="18"/>
+                          <w:szCs w:val="18"/>
+                        </w:rPr>
+                        <w:t xml:space="preserve">Panel (B) </w:t>
+                      </w:r>
+                      <w:r>
+                        <w:rPr>
+                          <w:rFonts w:eastAsia="Times New Roman" w:cs="Times New Roman"/>
+                          <w:sz w:val="18"/>
+                          <w:szCs w:val="18"/>
+                        </w:rPr>
+                        <w:t>is based on 18 social reintegration effect sizes from 8 studies and 17 mental health effect sizes from 8 studies</w:t>
+                      </w:r>
+                      <w:r>
+                        <w:rPr>
+                          <w:rFonts w:eastAsia="Times New Roman" w:cs="Times New Roman"/>
+                          <w:sz w:val="18"/>
+                          <w:szCs w:val="18"/>
+                        </w:rPr>
+                        <w:t xml:space="preserve">. </w:t>
+                      </w:r>
+                      <w:r>
+                        <w:rPr>
+                          <w:rFonts w:eastAsia="Times New Roman"/>
+                          <w:sz w:val="18"/>
+                          <w:szCs w:val="18"/>
+                        </w:rPr>
+                        <w:t>studies.</w:t>
+                      </w:r>
+                    </w:p>
+                  </w:txbxContent>
+                </v:textbox>
+                <w10:wrap type="square" anchorx="margin"/>
+              </v:shape>
+            </w:pict>
+          </mc:Fallback>
+        </mc:AlternateContent>
+      </w:r>
+    </w:p>
+    <w:p>
+      <w:pPr>
+        <w:jc w:val="both"/>
+      </w:pPr>
+      <w:r>
+        <w:lastRenderedPageBreak/>
+        <w:t>As shown in Figure 3 Panel (B), the risk</w:t>
+      </w:r>
+      <w:r>
+        <w:t xml:space="preserve"> of bias was generally higher among non-randomized studies assessed with</w:t>
+      </w:r>
+      <w:r>
+        <w:t xml:space="preserve"> Cochrane’s</w:t>
+      </w:r>
+      <w:r>
+        <w:t xml:space="preserve"> ROBINS-I.</w:t>
+      </w:r>
+      <w:r>
+        <w:fldChar w:fldCharType="begin"/>
+      </w:r>
+      <w:r>
+        <w:instrText xml:space="preserve"> ADDIN ZOTERO_ITEM CSL_CITATION {"citationID":"rkCleVdD","properties":{"formattedCitation":"\\super 97\\nosupersub{}","plainCitation":"97","noteIndex":0},"citationItems":[{"id":819,"uris":["http://zotero.org/users/17688719/items/YR4TNR57"],"itemData":{"id":819,"type":"article-journal","abstract":"Non-randomised studies of the effects of interventions are critical to many areas of healthcare evaluation, but their results may be biased. It is therefore important to understand and appraise their strengths and weaknesses. We developed ROBINS-I (“Risk Of Bias In Non-randomised Studies - of Interventions”), a new tool for evaluating risk of bias in estimates of the comparative effectiveness (harm or benefit) of interventions from studies that did not use randomisation to allocate units (individuals or clusters of individuals) to comparison groups. The tool will be particularly useful to those undertaking systematic reviews that include non-randomised studies.Summary pointsNon-randomised studies of the effects of interventions are critical to many areas of healthcare evaluation but are subject to confounding and a range of other potential biasesWe developed, piloted, and refined a new tool, ROBINS-I, to assess “Risk Of Bias In Non-randomised Studies - of Interventions”The tool views each study as an attempt to emulate (mimic) a hypothetical pragmatic randomised trial, and covers seven distinct domains through which bias might be introducedWe use “signalling questions” to help users of ROBINS-I to judge risk of bias within each domainThe judgements within each domain carry forward to an overall risk of bias judgement across bias domains for the outcome being assessedNon-randomised studies of the effects of interventions (NRSI) are critical to many areas of healthcare evaluation. Designs of NRSI that can be used to evaluate the effects of interventions include observational studies such as cohort studies and case-control studies in which intervention groups are allocated during the course of usual treatment decisions, and quasi-randomised studies in which the method of allocation falls short of full randomisation. Non-randomised studies can provide evidence additional to that available from randomised trials about long term outcomes, rare events, adverse effects and populations that are …","container-title":"BMJ","DOI":"10.1136/bmj.i4919","note":"Citation Key: Sterne2016","page":"i4919","title":"ROBINS-I: A tool for assessing risk of bias in non-randomised studies of interventions","volume":"355","author":[{"family":"Sterne","given":"Jonathan A C."},{"family":"Hernán","given":"Miguel A"},{"family":"Reeves","given":"Barnaby C"},{"family":"Savović","given":"Jelena"},{"family":"Berkman","given":"Nancy D"},{"family":"Viswanathan","given":"Meera"},{"family":"Henry","given":"David"},{"family":"Altman","given":"Douglas G"},{"family":"Ansari","given":"Mohammed T"},{"family":"Boutron","given":"Isabelle"},{"family":"Carpenter","given":"James R"},{"family":"Chan","given":"An-Wen"},{"family":"Churchill","given":"Rachel"},{"family":"Deeks","given":"Jonathan J"},{"family":"Hróbjartsson","given":"Asbjørn"},{"family":"Kirkham","given":"Jamie"},{"family":"Jüni","given":"Peter"},{"family":"Loke","given":"Yoon K"},{"family":"Pigott","given":"Therese D."},{"family":"Ramsay","given":"Craig R"},{"family":"Regidor","given":"Deborah"},{"family":"Rothstein","given":"Hannah R."},{"family":"Sandhu","given":"Lakhbir"},{"family":"Santaguida","given":"Pasqualina L"},{"family":"Schünemann","given":"Holger J"},{"family":"Shea","given":"Beverly"},{"family":"Shrier","given":"Ian"},{"family":"Tugwell","given":"Peter"},{"family":"Turner","given":"Lucy"},{"family":"Valentine","given":"Jeffrey C"},{"family":"Waddington","given":"Hugh"},{"family":"Waters","given":"Elizabeth"},{"family":"Wells","given":"George A"},{"family":"Whiting","given":"Penny F"},{"family":"Higgins","given":"Julian P T"}],"issued":{"date-parts":[["2016",10,12]]}}}],"schema":"https://github.com/citation-style-language/schema/raw/master/csl-citation.json"} </w:instrText>
+      </w:r>
+      <w:r>
+        <w:fldChar w:fldCharType="separate"/>
+      </w:r>
+      <w:r>
+        <w:rPr>
+          <w:rFonts w:cs="Times New Roman"/>
+          <w:kern w:val="0"/>
+          <w:vertAlign w:val="superscript"/>
+        </w:rPr>
+        <w:t>97</w:t>
+      </w:r>
+      <w:r>
+        <w:fldChar w:fldCharType="end"/>
+      </w:r>
+      <w:r>
+        <w:t xml:space="preserve"> </w:t>
+      </w:r>
+      <w:r>
+        <w:t>M</w:t>
+      </w:r>
+      <w:r>
+        <w:t xml:space="preserve">ost effect </w:t>
+      </w:r>
+      <w:r>
+        <w:t>sizes</w:t>
+      </w:r>
+      <w:r>
+        <w:t xml:space="preserve"> were judged to be at serious risk of bias, primarily because of confounding</w:t>
+      </w:r>
+      <w:r>
+        <w:t xml:space="preserve"> and deviation from the intended intervention</w:t>
+      </w:r>
+      <w:r>
+        <w:t>. Other concerns included missing data. Because none of the non-randomized studies had a prespecified protocol, none could receive an overall low-risk judgment.</w:t>
+      </w:r>
+      <w:r>
+        <w:t xml:space="preserve"> </w:t>
+      </w:r>
+      <w:r>
+        <w:t xml:space="preserve">We excluded one </w:t>
+      </w:r>
+      <w:r>
+        <w:t xml:space="preserve">non-randomized </w:t>
+      </w:r>
+      <w:r>
+        <w:t>study</w:t>
+      </w:r>
+      <w:r>
+        <w:fldChar w:fldCharType="begin"/>
+      </w:r>
+      <w:r>
+        <w:instrText xml:space="preserve"> ADDIN ZOTERO_ITEM CSL_CITATION {"citationID":"dEub07EH","properties":{"formattedCitation":"\\super 74\\nosupersub{}","plainCitation":"74","noteIndex":0},"citationItems":[{"id":1294,"uris":["http://zotero.org/users/17688719/items/8QUHEST4"],"itemData":{"id":1294,"type":"article-journal","container-title":"Psychosocial Rehabilitation Journal","DOI":"10.1037/h0095785","ISSN":"0147-5622","issue":"2","note":"publisher: International Association of Psychosocial Rehabilitation Services and …\nCitation Key: Bond1991","page":"31","title":"Assertive community treatment and reference groups: An evaluation of their effectiveness for young adults with serious mental illness and substance abuse problems.","volume":"15","author":[{"family":"Bond","given":"Gary R"},{"family":"McDonel","given":"Elizabeth C"},{"family":"Miller","given":"Larry D"},{"family":"Pensec","given":"Michelle"}],"issued":{"date-parts":[["1991"]]}}}],"schema":"https://github.com/citation-style-language/schema/raw/master/csl-citation.json"} </w:instrText>
+      </w:r>
+      <w:r>
+        <w:fldChar w:fldCharType="separate"/>
+      </w:r>
+      <w:r>
+        <w:rPr>
+          <w:rFonts w:cs="Times New Roman"/>
+          <w:kern w:val="0"/>
+          <w:vertAlign w:val="superscript"/>
+        </w:rPr>
+        <w:t>74</w:t>
+      </w:r>
+      <w:r>
+        <w:fldChar w:fldCharType="end"/>
+      </w:r>
+      <w:r>
+        <w:t xml:space="preserve"> </w:t>
+      </w:r>
+      <w:r>
+        <w:t xml:space="preserve">from the meta-analysis because it was judged to be at critical risk of bias. </w:t>
+      </w:r>
+    </w:p>
+    <w:p>
+      <w:pPr>
+        <w:jc w:val="both"/>
+      </w:pPr>
+      <w:r>
+        <w:t>Given these concerns, risk of bias was included as a control variable in the covariate-adjusted moderator analyses. However, we found no systematic or substantial differences in effect sizes between studies judged to be at high or serious risk of bias and those judged to be at low or moderate</w:t>
+      </w:r>
+      <w:r>
+        <w:t>/some concern</w:t>
+      </w:r>
+      <w:r>
+        <w:t xml:space="preserve"> risk.</w:t>
+      </w:r>
+    </w:p>
+    <w:p>
+      <w:pPr>
+        <w:pStyle w:val="Heading3"/>
+      </w:pPr>
+      <w:r>
+        <w:t>Significant impact on both social integration and mental health</w:t>
+      </w:r>
+    </w:p>
+    <w:p>
+      <w:pPr>
+        <w:jc w:val="both"/>
+      </w:pPr>
+      <w:r>
+        <w:t xml:space="preserve">Figure </w:t>
+      </w:r>
+      <w:r>
+        <w:t>4</w:t>
+      </w:r>
+      <w:r>
+        <w:t xml:space="preserve"> depicts the distribution of all effect sizes across studies and the type of outcome. For more detailed forest plots, including study weights, see </w:t>
+      </w:r>
+      <w:r>
+        <w:t>S</w:t>
+      </w:r>
+      <w:r>
+        <w:t>upplementary</w:t>
+      </w:r>
+      <w:r>
+        <w:t xml:space="preserve"> Material</w:t>
+      </w:r>
+      <w:r>
+        <w:t xml:space="preserve"> Figures S</w:t>
+      </w:r>
+      <w:r>
+        <w:t>2</w:t>
+      </w:r>
+      <w:r>
+        <w:t>-S</w:t>
+      </w:r>
+      <w:r>
+        <w:t>3</w:t>
+      </w:r>
+      <w:r>
+        <w:t xml:space="preserve">. </w:t>
+      </w:r>
+    </w:p>
+    <w:p>
+      <w:pPr>
+        <w:jc w:val="both"/>
+        <w:rPr>
+          <w:lang w:val="en-CA"/>
+        </w:rPr>
+      </w:pPr>
+      <w:r>
+        <w:rPr>
+          <w:lang w:val="en-CA"/>
+        </w:rPr>
+        <w:t xml:space="preserve">Across the main analyses, group-based community interventions produced statistically significant benefits for both social reintegration and mental health. </w:t>
+      </w:r>
+      <w:r>
+        <w:rPr>
+          <w:lang w:val="en-CA"/>
+        </w:rPr>
+        <w:t xml:space="preserve">The meta-analysis of </w:t>
+      </w:r>
+      <w:r>
+        <w:rPr>
+          <w:lang w:val="en-CA"/>
+        </w:rPr>
+        <w:t>social reintegration</w:t>
+      </w:r>
+      <w:r>
+        <w:rPr>
+          <w:lang w:val="en-CA"/>
+        </w:rPr>
+        <w:t xml:space="preserve"> yielded a positive </w:t>
+      </w:r>
+      <w:r>
+        <w:rPr>
+          <w:lang w:val="en-CA"/>
+        </w:rPr>
+        <w:t xml:space="preserve">overall </w:t>
+      </w:r>
+      <w:r>
+        <w:rPr>
+          <w:lang w:val="en-CA"/>
+        </w:rPr>
+        <w:t xml:space="preserve">average </w:t>
+      </w:r>
+      <w:r>
+        <w:rPr>
+          <w:lang w:val="en-CA"/>
+        </w:rPr>
+        <w:t xml:space="preserve">effect </w:t>
+      </w:r>
+      <w:r>
+        <w:rPr>
+          <w:lang w:val="en-CA"/>
+        </w:rPr>
+        <w:t xml:space="preserve">of </w:t>
+      </w:r>
+      <w:r>
+        <w:rPr>
+          <w:lang w:val="en-CA"/>
+        </w:rPr>
+        <w:t>0.195 SD (95% CI [0.122, 0.268]</w:t>
+      </w:r>
+      <w:r>
+        <w:rPr>
+          <w:lang w:val="en-CA"/>
+        </w:rPr>
+        <w:t xml:space="preserve">, </w:t>
+      </w:r>
+      <w:r>
+        <w:rPr>
+          <w:i/>
+          <w:iCs/>
+        </w:rPr>
+        <w:t>t</w:t>
+      </w:r>
+      <w:r>
+        <w:t xml:space="preserve">(24.9) = 5.51, </w:t>
+      </w:r>
+      <w:r>
+        <w:rPr>
+          <w:i/>
+          <w:iCs/>
+        </w:rPr>
+        <w:t xml:space="preserve">p </w:t>
+      </w:r>
+      <w:r>
+        <w:t>&lt; 0.001</w:t>
+      </w:r>
+      <w:r>
+        <w:rPr>
+          <w:lang w:val="en-CA"/>
+        </w:rPr>
+        <w:t>). This indicates that participants receiving group-based interventions had better reintegration outcomes than those receiving individual treatment, treatment as usual</w:t>
+      </w:r>
+      <w:r>
+        <w:rPr>
+          <w:lang w:val="en-CA"/>
+        </w:rPr>
+        <w:t>,</w:t>
+      </w:r>
+      <w:r>
+        <w:rPr>
+          <w:lang w:val="en-CA"/>
+        </w:rPr>
+        <w:t xml:space="preserve"> or wait-list controls. The effect was approximately 2.3 times larger than the typical improvement observed under treatment as usual.</w:t>
+      </w:r>
+    </w:p>
+    <w:p>
+      <w:pPr>
+        <w:jc w:val="both"/>
+      </w:pPr>
+      <w:r>
+        <w:t xml:space="preserve">For mental health outcomes, the meta-analysis </w:t>
+      </w:r>
+      <w:r>
+        <w:t>yielded a</w:t>
+      </w:r>
+      <w:r>
+        <w:t xml:space="preserve"> positive</w:t>
+      </w:r>
+      <w:r>
+        <w:t xml:space="preserve"> overall average</w:t>
+      </w:r>
+      <w:r>
+        <w:t xml:space="preserve"> effect of 0.215 SD (95% CI [0.090, 0.340]</w:t>
+      </w:r>
+      <w:r>
+        <w:t xml:space="preserve">, </w:t>
+      </w:r>
+      <w:r>
+        <w:rPr>
+          <w:i/>
+          <w:iCs/>
+        </w:rPr>
+        <w:t>t</w:t>
+      </w:r>
+      <w:r>
+        <w:t xml:space="preserve">(37.5) = 3.48, </w:t>
+      </w:r>
+      <w:r>
+        <w:rPr>
+          <w:i/>
+          <w:iCs/>
+        </w:rPr>
+        <w:t>p</w:t>
+      </w:r>
+      <w:r>
+        <w:t xml:space="preserve"> = .001</w:t>
+      </w:r>
+      <w:r>
+        <w:t xml:space="preserve">). This effect was approximately 1.4 times larger than the typical improvement observed under treatment as usual. </w:t>
+      </w:r>
+    </w:p>
+    <w:p>
+      <w:pPr>
+        <w:rPr>
           <w:b/>
           <w:bCs/>
         </w:rPr>
-        <w:t>RoB</w:t>
-      </w:r>
-      <w:proofErr w:type="spellEnd"/>
-      <w:r>
-        <w:rPr>
-          <w:rFonts w:cs="Times New Roman"/>
+      </w:pPr>
+    </w:p>
+    <w:p>
+      <w:pPr>
+        <w:rPr>
           <w:b/>
           <w:bCs/>
         </w:rPr>
-        <w:t xml:space="preserve"> 2)</w:t>
-      </w:r>
-      <w:r>
-        <w:rPr>
-          <w:rFonts w:cs="Times New Roman"/>
+      </w:pPr>
+    </w:p>
+    <w:p>
+      <w:pPr>
+        <w:rPr>
           <w:b/>
           <w:bCs/>
         </w:rPr>
-        <w:t xml:space="preserve"> assessments</w:t>
-      </w:r>
-      <w:r>
-        <w:rPr>
-          <w:rFonts w:cs="Times New Roman"/>
+      </w:pPr>
+    </w:p>
+    <w:p>
+      <w:pPr>
+        <w:rPr>
           <w:b/>
           <w:bCs/>
         </w:rPr>
-        <w:t xml:space="preserve"> of randomized controlled trials. </w:t>
+      </w:pPr>
+    </w:p>
+    <w:p>
+      <w:pPr>
+        <w:rPr>
+          <w:b/>
+          <w:bCs/>
+        </w:rPr>
+      </w:pPr>
+    </w:p>
+    <w:p>
+      <w:pPr>
+        <w:rPr>
+          <w:b/>
+          <w:bCs/>
+        </w:rPr>
+      </w:pPr>
+    </w:p>
+    <w:p>
+      <w:pPr>
+        <w:rPr>
+          <w:b/>
+          <w:bCs/>
+        </w:rPr>
+      </w:pPr>
+    </w:p>
+    <w:p>
+      <w:pPr>
+        <w:rPr>
+          <w:b/>
+          <w:bCs/>
+        </w:rPr>
+      </w:pPr>
+    </w:p>
+    <w:p>
+      <w:pPr>
+        <w:rPr>
+          <w:b/>
+          <w:bCs/>
+        </w:rPr>
+      </w:pPr>
+    </w:p>
+    <w:p>
+      <w:pPr>
+        <w:rPr>
+          <w:b/>
+          <w:bCs/>
+        </w:rPr>
+      </w:pPr>
+    </w:p>
+    <w:p>
+      <w:pPr>
+        <w:rPr>
+          <w:b/>
+          <w:bCs/>
+        </w:rPr>
+      </w:pPr>
+      <w:r>
+        <w:rPr>
+          <w:b/>
+          <w:bCs/>
+        </w:rPr>
+        <w:lastRenderedPageBreak/>
+        <w:t>F</w:t>
+      </w:r>
+      <w:r>
+        <w:rPr>
+          <w:b/>
+          <w:bCs/>
+        </w:rPr>
+        <w:t xml:space="preserve">ig. </w:t>
+      </w:r>
+      <w:r>
+        <w:rPr>
+          <w:b/>
+          <w:bCs/>
+        </w:rPr>
+        <w:t>4</w:t>
+      </w:r>
+      <w:r>
+        <w:rPr>
+          <w:b/>
+          <w:bCs/>
+        </w:rPr>
+        <w:t xml:space="preserve"> | </w:t>
+      </w:r>
+      <w:r>
+        <w:rPr>
+          <w:rFonts w:eastAsia="Times New Roman"/>
+          <w:b/>
+          <w:bCs/>
+        </w:rPr>
+        <w:t>Effect size forest plot across dependent effect sizes by type of outcome</w:t>
       </w:r>
     </w:p>
     <w:p>
@@ -14937,10 +16142,10 @@
           <w:noProof/>
         </w:rPr>
         <w:drawing>
-          <wp:inline distT="0" distB="0" distL="0" distR="0" wp14:anchorId="7FEC1F08" wp14:editId="26B27832">
-            <wp:extent cx="5340096" cy="3066321"/>
-            <wp:effectExtent l="0" t="0" r="0" b="1270"/>
-            <wp:docPr id="4" name="Picture 4"/>
+          <wp:inline distT="0" distB="0" distL="0" distR="0" wp14:anchorId="4F375CE0" wp14:editId="1FE36B42">
+            <wp:extent cx="5479084" cy="6026883"/>
+            <wp:effectExtent l="0" t="0" r="7620" b="0"/>
+            <wp:docPr id="9" name="Picture 9" descr="A screen shot of a graph&#10;&#10;AI-generated content may be incorrect."/>
             <wp:cNvGraphicFramePr>
               <a:graphicFrameLocks xmlns:a="http://schemas.openxmlformats.org/drawingml/2006/main" noChangeAspect="1"/>
             </wp:cNvGraphicFramePr>
@@ -14948,11 +16153,11 @@
               <a:graphicData uri="http://schemas.openxmlformats.org/drawingml/2006/picture">
                 <pic:pic xmlns:pic="http://schemas.openxmlformats.org/drawingml/2006/picture">
                   <pic:nvPicPr>
-                    <pic:cNvPr id="4" name="Picture 4"/>
+                    <pic:cNvPr id="9" name="Picture 9" descr="A screen shot of a graph&#10;&#10;AI-generated content may be incorrect."/>
                     <pic:cNvPicPr/>
                   </pic:nvPicPr>
                   <pic:blipFill>
-                    <a:blip r:embed="rId10" cstate="print">
+                    <a:blip r:embed="rId12" cstate="print">
                       <a:extLst>
                         <a:ext uri="{28A0092B-C50C-407E-A947-70E740481C1C}">
                           <a14:useLocalDpi xmlns:a14="http://schemas.microsoft.com/office/drawing/2010/main" val="0"/>
@@ -14966,7 +16171,7 @@
                   <pic:spPr>
                     <a:xfrm>
                       <a:off x="0" y="0"/>
-                      <a:ext cx="5395323" cy="3098033"/>
+                      <a:ext cx="5493756" cy="6043022"/>
                     </a:xfrm>
                     <a:prstGeom prst="rect">
                       <a:avLst/>
@@ -14981,409 +16186,33 @@
     </w:p>
     <w:p>
       <w:pPr>
-        <w:rPr>
-          <w:sz w:val="18"/>
-          <w:szCs w:val="18"/>
-        </w:rPr>
-      </w:pPr>
-      <w:r>
-        <w:rPr>
-          <w:i/>
-          <w:iCs/>
-          <w:sz w:val="18"/>
-          <w:szCs w:val="18"/>
-        </w:rPr>
-        <w:t>Note</w:t>
-      </w:r>
-      <w:r>
-        <w:rPr>
-          <w:sz w:val="18"/>
-          <w:szCs w:val="18"/>
-        </w:rPr>
-        <w:t xml:space="preserve">. </w:t>
-      </w:r>
-      <w:r>
-        <w:rPr>
-          <w:rFonts w:eastAsia="Times New Roman"/>
-          <w:sz w:val="20"/>
-          <w:szCs w:val="20"/>
-        </w:rPr>
-        <w:t xml:space="preserve">The plot is based on 187 </w:t>
-      </w:r>
-      <w:r>
-        <w:rPr>
-          <w:rFonts w:eastAsia="Times New Roman"/>
-          <w:sz w:val="20"/>
-          <w:szCs w:val="20"/>
-        </w:rPr>
-        <w:t xml:space="preserve">social reintegration </w:t>
-      </w:r>
-      <w:r>
-        <w:rPr>
-          <w:rFonts w:eastAsia="Times New Roman"/>
-          <w:sz w:val="20"/>
-          <w:szCs w:val="20"/>
-        </w:rPr>
-        <w:t>effect sizes from 38 studies</w:t>
-      </w:r>
-      <w:r>
-        <w:rPr>
-          <w:rFonts w:eastAsia="Times New Roman"/>
-          <w:sz w:val="20"/>
-          <w:szCs w:val="20"/>
-        </w:rPr>
-        <w:t xml:space="preserve">, and </w:t>
-      </w:r>
-      <w:r>
-        <w:rPr>
-          <w:rFonts w:eastAsia="Times New Roman"/>
-          <w:sz w:val="20"/>
-          <w:szCs w:val="20"/>
-        </w:rPr>
-        <w:t>127</w:t>
-      </w:r>
-      <w:r>
-        <w:rPr>
-          <w:rFonts w:eastAsia="Times New Roman"/>
-          <w:sz w:val="20"/>
-          <w:szCs w:val="20"/>
-        </w:rPr>
-        <w:t xml:space="preserve"> mental health</w:t>
-      </w:r>
-      <w:r>
-        <w:rPr>
-          <w:rFonts w:eastAsia="Times New Roman"/>
-          <w:sz w:val="20"/>
-          <w:szCs w:val="20"/>
-        </w:rPr>
-        <w:t xml:space="preserve"> effect sizes from 34 studies</w:t>
-      </w:r>
-      <w:r>
-        <w:rPr>
-          <w:rFonts w:eastAsia="Times New Roman"/>
-          <w:sz w:val="20"/>
-          <w:szCs w:val="20"/>
-        </w:rPr>
+        <w:jc w:val="both"/>
+      </w:pPr>
+    </w:p>
+    <w:p>
+      <w:pPr>
+        <w:jc w:val="both"/>
+      </w:pPr>
+      <w:r>
+        <w:t xml:space="preserve">In addition, and as depicted in Figure </w:t>
+      </w:r>
+      <w:r>
+        <w:t>5</w:t>
+      </w:r>
+      <w:r>
+        <w:t>, we find that e</w:t>
+      </w:r>
+      <w:r>
+        <w:t xml:space="preserve">ffects on social reintegration and mental health also covaried: studies showing larger reintegration gains tended to show larger mental health gains. This suggests that group-based community interventions may support multidimensional recovery, improving both social participation and clinical </w:t>
+      </w:r>
+      <w:r>
+        <w:t>well-being</w:t>
+      </w:r>
+      <w:r>
         <w:t>.</w:t>
       </w:r>
-    </w:p>
-    <w:p>
-      <w:pPr>
-        <w:jc w:val="both"/>
-      </w:pPr>
-      <w:r>
-        <w:lastRenderedPageBreak/>
-        <w:t>Risk of bias was generally higher among non-randomized studies assessed with</w:t>
-      </w:r>
-      <w:r>
-        <w:t xml:space="preserve"> Cochrane’s</w:t>
-      </w:r>
-      <w:r>
-        <w:t xml:space="preserve"> ROBINS-I.</w:t>
-      </w:r>
-      <w:r>
-        <w:fldChar w:fldCharType="begin"/>
-      </w:r>
-      <w:r>
-        <w:instrText xml:space="preserve"> ADDIN ZOTERO_ITEM CSL_CITATION {"citationID":"rkCleVdD","properties":{"formattedCitation":"\\super 97\\nosupersub{}","plainCitation":"97","noteIndex":0},"citationItems":[{"id":819,"uris":["http://zotero.org/users/17688719/items/YR4TNR57"],"itemData":{"id":819,"type":"article-journal","abstract":"Non-randomised studies of the effects of interventions are critical to many areas of healthcare evaluation, but their results may be biased. It is therefore important to understand and appraise their strengths and weaknesses. We developed ROBINS-I (“Risk Of Bias In Non-randomised Studies - of Interventions”), a new tool for evaluating risk of bias in estimates of the comparative effectiveness (harm or benefit) of interventions from studies that did not use randomisation to allocate units (individuals or clusters of individuals) to comparison groups. The tool will be particularly useful to those undertaking systematic reviews that include non-randomised studies.Summary pointsNon-randomised studies of the effects of interventions are critical to many areas of healthcare evaluation but are subject to confounding and a range of other potential biasesWe developed, piloted, and refined a new tool, ROBINS-I, to assess “Risk Of Bias In Non-randomised Studies - of Interventions”The tool views each study as an attempt to emulate (mimic) a hypothetical pragmatic randomised trial, and covers seven distinct domains through which bias might be introducedWe use “signalling questions” to help users of ROBINS-I to judge risk of bias within each domainThe judgements within each domain carry forward to an overall risk of bias judgement across bias domains for the outcome being assessedNon-randomised studies of the effects of interventions (NRSI) are critical to many areas of healthcare evaluation. Designs of NRSI that can be used to evaluate the effects of interventions include observational studies such as cohort studies and case-control studies in which intervention groups are allocated during the course of usual treatment decisions, and quasi-randomised studies in which the method of allocation falls short of full randomisation. Non-randomised studies can provide evidence additional to that available from randomised trials about long term outcomes, rare events, adverse effects and populations that are …","container-title":"BMJ","DOI":"10.1136/bmj.i4919","note":"Citation Key: Sterne2016","page":"i4919","title":"ROBINS-I: A tool for assessing risk of bias in non-randomised studies of interventions","volume":"355","author":[{"family":"Sterne","given":"Jonathan A C."},{"family":"Hernán","given":"Miguel A"},{"family":"Reeves","given":"Barnaby C"},{"family":"Savović","given":"Jelena"},{"family":"Berkman","given":"Nancy D"},{"family":"Viswanathan","given":"Meera"},{"family":"Henry","given":"David"},{"family":"Altman","given":"Douglas G"},{"family":"Ansari","given":"Mohammed T"},{"family":"Boutron","given":"Isabelle"},{"family":"Carpenter","given":"James R"},{"family":"Chan","given":"An-Wen"},{"family":"Churchill","given":"Rachel"},{"family":"Deeks","given":"Jonathan J"},{"family":"Hróbjartsson","given":"Asbjørn"},{"family":"Kirkham","given":"Jamie"},{"family":"Jüni","given":"Peter"},{"family":"Loke","given":"Yoon K"},{"family":"Pigott","given":"Therese D."},{"family":"Ramsay","given":"Craig R"},{"family":"Regidor","given":"Deborah"},{"family":"Rothstein","given":"Hannah R."},{"family":"Sandhu","given":"Lakhbir"},{"family":"Santaguida","given":"Pasqualina L"},{"family":"Schünemann","given":"Holger J"},{"family":"Shea","given":"Beverly"},{"family":"Shrier","given":"Ian"},{"family":"Tugwell","given":"Peter"},{"family":"Turner","given":"Lucy"},{"family":"Valentine","given":"Jeffrey C"},{"family":"Waddington","given":"Hugh"},{"family":"Waters","given":"Elizabeth"},{"family":"Wells","given":"George A"},{"family":"Whiting","given":"Penny F"},{"family":"Higgins","given":"Julian P T"}],"issued":{"date-parts":[["2016",10,12]]}}}],"schema":"https://github.com/citation-style-language/schema/raw/master/csl-citation.json"} </w:instrText>
-      </w:r>
-      <w:r>
-        <w:fldChar w:fldCharType="separate"/>
-      </w:r>
-      <w:r>
-        <w:rPr>
-          <w:rFonts w:cs="Times New Roman"/>
-          <w:kern w:val="0"/>
-          <w:vertAlign w:val="superscript"/>
-        </w:rPr>
-        <w:t>97</w:t>
-      </w:r>
-      <w:r>
-        <w:fldChar w:fldCharType="end"/>
-      </w:r>
       <w:r>
         <w:t xml:space="preserve"> </w:t>
-      </w:r>
-      <w:r>
-        <w:t>M</w:t>
-      </w:r>
-      <w:r>
-        <w:t xml:space="preserve">ost effect </w:t>
-      </w:r>
-      <w:r>
-        <w:t>sizes</w:t>
-      </w:r>
-      <w:r>
-        <w:t xml:space="preserve"> were judged to be at serious risk of bias, primarily because of confounding</w:t>
-      </w:r>
-      <w:r>
-        <w:t xml:space="preserve"> and deviation from the intended intervention</w:t>
-      </w:r>
-      <w:r>
-        <w:t>. Other concerns included missing data. Because none of the non-randomized studies had a prespecified protocol, none could receive an overall low-risk judgment.</w:t>
-      </w:r>
-      <w:r>
-        <w:t xml:space="preserve"> </w:t>
-      </w:r>
-      <w:r>
-        <w:t xml:space="preserve">We excluded one </w:t>
-      </w:r>
-      <w:r>
-        <w:t xml:space="preserve">non-randomized </w:t>
-      </w:r>
-      <w:r>
-        <w:t>study</w:t>
-      </w:r>
-      <w:r>
-        <w:fldChar w:fldCharType="begin"/>
-      </w:r>
-      <w:r>
-        <w:instrText xml:space="preserve"> ADDIN ZOTERO_ITEM CSL_CITATION {"citationID":"dEub07EH","properties":{"formattedCitation":"\\super 74\\nosupersub{}","plainCitation":"74","noteIndex":0},"citationItems":[{"id":1294,"uris":["http://zotero.org/users/17688719/items/8QUHEST4"],"itemData":{"id":1294,"type":"article-journal","container-title":"Psychosocial Rehabilitation Journal","DOI":"10.1037/h0095785","ISSN":"0147-5622","issue":"2","note":"publisher: International Association of Psychosocial Rehabilitation Services and …\nCitation Key: Bond1991","page":"31","title":"Assertive community treatment and reference groups: An evaluation of their effectiveness for young adults with serious mental illness and substance abuse problems.","volume":"15","author":[{"family":"Bond","given":"Gary R"},{"family":"McDonel","given":"Elizabeth C"},{"family":"Miller","given":"Larry D"},{"family":"Pensec","given":"Michelle"}],"issued":{"date-parts":[["1991"]]}}}],"schema":"https://github.com/citation-style-language/schema/raw/master/csl-citation.json"} </w:instrText>
-      </w:r>
-      <w:r>
-        <w:fldChar w:fldCharType="separate"/>
-      </w:r>
-      <w:r>
-        <w:rPr>
-          <w:rFonts w:cs="Times New Roman"/>
-          <w:kern w:val="0"/>
-          <w:vertAlign w:val="superscript"/>
-        </w:rPr>
-        <w:t>74</w:t>
-      </w:r>
-      <w:r>
-        <w:fldChar w:fldCharType="end"/>
-      </w:r>
-      <w:r>
-        <w:t xml:space="preserve"> </w:t>
-      </w:r>
-      <w:r>
-        <w:t xml:space="preserve">from the meta-analysis because it was judged to be at critical risk of bias. </w:t>
-      </w:r>
-      <w:r>
-        <w:t>Find the visualization of the ROBINS-I assessment in the Supplementary Material Figure S2.</w:t>
-      </w:r>
-    </w:p>
-    <w:p>
-      <w:pPr>
-        <w:jc w:val="both"/>
-      </w:pPr>
-      <w:r>
-        <w:t>Given these concerns, risk of bias was included as a control variable in the covariate-adjusted moderator analyses. However, we found no systematic or substantial differences in effect sizes between studies judged to be at high or serious risk of bias and those judged to be at low or moderate</w:t>
-      </w:r>
-      <w:r>
-        <w:t>/some concern</w:t>
-      </w:r>
-      <w:r>
-        <w:t xml:space="preserve"> risk.</w:t>
-      </w:r>
-    </w:p>
-    <w:p>
-      <w:pPr>
-        <w:pStyle w:val="Heading3"/>
-      </w:pPr>
-      <w:r>
-        <w:t>Significant impact on both social integration and mental health</w:t>
-      </w:r>
-    </w:p>
-    <w:p>
-      <w:pPr>
-        <w:jc w:val="both"/>
-      </w:pPr>
-      <w:r>
-        <w:t xml:space="preserve">Figure </w:t>
-      </w:r>
-      <w:r>
-        <w:t>4</w:t>
-      </w:r>
-      <w:r>
-        <w:t xml:space="preserve"> depicts the distribution of all effect sizes across studies and the type of outcome. For more detailed forest plots, including study weights, see </w:t>
-      </w:r>
-      <w:r>
-        <w:t>S</w:t>
-      </w:r>
-      <w:r>
-        <w:t>upplementary</w:t>
-      </w:r>
-      <w:r>
-        <w:t xml:space="preserve"> Material</w:t>
-      </w:r>
-      <w:r>
-        <w:t xml:space="preserve"> Figures S</w:t>
-      </w:r>
-      <w:r>
-        <w:t>4</w:t>
-      </w:r>
-      <w:r>
-        <w:t>-S</w:t>
-      </w:r>
-      <w:r>
-        <w:t>5</w:t>
-      </w:r>
-      <w:r>
-        <w:t xml:space="preserve">. </w:t>
-      </w:r>
-    </w:p>
-    <w:p>
-      <w:pPr>
-        <w:jc w:val="both"/>
-        <w:rPr>
-          <w:lang w:val="en-CA"/>
-        </w:rPr>
-      </w:pPr>
-      <w:r>
-        <w:rPr>
-          <w:lang w:val="en-CA"/>
-        </w:rPr>
-        <w:t xml:space="preserve">Across the main analyses, group-based community interventions produced statistically significant benefits for both social reintegration and mental health. </w:t>
-      </w:r>
-      <w:r>
-        <w:rPr>
-          <w:lang w:val="en-CA"/>
-        </w:rPr>
-        <w:t xml:space="preserve">The meta-analysis of </w:t>
-      </w:r>
-      <w:r>
-        <w:rPr>
-          <w:lang w:val="en-CA"/>
-        </w:rPr>
-        <w:t>social reintegration</w:t>
-      </w:r>
-      <w:r>
-        <w:rPr>
-          <w:lang w:val="en-CA"/>
-        </w:rPr>
-        <w:t xml:space="preserve"> yielded a positive </w:t>
-      </w:r>
-      <w:r>
-        <w:rPr>
-          <w:lang w:val="en-CA"/>
-        </w:rPr>
-        <w:t xml:space="preserve">overall </w:t>
-      </w:r>
-      <w:r>
-        <w:rPr>
-          <w:lang w:val="en-CA"/>
-        </w:rPr>
-        <w:t xml:space="preserve">average </w:t>
-      </w:r>
-      <w:r>
-        <w:rPr>
-          <w:lang w:val="en-CA"/>
-        </w:rPr>
-        <w:t xml:space="preserve">effect </w:t>
-      </w:r>
-      <w:r>
-        <w:rPr>
-          <w:lang w:val="en-CA"/>
-        </w:rPr>
-        <w:t xml:space="preserve">of </w:t>
-      </w:r>
-      <w:r>
-        <w:rPr>
-          <w:lang w:val="en-CA"/>
-        </w:rPr>
-        <w:t>0.195 SD (95% CI [0.122, 0.268]</w:t>
-      </w:r>
-      <w:r>
-        <w:rPr>
-          <w:lang w:val="en-CA"/>
-        </w:rPr>
-        <w:t xml:space="preserve">, </w:t>
-      </w:r>
-      <w:proofErr w:type="gramStart"/>
-      <w:r>
-        <w:rPr>
-          <w:i/>
-          <w:iCs/>
-        </w:rPr>
-        <w:t>t</w:t>
-      </w:r>
-      <w:r>
-        <w:t>(</w:t>
-      </w:r>
-      <w:proofErr w:type="gramEnd"/>
-      <w:r>
-        <w:t xml:space="preserve">24.9) = 5.51, </w:t>
-      </w:r>
-      <w:r>
-        <w:rPr>
-          <w:i/>
-          <w:iCs/>
-        </w:rPr>
-        <w:t xml:space="preserve">p </w:t>
-      </w:r>
-      <w:r>
-        <w:t>&lt; 0.001</w:t>
-      </w:r>
-      <w:r>
-        <w:rPr>
-          <w:lang w:val="en-CA"/>
-        </w:rPr>
-        <w:t>). This indicates that participants receiving group-based interventions had better reintegration outcomes than those receiving individual treatment, treatment as usual</w:t>
-      </w:r>
-      <w:r>
-        <w:rPr>
-          <w:lang w:val="en-CA"/>
-        </w:rPr>
-        <w:t>,</w:t>
-      </w:r>
-      <w:r>
-        <w:rPr>
-          <w:lang w:val="en-CA"/>
-        </w:rPr>
-        <w:t xml:space="preserve"> or wait-list controls. The effect was approximately 2.3 times larger than the typical improvement observed under treatment as usual.</w:t>
-      </w:r>
-    </w:p>
-    <w:p>
-      <w:pPr>
-        <w:jc w:val="both"/>
-      </w:pPr>
-      <w:r>
-        <w:t xml:space="preserve">For mental health outcomes, the meta-analysis </w:t>
-      </w:r>
-      <w:r>
-        <w:t>yielded a</w:t>
-      </w:r>
-      <w:r>
-        <w:t xml:space="preserve"> positive</w:t>
-      </w:r>
-      <w:r>
-        <w:t xml:space="preserve"> overall average</w:t>
-      </w:r>
-      <w:r>
-        <w:t xml:space="preserve"> effect of 0.215 SD (95% CI [0.090, 0.340]</w:t>
-      </w:r>
-      <w:r>
-        <w:t xml:space="preserve">, </w:t>
-      </w:r>
-      <w:proofErr w:type="gramStart"/>
-      <w:r>
-        <w:rPr>
-          <w:i/>
-          <w:iCs/>
-        </w:rPr>
-        <w:t>t</w:t>
-      </w:r>
-      <w:r>
-        <w:t>(</w:t>
-      </w:r>
-      <w:proofErr w:type="gramEnd"/>
-      <w:r>
-        <w:t xml:space="preserve">37.5) = 3.48, </w:t>
-      </w:r>
-      <w:r>
-        <w:rPr>
-          <w:i/>
-          <w:iCs/>
-        </w:rPr>
-        <w:t>p</w:t>
-      </w:r>
-      <w:r>
-        <w:t xml:space="preserve"> = .001</w:t>
-      </w:r>
-      <w:r>
-        <w:t xml:space="preserve">). This effect was approximately 1.4 times larger than the typical improvement observed under treatment as usual. </w:t>
       </w:r>
     </w:p>
     <w:p>
@@ -15401,91 +16230,20 @@
           <w:bCs/>
         </w:rPr>
       </w:pPr>
-    </w:p>
-    <w:p>
-      <w:pPr>
+      <w:r>
         <w:rPr>
           <w:b/>
           <w:bCs/>
         </w:rPr>
-      </w:pPr>
-    </w:p>
-    <w:p>
-      <w:pPr>
+        <w:lastRenderedPageBreak/>
+        <w:t xml:space="preserve">Fig. </w:t>
+      </w:r>
+      <w:r>
         <w:rPr>
           <w:b/>
           <w:bCs/>
         </w:rPr>
-      </w:pPr>
-    </w:p>
-    <w:p>
-      <w:pPr>
-        <w:rPr>
-          <w:b/>
-          <w:bCs/>
-        </w:rPr>
-      </w:pPr>
-    </w:p>
-    <w:p>
-      <w:pPr>
-        <w:rPr>
-          <w:b/>
-          <w:bCs/>
-        </w:rPr>
-      </w:pPr>
-    </w:p>
-    <w:p>
-      <w:pPr>
-        <w:rPr>
-          <w:b/>
-          <w:bCs/>
-        </w:rPr>
-      </w:pPr>
-    </w:p>
-    <w:p>
-      <w:pPr>
-        <w:rPr>
-          <w:b/>
-          <w:bCs/>
-        </w:rPr>
-      </w:pPr>
-    </w:p>
-    <w:p>
-      <w:pPr>
-        <w:rPr>
-          <w:b/>
-          <w:bCs/>
-        </w:rPr>
-      </w:pPr>
-    </w:p>
-    <w:p>
-      <w:pPr>
-        <w:rPr>
-          <w:b/>
-          <w:bCs/>
-        </w:rPr>
-      </w:pPr>
-      <w:r>
-        <w:rPr>
-          <w:b/>
-          <w:bCs/>
-        </w:rPr>
-        <w:lastRenderedPageBreak/>
-        <w:t>F</w:t>
-      </w:r>
-      <w:r>
-        <w:rPr>
-          <w:b/>
-          <w:bCs/>
-        </w:rPr>
-        <w:t xml:space="preserve">ig. </w:t>
-      </w:r>
-      <w:r>
-        <w:rPr>
-          <w:b/>
-          <w:bCs/>
-        </w:rPr>
-        <w:t>4</w:t>
+        <w:t>5</w:t>
       </w:r>
       <w:r>
         <w:rPr>
@@ -15500,142 +16258,7 @@
           <w:b/>
           <w:bCs/>
         </w:rPr>
-        <w:t>Effect size forest plot across dependent effect sizes by type of outcome</w:t>
-      </w:r>
-    </w:p>
-    <w:p>
-      <w:r>
-        <w:rPr>
-          <w:noProof/>
-          <w:sz w:val="16"/>
-          <w:szCs w:val="16"/>
-        </w:rPr>
-        <w:drawing>
-          <wp:inline distT="0" distB="0" distL="0" distR="0" wp14:anchorId="14580E1B" wp14:editId="0915B547">
-            <wp:extent cx="4784140" cy="5262458"/>
-            <wp:effectExtent l="0" t="0" r="0" b="0"/>
-            <wp:docPr id="8" name="Picture 8" descr="A screen shot of a graph&#10;&#10;AI-generated content may be incorrect."/>
-            <wp:cNvGraphicFramePr>
-              <a:graphicFrameLocks xmlns:a="http://schemas.openxmlformats.org/drawingml/2006/main" noChangeAspect="1"/>
-            </wp:cNvGraphicFramePr>
-            <a:graphic xmlns:a="http://schemas.openxmlformats.org/drawingml/2006/main">
-              <a:graphicData uri="http://schemas.openxmlformats.org/drawingml/2006/picture">
-                <pic:pic xmlns:pic="http://schemas.openxmlformats.org/drawingml/2006/picture">
-                  <pic:nvPicPr>
-                    <pic:cNvPr id="8" name="Picture 8" descr="A screen shot of a graph&#10;&#10;AI-generated content may be incorrect."/>
-                    <pic:cNvPicPr/>
-                  </pic:nvPicPr>
-                  <pic:blipFill>
-                    <a:blip r:embed="rId11" cstate="print">
-                      <a:extLst>
-                        <a:ext uri="{28A0092B-C50C-407E-A947-70E740481C1C}">
-                          <a14:useLocalDpi xmlns:a14="http://schemas.microsoft.com/office/drawing/2010/main" val="0"/>
-                        </a:ext>
-                      </a:extLst>
-                    </a:blip>
-                    <a:stretch>
-                      <a:fillRect/>
-                    </a:stretch>
-                  </pic:blipFill>
-                  <pic:spPr>
-                    <a:xfrm>
-                      <a:off x="0" y="0"/>
-                      <a:ext cx="4786134" cy="5264651"/>
-                    </a:xfrm>
-                    <a:prstGeom prst="rect">
-                      <a:avLst/>
-                    </a:prstGeom>
-                  </pic:spPr>
-                </pic:pic>
-              </a:graphicData>
-            </a:graphic>
-          </wp:inline>
-        </w:drawing>
-      </w:r>
-    </w:p>
-    <w:p>
-      <w:pPr>
-        <w:jc w:val="both"/>
-      </w:pPr>
-    </w:p>
-    <w:p>
-      <w:pPr>
-        <w:jc w:val="both"/>
-      </w:pPr>
-      <w:r>
-        <w:t xml:space="preserve">In addition, and as depicted in Figure </w:t>
-      </w:r>
-      <w:r>
-        <w:t>5</w:t>
-      </w:r>
-      <w:r>
-        <w:t>, we find that e</w:t>
-      </w:r>
-      <w:r>
-        <w:t xml:space="preserve">ffects on social reintegration and mental health also covaried: studies showing larger reintegration gains tended to show larger mental health gains. This suggests that group-based community interventions may support multidimensional recovery, improving both social participation and clinical </w:t>
-      </w:r>
-      <w:r>
-        <w:t>well-being</w:t>
-      </w:r>
-      <w:r>
-        <w:t>.</w:t>
-      </w:r>
-      <w:r>
-        <w:t xml:space="preserve"> </w:t>
-      </w:r>
-    </w:p>
-    <w:p>
-      <w:pPr>
-        <w:rPr>
-          <w:b/>
-          <w:bCs/>
-        </w:rPr>
-      </w:pPr>
-    </w:p>
-    <w:p>
-      <w:pPr>
-        <w:rPr>
-          <w:b/>
-          <w:bCs/>
-        </w:rPr>
-      </w:pPr>
-    </w:p>
-    <w:p>
-      <w:pPr>
-        <w:rPr>
-          <w:b/>
-          <w:bCs/>
-        </w:rPr>
-      </w:pPr>
-    </w:p>
-    <w:p>
-      <w:pPr>
-        <w:rPr>
-          <w:b/>
-          <w:bCs/>
-        </w:rPr>
-      </w:pPr>
-      <w:r>
-        <w:rPr>
-          <w:b/>
-          <w:bCs/>
-        </w:rPr>
-        <w:lastRenderedPageBreak/>
-        <w:t xml:space="preserve">Fig. </w:t>
-      </w:r>
-      <w:r>
-        <w:rPr>
-          <w:b/>
-          <w:bCs/>
-        </w:rPr>
-        <w:t>5</w:t>
-      </w:r>
-      <w:r>
-        <w:rPr>
-          <w:b/>
-          <w:bCs/>
-        </w:rPr>
-        <w:t xml:space="preserve"> | </w:t>
+        <w:t xml:space="preserve">Scatter plot illustrating the aggregated </w:t>
       </w:r>
       <w:r>
         <w:rPr>
@@ -15643,7 +16266,31 @@
           <w:b/>
           <w:bCs/>
         </w:rPr>
-        <w:t>Scatter plot illustrating the aggregated covariation between social reintegration and mental health outcomes</w:t>
+        <w:t>effects</w:t>
+      </w:r>
+      <w:r>
+        <w:rPr>
+          <w:rFonts w:eastAsia="Times New Roman"/>
+          <w:b/>
+          <w:bCs/>
+        </w:rPr>
+        <w:t xml:space="preserve"> </w:t>
+      </w:r>
+      <w:r>
+        <w:rPr>
+          <w:rFonts w:eastAsia="Times New Roman"/>
+          <w:b/>
+          <w:bCs/>
+        </w:rPr>
+        <w:t>of</w:t>
+      </w:r>
+      <w:r>
+        <w:rPr>
+          <w:rFonts w:eastAsia="Times New Roman"/>
+          <w:b/>
+          <w:bCs/>
+        </w:rPr>
+        <w:t xml:space="preserve"> social reintegration and mental health outcomes</w:t>
       </w:r>
     </w:p>
     <w:p>
@@ -15674,7 +16321,7 @@
                     <pic:cNvPicPr/>
                   </pic:nvPicPr>
                   <pic:blipFill>
-                    <a:blip r:embed="rId12" cstate="print">
+                    <a:blip r:embed="rId13" cstate="print">
                       <a:extLst>
                         <a:ext uri="{28A0092B-C50C-407E-A947-70E740481C1C}">
                           <a14:useLocalDpi xmlns:a14="http://schemas.microsoft.com/office/drawing/2010/main" val="0"/>
@@ -15840,7 +16487,6 @@
       <w:r>
         <w:t xml:space="preserve"> </w:t>
       </w:r>
-      <w:proofErr w:type="gramStart"/>
       <w:r>
         <w:rPr>
           <w:i/>
@@ -15849,11 +16495,7 @@
         <w:t>Q</w:t>
       </w:r>
       <w:r>
-        <w:t>(</w:t>
-      </w:r>
-      <w:proofErr w:type="gramEnd"/>
-      <w:r>
-        <w:t xml:space="preserve">204) = 1220.8, </w:t>
+        <w:t xml:space="preserve">(204) = 1220.8, </w:t>
       </w:r>
       <w:r>
         <w:rPr>
@@ -15890,7 +16532,6 @@
       <w:r>
         <w:t xml:space="preserve"> </w:t>
       </w:r>
-      <w:proofErr w:type="gramStart"/>
       <w:r>
         <w:rPr>
           <w:rFonts w:eastAsia="Times New Roman"/>
@@ -15903,14 +16544,7 @@
         <w:rPr>
           <w:rFonts w:eastAsia="Times New Roman"/>
         </w:rPr>
-        <w:t>(</w:t>
-      </w:r>
-      <w:proofErr w:type="gramEnd"/>
-      <w:r>
-        <w:rPr>
-          <w:rFonts w:eastAsia="Times New Roman"/>
-        </w:rPr>
-        <w:t xml:space="preserve">143) = 174072.2, </w:t>
+        <w:t xml:space="preserve">(143) = 174072.2, </w:t>
       </w:r>
       <w:r>
         <w:rPr>
@@ -16025,6 +16659,9 @@
         <w:t>Find detailed sensitivity results in the Online Appendix D</w:t>
       </w:r>
       <w:r>
+        <w:t xml:space="preserve"> and visualizations of the main sensitivity analyses in the Supplementary Figures S4-S5</w:t>
+      </w:r>
+      <w:r>
         <w:t>.</w:t>
       </w:r>
     </w:p>
@@ -16189,7 +16826,6 @@
           <w:b/>
           <w:bCs/>
         </w:rPr>
-        <w:lastRenderedPageBreak/>
         <w:t xml:space="preserve">Fig. </w:t>
       </w:r>
       <w:r>
@@ -16237,7 +16873,7 @@
                     <pic:cNvPicPr/>
                   </pic:nvPicPr>
                   <pic:blipFill>
-                    <a:blip r:embed="rId13" cstate="print">
+                    <a:blip r:embed="rId14" cstate="print">
                       <a:extLst>
                         <a:ext uri="{28A0092B-C50C-407E-A947-70E740481C1C}">
                           <a14:useLocalDpi xmlns:a14="http://schemas.microsoft.com/office/drawing/2010/main" val="0"/>
@@ -16413,7 +17049,13 @@
         <w:jc w:val="both"/>
       </w:pPr>
       <w:r>
-        <w:t>Given the substantial heterogeneity in both outcome domains, we conducted protocol-informed meta-regression analyses to examine whether effects varied by substantive or methodological moderators. Analyses were conducted separately for social reintegration and mental health outcomes, using both unadjusted and covariate-adjusted models. Results were generally similar across model specifications, although covariate-adjusted estimates were often slightly larger.</w:t>
+        <w:t>Given the substantial heterogeneity in both outcome domains, we conducted protocol-informed meta-regression analyses to examine whether effects varied by substantive</w:t>
+      </w:r>
+      <w:r>
+        <w:t xml:space="preserve"> (i.e., theoretically relevant)</w:t>
+      </w:r>
+      <w:r>
+        <w:t xml:space="preserve"> or methodological moderators. Analyses were conducted separately for social reintegration and mental health outcomes, using both unadjusted and covariate-adjusted models. Results were generally similar across model specifications, although covariate-adjusted estimates were often slightly larger.</w:t>
       </w:r>
       <w:r>
         <w:t xml:space="preserve"> All conducted moderator analyses can be found in the Supplementary Material Tables S</w:t>
@@ -16487,7 +17129,6 @@
       <w:r>
         <w:t xml:space="preserve"> </w:t>
       </w:r>
-      <w:proofErr w:type="gramStart"/>
       <w:r>
         <w:rPr>
           <w:i/>
@@ -16496,11 +17137,7 @@
         <w:t>CI</w:t>
       </w:r>
       <w:r>
-        <w:t>[</w:t>
-      </w:r>
-      <w:proofErr w:type="gramEnd"/>
-      <w:r>
-        <w:t xml:space="preserve">0.03, 0.22]. </w:t>
+        <w:t xml:space="preserve">[0.03, 0.22]. </w:t>
       </w:r>
     </w:p>
     <w:p>
@@ -16979,13 +17616,8 @@
         <w:t>’</w:t>
       </w:r>
       <w:r>
-        <w:t xml:space="preserve"> risk-of-bias category to </w:t>
-      </w:r>
-      <w:proofErr w:type="spellStart"/>
-      <w:r>
-        <w:t>RoB</w:t>
-      </w:r>
-      <w:proofErr w:type="spellEnd"/>
+        <w:t xml:space="preserve"> risk-of-bias category to RoB</w:t>
+      </w:r>
       <w:r>
         <w:t xml:space="preserve"> </w:t>
       </w:r>
@@ -17483,134 +18115,464 @@
           <w:rFonts w:eastAsia="Times New Roman"/>
           <w:lang w:eastAsia="da-DK"/>
         </w:rPr>
-        <w:t xml:space="preserve">l Services Abstracts (ProQuest), </w:t>
-      </w:r>
-      <w:proofErr w:type="spellStart"/>
+        <w:t xml:space="preserve">l Services Abstracts (ProQuest), SocINDEX (EBSCO), Academic Search Premier (EBSCO), </w:t>
+      </w:r>
       <w:r>
         <w:rPr>
           <w:rFonts w:eastAsia="Times New Roman"/>
           <w:lang w:eastAsia="da-DK"/>
         </w:rPr>
-        <w:t>SocINDEX</w:t>
-      </w:r>
-      <w:proofErr w:type="spellEnd"/>
+        <w:t>International Bibliography of the So</w:t>
+      </w:r>
       <w:r>
         <w:rPr>
           <w:rFonts w:eastAsia="Times New Roman"/>
           <w:lang w:eastAsia="da-DK"/>
         </w:rPr>
-        <w:t xml:space="preserve"> (EBSCO), Academic Search Premier (EBSCO), </w:t>
+        <w:t xml:space="preserve">cial Sciences (IBSS) (ProQuest), </w:t>
       </w:r>
       <w:r>
         <w:rPr>
           <w:rFonts w:eastAsia="Times New Roman"/>
           <w:lang w:eastAsia="da-DK"/>
         </w:rPr>
-        <w:t>International Bibliography of the So</w:t>
+        <w:t>Science Citation Index (</w:t>
       </w:r>
       <w:r>
         <w:rPr>
           <w:rFonts w:eastAsia="Times New Roman"/>
           <w:lang w:eastAsia="da-DK"/>
         </w:rPr>
-        <w:t xml:space="preserve">cial Sciences (IBSS) (ProQuest), </w:t>
+        <w:t xml:space="preserve">Web of Science Core Collection), </w:t>
       </w:r>
       <w:r>
         <w:rPr>
           <w:rFonts w:eastAsia="Times New Roman"/>
           <w:lang w:eastAsia="da-DK"/>
         </w:rPr>
-        <w:t>Science Citation Index (</w:t>
+        <w:t>Social Sciences Citation Index (Web of Science Core Collection)</w:t>
       </w:r>
       <w:r>
         <w:rPr>
           <w:rFonts w:eastAsia="Times New Roman"/>
           <w:lang w:eastAsia="da-DK"/>
         </w:rPr>
-        <w:t xml:space="preserve">Web of Science Core Collection), </w:t>
+        <w:t xml:space="preserve">, </w:t>
       </w:r>
       <w:r>
         <w:rPr>
           <w:rFonts w:eastAsia="Times New Roman"/>
           <w:lang w:eastAsia="da-DK"/>
         </w:rPr>
-        <w:t>Social Sciences Citation Index (Web of Science Core Collection)</w:t>
+        <w:t>Cochrane Central Register</w:t>
       </w:r>
       <w:r>
         <w:rPr>
           <w:rFonts w:eastAsia="Times New Roman"/>
           <w:lang w:eastAsia="da-DK"/>
         </w:rPr>
-        <w:t xml:space="preserve">, </w:t>
-      </w:r>
-      <w:r>
+        <w:t xml:space="preserve"> of Controlled Trials (CENTRAL).</w:t>
+      </w:r>
+      <w:r>
+        <w:t xml:space="preserve"> The electronic database searches were completed in September 2022</w:t>
+      </w:r>
+      <w:r>
+        <w:t>,</w:t>
+      </w:r>
+      <w:r>
+        <w:t xml:space="preserve"> and other resources were completed in July 2024. We searched to identify both published and unpublished literature. The searches were international in scope</w:t>
+      </w:r>
+      <w:r>
+        <w:t>. In addition to electronic searches, w</w:t>
+      </w:r>
+      <w:r>
+        <w:t xml:space="preserve">e implemented </w:t>
+      </w:r>
+      <w:r>
+        <w:lastRenderedPageBreak/>
+        <w:t xml:space="preserve">a wide range of search methods and strategies to </w:t>
+      </w:r>
+      <w:r>
+        <w:t>maximize</w:t>
+      </w:r>
+      <w:r>
+        <w:t xml:space="preserve"> coverage of relevant references</w:t>
+      </w:r>
+      <w:r>
+        <w:t>. F</w:t>
+      </w:r>
+      <w:r>
+        <w:t>ind</w:t>
+      </w:r>
+      <w:r>
+        <w:t xml:space="preserve"> further details</w:t>
+      </w:r>
+      <w:r>
+        <w:t xml:space="preserve"> in</w:t>
+      </w:r>
+      <w:r>
+        <w:t xml:space="preserve"> the</w:t>
+      </w:r>
+      <w:r>
+        <w:t xml:space="preserve"> </w:t>
+      </w:r>
+      <w:r>
+        <w:t>Supplementary Material</w:t>
+      </w:r>
+      <w:r>
+        <w:t>. The full search string can be found in the protocol</w:t>
+      </w:r>
+      <w:r>
+        <w:fldChar w:fldCharType="begin"/>
+      </w:r>
+      <w:r>
+        <w:instrText xml:space="preserve"> ADDIN ZOTERO_ITEM CSL_CITATION {"citationID":"a1ru7tkltda","properties":{"formattedCitation":"\\super 33\\nosupersub{}","plainCitation":"33","noteIndex":0},"citationItems":[{"id":1146,"uris":["http://zotero.org/users/17688719/items/DVUIDNEH"],"itemData":{"id":1146,"type":"article-journal","container-title":"Campbell Systematic Reviews","DOI":"10.1002/cl2.1254","ISSN":"1891-1803","issue":"3","note":"publisher: Wiley Online Library\nCitation Key: Dalgaard2022a","page":"e1254","title":"PROTOCOL: Group‐based community interventions to support the social reintegration of marginalised adults with mental illness","volume":"18","author":[{"family":"Dalgaard","given":"Nina T"},{"family":"Flensborg Jensen","given":"Maya C"},{"family":"Bengtsen","given":"Elizabeth"},{"family":"Krassel","given":"Karl F"},{"family":"Vembye","given":"Mikkel H"}],"issued":{"date-parts":[["2022"]]}}}],"schema":"https://github.com/citation-style-language/schema/raw/master/csl-citation.json"} </w:instrText>
+      </w:r>
+      <w:r>
+        <w:fldChar w:fldCharType="separate"/>
+      </w:r>
+      <w:r>
+        <w:rPr>
+          <w:rFonts w:cs="Times New Roman"/>
+          <w:kern w:val="0"/>
+          <w:vertAlign w:val="superscript"/>
+        </w:rPr>
+        <w:t>33</w:t>
+      </w:r>
+      <w:r>
+        <w:fldChar w:fldCharType="end"/>
+      </w:r>
+      <w:r>
+        <w:t>.</w:t>
+      </w:r>
+      <w:r>
+        <w:t xml:space="preserve"> </w:t>
+      </w:r>
+    </w:p>
+    <w:p>
+      <w:pPr>
+        <w:pStyle w:val="Heading3"/>
+      </w:pPr>
+      <w:r>
+        <w:t>Screening and data extraction</w:t>
+      </w:r>
+    </w:p>
+    <w:p>
+      <w:pPr>
+        <w:spacing w:before="100" w:beforeAutospacing="1" w:after="100" w:afterAutospacing="1"/>
+        <w:jc w:val="both"/>
         <w:rPr>
           <w:rFonts w:eastAsia="Times New Roman"/>
           <w:lang w:eastAsia="da-DK"/>
         </w:rPr>
-        <w:t>Cochrane Central Register</w:t>
-      </w:r>
+      </w:pPr>
       <w:r>
         <w:rPr>
           <w:rFonts w:eastAsia="Times New Roman"/>
           <w:lang w:eastAsia="da-DK"/>
         </w:rPr>
-        <w:t xml:space="preserve"> of Controlled Trials (CENTRAL).</w:t>
-      </w:r>
-      <w:r>
-        <w:t xml:space="preserve"> The electronic database searches were completed in September 2022</w:t>
-      </w:r>
-      <w:r>
-        <w:t>,</w:t>
-      </w:r>
-      <w:r>
-        <w:t xml:space="preserve"> and other resources were completed in July 2024. We searched to identify both published and unpublished literature. The searches were international in scope</w:t>
-      </w:r>
-      <w:r>
-        <w:t>. In addition to electronic searches, w</w:t>
-      </w:r>
-      <w:r>
-        <w:t xml:space="preserve">e implemented </w:t>
-      </w:r>
-      <w:r>
-        <w:lastRenderedPageBreak/>
-        <w:t xml:space="preserve">a wide range of search methods and strategies to </w:t>
-      </w:r>
-      <w:r>
-        <w:t>maximize</w:t>
-      </w:r>
-      <w:r>
-        <w:t xml:space="preserve"> coverage of relevant references</w:t>
-      </w:r>
-      <w:r>
-        <w:t>. F</w:t>
-      </w:r>
-      <w:r>
-        <w:t>ind</w:t>
-      </w:r>
-      <w:r>
-        <w:t xml:space="preserve"> further details</w:t>
-      </w:r>
-      <w:r>
-        <w:t xml:space="preserve"> in</w:t>
-      </w:r>
-      <w:r>
-        <w:t xml:space="preserve"> the</w:t>
-      </w:r>
-      <w:r>
+        <w:t xml:space="preserve">All </w:t>
+      </w:r>
+      <w:r>
+        <w:rPr>
+          <w:rFonts w:eastAsia="Times New Roman"/>
+          <w:lang w:eastAsia="da-DK"/>
+        </w:rPr>
+        <w:t>title and abstract screening as well as full-text screening</w:t>
+      </w:r>
+      <w:r>
+        <w:rPr>
+          <w:rFonts w:eastAsia="Times New Roman"/>
+          <w:lang w:eastAsia="da-DK"/>
+        </w:rPr>
+        <w:t xml:space="preserve"> were conducted independently by at least</w:t>
+      </w:r>
+      <w:r>
+        <w:rPr>
+          <w:rFonts w:eastAsia="Times New Roman"/>
+          <w:lang w:eastAsia="da-DK"/>
+        </w:rPr>
         <w:t xml:space="preserve"> </w:t>
       </w:r>
       <w:r>
-        <w:t>Supplementary Material</w:t>
-      </w:r>
-      <w:r>
-        <w:t>. The full search string can be found in the protocol</w:t>
+        <w:rPr>
+          <w:rFonts w:eastAsia="Times New Roman"/>
+          <w:lang w:eastAsia="da-DK"/>
+        </w:rPr>
+        <w:t xml:space="preserve">two review authors, and all </w:t>
+      </w:r>
+      <w:r>
+        <w:rPr>
+          <w:rFonts w:eastAsia="Times New Roman"/>
+          <w:lang w:eastAsia="da-DK"/>
+        </w:rPr>
+        <w:t>disagreements were</w:t>
+      </w:r>
+      <w:r>
+        <w:rPr>
+          <w:rFonts w:eastAsia="Times New Roman"/>
+          <w:lang w:eastAsia="da-DK"/>
+        </w:rPr>
+        <w:t xml:space="preserve"> resolved by either N</w:t>
+      </w:r>
+      <w:r>
+        <w:rPr>
+          <w:rFonts w:eastAsia="Times New Roman"/>
+          <w:lang w:eastAsia="da-DK"/>
+        </w:rPr>
+        <w:t>.</w:t>
+      </w:r>
+      <w:r>
+        <w:rPr>
+          <w:rFonts w:eastAsia="Times New Roman"/>
+          <w:lang w:eastAsia="da-DK"/>
+        </w:rPr>
+        <w:t>T</w:t>
+      </w:r>
+      <w:r>
+        <w:rPr>
+          <w:rFonts w:eastAsia="Times New Roman"/>
+          <w:lang w:eastAsia="da-DK"/>
+        </w:rPr>
+        <w:t>.</w:t>
+      </w:r>
+      <w:r>
+        <w:rPr>
+          <w:rFonts w:eastAsia="Times New Roman"/>
+          <w:lang w:eastAsia="da-DK"/>
+        </w:rPr>
+        <w:t xml:space="preserve">D </w:t>
+      </w:r>
+      <w:r>
+        <w:t>and/or</w:t>
+      </w:r>
+      <w:r>
+        <w:rPr>
+          <w:rFonts w:eastAsia="Times New Roman"/>
+          <w:lang w:eastAsia="da-DK"/>
+        </w:rPr>
+        <w:t xml:space="preserve"> M</w:t>
+      </w:r>
+      <w:r>
+        <w:rPr>
+          <w:rFonts w:eastAsia="Times New Roman"/>
+          <w:lang w:eastAsia="da-DK"/>
+        </w:rPr>
+        <w:t>.</w:t>
+      </w:r>
+      <w:r>
+        <w:rPr>
+          <w:rFonts w:eastAsia="Times New Roman"/>
+          <w:lang w:eastAsia="da-DK"/>
+        </w:rPr>
+        <w:t>H</w:t>
+      </w:r>
+      <w:r>
+        <w:rPr>
+          <w:rFonts w:eastAsia="Times New Roman"/>
+          <w:lang w:eastAsia="da-DK"/>
+        </w:rPr>
+        <w:t>.</w:t>
+      </w:r>
+      <w:r>
+        <w:rPr>
+          <w:rFonts w:eastAsia="Times New Roman"/>
+          <w:lang w:eastAsia="da-DK"/>
+        </w:rPr>
+        <w:t>V</w:t>
+      </w:r>
+      <w:r>
+        <w:rPr>
+          <w:rFonts w:eastAsia="Times New Roman"/>
+          <w:lang w:eastAsia="da-DK"/>
+        </w:rPr>
+        <w:t>.</w:t>
+      </w:r>
+      <w:r>
+        <w:rPr>
+          <w:rFonts w:eastAsia="Times New Roman"/>
+          <w:lang w:eastAsia="da-DK"/>
+        </w:rPr>
+        <w:t xml:space="preserve"> Studies considered eligible by at least one </w:t>
+      </w:r>
+      <w:r>
+        <w:rPr>
+          <w:rFonts w:eastAsia="Times New Roman"/>
+          <w:lang w:eastAsia="da-DK"/>
+        </w:rPr>
+        <w:t>team member</w:t>
+      </w:r>
+      <w:r>
+        <w:rPr>
+          <w:rFonts w:eastAsia="Times New Roman"/>
+          <w:lang w:eastAsia="da-DK"/>
+        </w:rPr>
+        <w:t xml:space="preserve"> or studies w</w:t>
+      </w:r>
+      <w:r>
+        <w:rPr>
+          <w:rFonts w:eastAsia="Times New Roman"/>
+          <w:lang w:eastAsia="da-DK"/>
+        </w:rPr>
+        <w:t>h</w:t>
+      </w:r>
+      <w:r>
+        <w:rPr>
+          <w:rFonts w:eastAsia="Times New Roman"/>
+          <w:lang w:eastAsia="da-DK"/>
+        </w:rPr>
+        <w:t>ere there was insufficient information in the title and abstract to judge eligibility w</w:t>
+      </w:r>
+      <w:r>
+        <w:rPr>
+          <w:rFonts w:eastAsia="Times New Roman"/>
+          <w:lang w:eastAsia="da-DK"/>
+        </w:rPr>
+        <w:t>ere</w:t>
+      </w:r>
+      <w:r>
+        <w:rPr>
+          <w:rFonts w:eastAsia="Times New Roman"/>
+          <w:lang w:eastAsia="da-DK"/>
+        </w:rPr>
+        <w:t xml:space="preserve"> retrieved in full text. </w:t>
+      </w:r>
+      <w:bookmarkStart w:id="1" w:name="DATA_EXTRACTION"/>
+      <w:bookmarkEnd w:id="1"/>
+    </w:p>
+    <w:p>
+      <w:pPr>
+        <w:spacing w:before="100" w:beforeAutospacing="1" w:after="100" w:afterAutospacing="1"/>
+        <w:jc w:val="both"/>
+      </w:pPr>
+      <w:r>
+        <w:t>Data extraction was done in collaboration between N</w:t>
+      </w:r>
+      <w:r>
+        <w:t>.</w:t>
+      </w:r>
+      <w:r>
+        <w:t>T</w:t>
+      </w:r>
+      <w:r>
+        <w:t>.</w:t>
+      </w:r>
+      <w:r>
+        <w:t>D, J</w:t>
+      </w:r>
+      <w:r>
+        <w:t>.</w:t>
+      </w:r>
+      <w:r>
+        <w:t>S</w:t>
+      </w:r>
+      <w:r>
+        <w:t>.</w:t>
+      </w:r>
+      <w:r>
+        <w:t>A, J</w:t>
+      </w:r>
+      <w:r>
+        <w:t>.</w:t>
+      </w:r>
+      <w:r>
+        <w:t>K</w:t>
+      </w:r>
+      <w:r>
+        <w:t>.</w:t>
+      </w:r>
+      <w:r>
+        <w:t>J, and M</w:t>
+      </w:r>
+      <w:r>
+        <w:t>.</w:t>
+      </w:r>
+      <w:r>
+        <w:t>H</w:t>
+      </w:r>
+      <w:r>
+        <w:t>.</w:t>
+      </w:r>
+      <w:r>
+        <w:t>V, with minor support from two research assistants. All coding and data extraction were done independently by at least two reviewers. Before initiating the final extraction, our extraction scheme was piloted to ensure a standardized use thereof. Throughout the entire process, any extraction disagreements were resolved by N</w:t>
+      </w:r>
+      <w:r>
+        <w:t>.</w:t>
+      </w:r>
+      <w:r>
+        <w:t>T</w:t>
+      </w:r>
+      <w:r>
+        <w:t>.</w:t>
+      </w:r>
+      <w:r>
+        <w:t>D and/or M</w:t>
+      </w:r>
+      <w:r>
+        <w:t>.</w:t>
+      </w:r>
+      <w:r>
+        <w:t>H</w:t>
+      </w:r>
+      <w:r>
+        <w:t>.</w:t>
+      </w:r>
+      <w:r>
+        <w:t xml:space="preserve">V. </w:t>
+      </w:r>
+      <w:r>
+        <w:tab/>
+      </w:r>
+      <w:r>
+        <w:br/>
+      </w:r>
+      <w:r>
+        <w:br/>
+      </w:r>
+      <w:r>
+        <w:t>Effect sizes were primarily extracted and calculated by J</w:t>
+      </w:r>
+      <w:r>
+        <w:t>.</w:t>
+      </w:r>
+      <w:r>
+        <w:t>K</w:t>
+      </w:r>
+      <w:r>
+        <w:t>.</w:t>
+      </w:r>
+      <w:r>
+        <w:t>J and M</w:t>
+      </w:r>
+      <w:r>
+        <w:t>.</w:t>
+      </w:r>
+      <w:r>
+        <w:t>H</w:t>
+      </w:r>
+      <w:r>
+        <w:t>.</w:t>
+      </w:r>
+      <w:r>
+        <w:t>V, and quality checked by J</w:t>
+      </w:r>
+      <w:r>
+        <w:t>.</w:t>
+      </w:r>
+      <w:r>
+        <w:t>S</w:t>
+      </w:r>
+      <w:r>
+        <w:t>.</w:t>
+      </w:r>
+      <w:r>
+        <w:t>A in accordance with the prescribed procedures for ensuring reproducible research in statistics developed by Hofner et al.</w:t>
       </w:r>
       <w:r>
         <w:fldChar w:fldCharType="begin"/>
       </w:r>
       <w:r>
-        <w:instrText xml:space="preserve"> ADDIN ZOTERO_ITEM CSL_CITATION {"citationID":"a1ru7tkltda","properties":{"formattedCitation":"\\super 33\\nosupersub{}","plainCitation":"33","noteIndex":0},"citationItems":[{"id":1146,"uris":["http://zotero.org/users/17688719/items/DVUIDNEH"],"itemData":{"id":1146,"type":"article-journal","container-title":"Campbell Systematic Reviews","DOI":"10.1002/cl2.1254","ISSN":"1891-1803","issue":"3","note":"publisher: Wiley Online Library\nCitation Key: Dalgaard2022a","page":"e1254","title":"PROTOCOL: Group‐based community interventions to support the social reintegration of marginalised adults with mental illness","volume":"18","author":[{"family":"Dalgaard","given":"Nina T"},{"family":"Flensborg Jensen","given":"Maya C"},{"family":"Bengtsen","given":"Elizabeth"},{"family":"Krassel","given":"Karl F"},{"family":"Vembye","given":"Mikkel H"}],"issued":{"date-parts":[["2022"]]}}}],"schema":"https://github.com/citation-style-language/schema/raw/master/csl-citation.json"} </w:instrText>
+        <w:instrText xml:space="preserve"> ADDIN ZOTERO_ITEM CSL_CITATION {"citationID":"F8edHOmS","properties":{"formattedCitation":"\\super 104\\nosupersub{}","plainCitation":"104","noteIndex":0},"citationItems":[{"id":447,"uris":["http://zotero.org/users/17688719/items/SXA8YCT6"],"itemData":{"id":447,"type":"article-journal","abstract":"Reproducible research (RR) constitutes the idea that a publication should be accompanied by all relevant material to reproduce the results and findings of a scientific work. Hence, results can be verified and researchers are able to build upon these. Efforts of the Biometrical Journal over the last five years have increased the number of manuscripts which are reproducible by a factor of 4 to almost 50%. Yet, more than half of the code submission could not be executed in the initial review due to missing code, missing data or errors in the code. Careful checks of the submitted code as part of the reviewing process are essential to eliminate these issues and to foster RR. In this article, we reviewed n=56 recent submissions of code and data to identify common reproducibility issues. Based on these findings, guidelines for structuring code submission to the Biometrical Journal have been established to help authors. These guidelines should help researchers to implement RR in general. Together with the code reviews, this supports the mission of the Biometrical Journal\nin publishing highest quality, novel and relevant papers on statistical methods and their applications in life sciences. Source code and data to reproduce the presented data analyses are available as Supplementary Material on the journal's web page.","container-title":"Biometrical journal","DOI":"10.1002/bimj.201500156","ISSN":"0323-3847","issue":"2","note":"publisher: Blackwell Publishing Ltd\nCitation Key: Hofner2016\npublisher-place: Germany","page":"416-427","title":"Reproducible research in statistics: A review and guidelines for the Biometrical Journal","volume":"58","author":[{"family":"Hofner","given":"Benjamin"},{"family":"Schmid","given":"Matthias"},{"family":"Edler","given":"Lutz"}],"issued":{"date-parts":[["2016"]]}}}],"schema":"https://github.com/citation-style-language/schema/raw/master/csl-citation.json"} </w:instrText>
       </w:r>
       <w:r>
         <w:fldChar w:fldCharType="separate"/>
@@ -17621,16 +18583,25 @@
           <w:kern w:val="0"/>
           <w:vertAlign w:val="superscript"/>
         </w:rPr>
-        <w:t>33</w:t>
+        <w:t>104</w:t>
       </w:r>
       <w:r>
         <w:fldChar w:fldCharType="end"/>
       </w:r>
       <w:r>
+        <w:t>. All effect size issues were resolved by M</w:t>
+      </w:r>
+      <w:r>
         <w:t>.</w:t>
       </w:r>
       <w:r>
-        <w:t xml:space="preserve"> </w:t>
+        <w:t>H</w:t>
+      </w:r>
+      <w:r>
+        <w:t>.</w:t>
+      </w:r>
+      <w:r>
+        <w:t xml:space="preserve">V. </w:t>
       </w:r>
     </w:p>
     <w:p>
@@ -17638,166 +18609,59 @@
         <w:pStyle w:val="Heading3"/>
       </w:pPr>
       <w:r>
-        <w:t>Screening and data extraction</w:t>
-      </w:r>
-    </w:p>
-    <w:p>
-      <w:pPr>
-        <w:spacing w:before="100" w:beforeAutospacing="1" w:after="100" w:afterAutospacing="1"/>
+        <w:t xml:space="preserve">Risk of bias assessment </w:t>
+      </w:r>
+    </w:p>
+    <w:p>
+      <w:pPr>
         <w:jc w:val="both"/>
-        <w:rPr>
-          <w:rFonts w:eastAsia="Times New Roman"/>
-          <w:lang w:eastAsia="da-DK"/>
-        </w:rPr>
-      </w:pPr>
-      <w:r>
-        <w:rPr>
-          <w:rFonts w:eastAsia="Times New Roman"/>
-          <w:lang w:eastAsia="da-DK"/>
-        </w:rPr>
-        <w:t xml:space="preserve">All </w:t>
-      </w:r>
-      <w:r>
-        <w:rPr>
-          <w:rFonts w:eastAsia="Times New Roman"/>
-          <w:lang w:eastAsia="da-DK"/>
-        </w:rPr>
-        <w:t>title and abstract screening as well as full-text screening</w:t>
-      </w:r>
-      <w:r>
-        <w:rPr>
-          <w:rFonts w:eastAsia="Times New Roman"/>
-          <w:lang w:eastAsia="da-DK"/>
-        </w:rPr>
-        <w:t xml:space="preserve"> were conducted independently by at least</w:t>
-      </w:r>
-      <w:r>
-        <w:rPr>
-          <w:rFonts w:eastAsia="Times New Roman"/>
-          <w:lang w:eastAsia="da-DK"/>
-        </w:rPr>
-        <w:t xml:space="preserve"> </w:t>
-      </w:r>
-      <w:r>
-        <w:rPr>
-          <w:rFonts w:eastAsia="Times New Roman"/>
-          <w:lang w:eastAsia="da-DK"/>
-        </w:rPr>
-        <w:t xml:space="preserve">two review authors, and all </w:t>
-      </w:r>
-      <w:r>
-        <w:rPr>
-          <w:rFonts w:eastAsia="Times New Roman"/>
-          <w:lang w:eastAsia="da-DK"/>
-        </w:rPr>
-        <w:t>disagreements were</w:t>
-      </w:r>
-      <w:r>
-        <w:rPr>
-          <w:rFonts w:eastAsia="Times New Roman"/>
-          <w:lang w:eastAsia="da-DK"/>
-        </w:rPr>
-        <w:t xml:space="preserve"> resolved by either NTD </w:t>
-      </w:r>
-      <w:r>
-        <w:t>and/or</w:t>
-      </w:r>
-      <w:r>
-        <w:rPr>
-          <w:rFonts w:eastAsia="Times New Roman"/>
-          <w:lang w:eastAsia="da-DK"/>
-        </w:rPr>
-        <w:t xml:space="preserve"> MHV</w:t>
-      </w:r>
-      <w:r>
-        <w:rPr>
-          <w:rFonts w:eastAsia="Times New Roman"/>
-          <w:lang w:eastAsia="da-DK"/>
-        </w:rPr>
+      </w:pPr>
+      <w:r>
+        <w:t>Risk of bias was assessed independently by at least two reviewers, with disagreements resolved by N</w:t>
+      </w:r>
+      <w:r>
         <w:t>.</w:t>
       </w:r>
       <w:r>
-        <w:rPr>
-          <w:rFonts w:eastAsia="Times New Roman"/>
-          <w:lang w:eastAsia="da-DK"/>
-        </w:rPr>
-        <w:t xml:space="preserve"> Studies considered eligible by at least one </w:t>
-      </w:r>
-      <w:r>
-        <w:rPr>
-          <w:rFonts w:eastAsia="Times New Roman"/>
-          <w:lang w:eastAsia="da-DK"/>
-        </w:rPr>
-        <w:t>team member</w:t>
-      </w:r>
-      <w:r>
-        <w:rPr>
-          <w:rFonts w:eastAsia="Times New Roman"/>
-          <w:lang w:eastAsia="da-DK"/>
-        </w:rPr>
-        <w:t xml:space="preserve"> or studies w</w:t>
-      </w:r>
-      <w:r>
-        <w:rPr>
-          <w:rFonts w:eastAsia="Times New Roman"/>
-          <w:lang w:eastAsia="da-DK"/>
-        </w:rPr>
-        <w:t>h</w:t>
-      </w:r>
-      <w:r>
-        <w:rPr>
-          <w:rFonts w:eastAsia="Times New Roman"/>
-          <w:lang w:eastAsia="da-DK"/>
-        </w:rPr>
-        <w:t>ere there was insufficient information in the title and abstract to judge eligibility w</w:t>
-      </w:r>
-      <w:r>
-        <w:rPr>
-          <w:rFonts w:eastAsia="Times New Roman"/>
-          <w:lang w:eastAsia="da-DK"/>
-        </w:rPr>
-        <w:t>ere</w:t>
-      </w:r>
-      <w:r>
-        <w:rPr>
-          <w:rFonts w:eastAsia="Times New Roman"/>
-          <w:lang w:eastAsia="da-DK"/>
-        </w:rPr>
-        <w:t xml:space="preserve"> retrieved in full text. </w:t>
-      </w:r>
-      <w:bookmarkStart w:id="1" w:name="DATA_EXTRACTION"/>
-      <w:bookmarkEnd w:id="1"/>
-    </w:p>
-    <w:p>
-      <w:pPr>
-        <w:spacing w:before="100" w:beforeAutospacing="1" w:after="100" w:afterAutospacing="1"/>
+        <w:t>T</w:t>
+      </w:r>
+      <w:r>
+        <w:t>.</w:t>
+      </w:r>
+      <w:r>
+        <w:t>D or M</w:t>
+      </w:r>
+      <w:r>
+        <w:t>.</w:t>
+      </w:r>
+      <w:r>
+        <w:t>H</w:t>
+      </w:r>
+      <w:r>
+        <w:t>.</w:t>
+      </w:r>
+      <w:r>
+        <w:t>V. Assessments were conducted at the effect-size level to account for studies contributing multiple outcomes. We primarily assessed risk of bias for the treatment-on-the-treated effect, reflecting our focus on the effect of starting and adhering to the intended intervention.</w:t>
+      </w:r>
+    </w:p>
+    <w:p>
+      <w:pPr>
         <w:jc w:val="both"/>
       </w:pPr>
       <w:r>
-        <w:t xml:space="preserve">Data extraction was done in collaboration between NTD, JSA, JKJ, and MHV, with minor support from two research assistants. All coding and data extraction were done independently by at least two reviewers. Before initiating the final extraction, our extraction scheme was piloted to ensure a standardized use thereof. Throughout the entire process, any extraction disagreements were resolved by NTD and/or MHV. </w:t>
-      </w:r>
-      <w:r>
-        <w:br/>
-      </w:r>
-      <w:r>
-        <w:br/>
-      </w:r>
-      <w:r>
-        <w:t xml:space="preserve">Effect sizes were primarily extracted and calculated by JKJ and MHV, and quality checked by JSA in accordance with the prescribed procedures for ensuring reproducible research in statistics developed by </w:t>
-      </w:r>
-      <w:proofErr w:type="spellStart"/>
-      <w:r>
-        <w:t>Hofner</w:t>
-      </w:r>
-      <w:proofErr w:type="spellEnd"/>
-      <w:r>
-        <w:t xml:space="preserve"> et al.</w:t>
+        <w:t>Randomized and cluster-randomized trials were assessed using Cochrane</w:t>
+      </w:r>
+      <w:r>
+        <w:t>’s</w:t>
+      </w:r>
+      <w:r>
+        <w:t xml:space="preserve"> RoB 2</w:t>
       </w:r>
       <w:r>
         <w:fldChar w:fldCharType="begin"/>
       </w:r>
       <w:r>
-        <w:instrText xml:space="preserve"> ADDIN ZOTERO_ITEM CSL_CITATION {"citationID":"F8edHOmS","properties":{"formattedCitation":"\\super 104\\nosupersub{}","plainCitation":"104","noteIndex":0},"citationItems":[{"id":447,"uris":["http://zotero.org/users/17688719/items/SXA8YCT6"],"itemData":{"id":447,"type":"article-journal","abstract":"Reproducible research (RR) constitutes the idea that a publication should be accompanied by all relevant material to reproduce the results and findings of a scientific work. Hence, results can be verified and researchers are able to build upon these. Efforts of the Biometrical Journal over the last five years have increased the number of manuscripts which are reproducible by a factor of 4 to almost 50%. Yet, more than half of the code submission could not be executed in the initial review due to missing code, missing data or errors in the code. Careful checks of the submitted code as part of the reviewing process are essential to eliminate these issues and to foster RR. In this article, we reviewed n=56 recent submissions of code and data to identify common reproducibility issues. Based on these findings, guidelines for structuring code submission to the Biometrical Journal have been established to help authors. These guidelines should help researchers to implement RR in general. Together with the code reviews, this supports the mission of the Biometrical Journal\nin publishing highest quality, novel and relevant papers on statistical methods and their applications in life sciences. Source code and data to reproduce the presented data analyses are available as Supplementary Material on the journal's web page.","container-title":"Biometrical journal","DOI":"10.1002/bimj.201500156","ISSN":"0323-3847","issue":"2","note":"publisher: Blackwell Publishing Ltd\nCitation Key: Hofner2016\npublisher-place: Germany","page":"416-427","title":"Reproducible research in statistics: A review and guidelines for the Biometrical Journal","volume":"58","author":[{"family":"Hofner","given":"Benjamin"},{"family":"Schmid","given":"Matthias"},{"family":"Edler","given":"Lutz"}],"issued":{"date-parts":[["2016"]]}}}],"schema":"https://github.com/citation-style-language/schema/raw/master/csl-citation.json"} </w:instrText>
+        <w:instrText xml:space="preserve"> ADDIN ZOTERO_ITEM CSL_CITATION {"citationID":"5S8B1elZ","properties":{"formattedCitation":"\\super 96\\nosupersub{}","plainCitation":"96","noteIndex":0},"citationItems":[{"id":831,"uris":["http://zotero.org/users/17688719/items/HQ4MV269"],"itemData":{"id":831,"type":"article-journal","container-title":"BMJ","DOI":"10.1136/bmj.l4898","ISSN":"0959-8138","note":"publisher: British Medical Journal Publishing Group\nCitation Key: Sterne2019","page":"l4898","title":"RoB 2: A revised tool for assessing risk of bias in randomised trials","volume":"366","author":[{"family":"Sterne","given":"Jonathan A C."},{"family":"Savović","given":"Jelena"},{"family":"Page","given":"Matthew J"},{"family":"Elbers","given":"Roy G"},{"family":"Blencowe","given":"Natalie S"},{"family":"Boutron","given":"Isabelle"},{"family":"Cates","given":"Christopher J"},{"family":"Cheng","given":"Hung-Yuan"},{"family":"Corbett","given":"Mark S"},{"family":"Eldridge","given":"Sandra M"}],"issued":{"date-parts":[["2019"]]}}}],"schema":"https://github.com/citation-style-language/schema/raw/master/csl-citation.json"} </w:instrText>
       </w:r>
       <w:r>
         <w:fldChar w:fldCharType="separate"/>
@@ -17808,57 +18672,31 @@
           <w:kern w:val="0"/>
           <w:vertAlign w:val="superscript"/>
         </w:rPr>
-        <w:t>104</w:t>
+        <w:t>96</w:t>
       </w:r>
       <w:r>
         <w:fldChar w:fldCharType="end"/>
       </w:r>
       <w:r>
-        <w:t xml:space="preserve">. All effect size issues were resolved by MHV. </w:t>
-      </w:r>
-    </w:p>
-    <w:p>
-      <w:pPr>
-        <w:pStyle w:val="Heading3"/>
-      </w:pPr>
-      <w:r>
-        <w:t xml:space="preserve">Risk of bias assessment </w:t>
-      </w:r>
-    </w:p>
-    <w:p>
-      <w:pPr>
-        <w:jc w:val="both"/>
-      </w:pPr>
-      <w:r>
-        <w:t>Risk of bias was assessed independently by at least two reviewers, with disagreements resolved by NTD or MHV. Assessments were conducted at the effect-size level to account for studies contributing multiple outcomes. We primarily assessed risk of bias for the treatment-on-the-treated effect, reflecting our focus on the effect of starting and adhering to the intended intervention.</w:t>
-      </w:r>
-    </w:p>
-    <w:p>
-      <w:pPr>
-        <w:jc w:val="both"/>
-      </w:pPr>
-      <w:r>
-        <w:t>Randomized and cluster-randomized trials were assessed using Cochrane</w:t>
-      </w:r>
-      <w:r>
-        <w:t>’s</w:t>
-      </w:r>
-      <w:r>
-        <w:t xml:space="preserve"> </w:t>
-      </w:r>
-      <w:proofErr w:type="spellStart"/>
-      <w:r>
-        <w:t>RoB</w:t>
-      </w:r>
-      <w:proofErr w:type="spellEnd"/>
-      <w:r>
-        <w:t xml:space="preserve"> 2</w:t>
+        <w:t>, covering randomization, deviations from intended interventions, missing data, outcome measurement</w:t>
+      </w:r>
+      <w:r>
+        <w:t>,</w:t>
+      </w:r>
+      <w:r>
+        <w:t xml:space="preserve"> and selective reporting. Non-randomized studies were assessed using</w:t>
+      </w:r>
+      <w:r>
+        <w:t xml:space="preserve"> Cochrane’s</w:t>
+      </w:r>
+      <w:r>
+        <w:t xml:space="preserve"> ROBINS-I</w:t>
       </w:r>
       <w:r>
         <w:fldChar w:fldCharType="begin"/>
       </w:r>
       <w:r>
-        <w:instrText xml:space="preserve"> ADDIN ZOTERO_ITEM CSL_CITATION {"citationID":"5S8B1elZ","properties":{"formattedCitation":"\\super 96\\nosupersub{}","plainCitation":"96","noteIndex":0},"citationItems":[{"id":831,"uris":["http://zotero.org/users/17688719/items/HQ4MV269"],"itemData":{"id":831,"type":"article-journal","container-title":"BMJ","DOI":"10.1136/bmj.l4898","ISSN":"0959-8138","note":"publisher: British Medical Journal Publishing Group\nCitation Key: Sterne2019","page":"l4898","title":"RoB 2: A revised tool for assessing risk of bias in randomised trials","volume":"366","author":[{"family":"Sterne","given":"Jonathan A C."},{"family":"Savović","given":"Jelena"},{"family":"Page","given":"Matthew J"},{"family":"Elbers","given":"Roy G"},{"family":"Blencowe","given":"Natalie S"},{"family":"Boutron","given":"Isabelle"},{"family":"Cates","given":"Christopher J"},{"family":"Cheng","given":"Hung-Yuan"},{"family":"Corbett","given":"Mark S"},{"family":"Eldridge","given":"Sandra M"}],"issued":{"date-parts":[["2019"]]}}}],"schema":"https://github.com/citation-style-language/schema/raw/master/csl-citation.json"} </w:instrText>
+        <w:instrText xml:space="preserve"> ADDIN ZOTERO_ITEM CSL_CITATION {"citationID":"Ngt6D8Vo","properties":{"formattedCitation":"\\super 97\\nosupersub{}","plainCitation":"97","noteIndex":0},"citationItems":[{"id":819,"uris":["http://zotero.org/users/17688719/items/YR4TNR57"],"itemData":{"id":819,"type":"article-journal","abstract":"Non-randomised studies of the effects of interventions are critical to many areas of healthcare evaluation, but their results may be biased. It is therefore important to understand and appraise their strengths and weaknesses. We developed ROBINS-I (“Risk Of Bias In Non-randomised Studies - of Interventions”), a new tool for evaluating risk of bias in estimates of the comparative effectiveness (harm or benefit) of interventions from studies that did not use randomisation to allocate units (individuals or clusters of individuals) to comparison groups. The tool will be particularly useful to those undertaking systematic reviews that include non-randomised studies.Summary pointsNon-randomised studies of the effects of interventions are critical to many areas of healthcare evaluation but are subject to confounding and a range of other potential biasesWe developed, piloted, and refined a new tool, ROBINS-I, to assess “Risk Of Bias In Non-randomised Studies - of Interventions”The tool views each study as an attempt to emulate (mimic) a hypothetical pragmatic randomised trial, and covers seven distinct domains through which bias might be introducedWe use “signalling questions” to help users of ROBINS-I to judge risk of bias within each domainThe judgements within each domain carry forward to an overall risk of bias judgement across bias domains for the outcome being assessedNon-randomised studies of the effects of interventions (NRSI) are critical to many areas of healthcare evaluation. Designs of NRSI that can be used to evaluate the effects of interventions include observational studies such as cohort studies and case-control studies in which intervention groups are allocated during the course of usual treatment decisions, and quasi-randomised studies in which the method of allocation falls short of full randomisation. Non-randomised studies can provide evidence additional to that available from randomised trials about long term outcomes, rare events, adverse effects and populations that are …","container-title":"BMJ","DOI":"10.1136/bmj.i4919","note":"Citation Key: Sterne2016","page":"i4919","title":"ROBINS-I: A tool for assessing risk of bias in non-randomised studies of interventions","volume":"355","author":[{"family":"Sterne","given":"Jonathan A C."},{"family":"Hernán","given":"Miguel A"},{"family":"Reeves","given":"Barnaby C"},{"family":"Savović","given":"Jelena"},{"family":"Berkman","given":"Nancy D"},{"family":"Viswanathan","given":"Meera"},{"family":"Henry","given":"David"},{"family":"Altman","given":"Douglas G"},{"family":"Ansari","given":"Mohammed T"},{"family":"Boutron","given":"Isabelle"},{"family":"Carpenter","given":"James R"},{"family":"Chan","given":"An-Wen"},{"family":"Churchill","given":"Rachel"},{"family":"Deeks","given":"Jonathan J"},{"family":"Hróbjartsson","given":"Asbjørn"},{"family":"Kirkham","given":"Jamie"},{"family":"Jüni","given":"Peter"},{"family":"Loke","given":"Yoon K"},{"family":"Pigott","given":"Therese D."},{"family":"Ramsay","given":"Craig R"},{"family":"Regidor","given":"Deborah"},{"family":"Rothstein","given":"Hannah R."},{"family":"Sandhu","given":"Lakhbir"},{"family":"Santaguida","given":"Pasqualina L"},{"family":"Schünemann","given":"Holger J"},{"family":"Shea","given":"Beverly"},{"family":"Shrier","given":"Ian"},{"family":"Tugwell","given":"Peter"},{"family":"Turner","given":"Lucy"},{"family":"Valentine","given":"Jeffrey C"},{"family":"Waddington","given":"Hugh"},{"family":"Waters","given":"Elizabeth"},{"family":"Wells","given":"George A"},{"family":"Whiting","given":"Penny F"},{"family":"Higgins","given":"Julian P T"}],"issued":{"date-parts":[["2016",10,12]]}}}],"schema":"https://github.com/citation-style-language/schema/raw/master/csl-citation.json"} </w:instrText>
       </w:r>
       <w:r>
         <w:fldChar w:fldCharType="separate"/>
@@ -17869,31 +18707,78 @@
           <w:kern w:val="0"/>
           <w:vertAlign w:val="superscript"/>
         </w:rPr>
-        <w:t>96</w:t>
+        <w:t>97</w:t>
       </w:r>
       <w:r>
         <w:fldChar w:fldCharType="end"/>
       </w:r>
       <w:r>
-        <w:t>, covering randomization, deviations from intended interventions, missing data, outcome measurement</w:t>
+        <w:t>, with particular attention to confounding, participant selection, intervention classification, deviations from intended interventions, missing data, outcome measurement</w:t>
       </w:r>
       <w:r>
         <w:t>,</w:t>
       </w:r>
       <w:r>
-        <w:t xml:space="preserve"> and selective reporting. Non-randomized studies were assessed using</w:t>
-      </w:r>
-      <w:r>
-        <w:t xml:space="preserve"> Cochrane’s</w:t>
-      </w:r>
-      <w:r>
-        <w:t xml:space="preserve"> ROBINS-I</w:t>
+        <w:t xml:space="preserve"> and selective reporting.</w:t>
+      </w:r>
+    </w:p>
+    <w:p>
+      <w:pPr>
+        <w:jc w:val="both"/>
+      </w:pPr>
+      <w:r>
+        <w:t>For non-randomized studies, we assessed whether authors established baseline equivalence or adequately controlled for key confounders, including age, gender, psychiatric diagnosis</w:t>
+      </w:r>
+      <w:r>
+        <w:t>,</w:t>
+      </w:r>
+      <w:r>
+        <w:t xml:space="preserve"> and comorbid social or personal problems. Across tools, studies with four non-low domain judgments were moved to the next overall risk category. </w:t>
+      </w:r>
+      <w:r>
+        <w:t>Following the tool guideline, s</w:t>
+      </w:r>
+      <w:r>
+        <w:t>tudies judged to be at critical risk of bias were excluded from the meta-analysis.</w:t>
+      </w:r>
+      <w:r>
+        <w:tab/>
+      </w:r>
+      <w:r>
+        <w:br/>
+      </w:r>
+    </w:p>
+    <w:p>
+      <w:pPr>
+        <w:pStyle w:val="Heading3"/>
+      </w:pPr>
+      <w:r>
+        <w:lastRenderedPageBreak/>
+        <w:t>Effect size calculation</w:t>
+      </w:r>
+    </w:p>
+    <w:p>
+      <w:pPr>
+        <w:jc w:val="both"/>
+      </w:pPr>
+      <w:r>
+        <w:t xml:space="preserve">Treatment effects were estimated by comparing group-based interventions with eligible control conditions. We used standardized mean differences, calculated as Hedges’ </w:t>
+      </w:r>
+      <w:r>
+        <w:rPr>
+          <w:i/>
+          <w:iCs/>
+        </w:rPr>
+        <w:t>g</w:t>
+      </w:r>
+      <w:r>
+        <w:t>,</w:t>
       </w:r>
       <w:r>
         <w:fldChar w:fldCharType="begin"/>
       </w:r>
       <w:r>
-        <w:instrText xml:space="preserve"> ADDIN ZOTERO_ITEM CSL_CITATION {"citationID":"Ngt6D8Vo","properties":{"formattedCitation":"\\super 97\\nosupersub{}","plainCitation":"97","noteIndex":0},"citationItems":[{"id":819,"uris":["http://zotero.org/users/17688719/items/YR4TNR57"],"itemData":{"id":819,"type":"article-journal","abstract":"Non-randomised studies of the effects of interventions are critical to many areas of healthcare evaluation, but their results may be biased. It is therefore important to understand and appraise their strengths and weaknesses. We developed ROBINS-I (“Risk Of Bias In Non-randomised Studies - of Interventions”), a new tool for evaluating risk of bias in estimates of the comparative effectiveness (harm or benefit) of interventions from studies that did not use randomisation to allocate units (individuals or clusters of individuals) to comparison groups. The tool will be particularly useful to those undertaking systematic reviews that include non-randomised studies.Summary pointsNon-randomised studies of the effects of interventions are critical to many areas of healthcare evaluation but are subject to confounding and a range of other potential biasesWe developed, piloted, and refined a new tool, ROBINS-I, to assess “Risk Of Bias In Non-randomised Studies - of Interventions”The tool views each study as an attempt to emulate (mimic) a hypothetical pragmatic randomised trial, and covers seven distinct domains through which bias might be introducedWe use “signalling questions” to help users of ROBINS-I to judge risk of bias within each domainThe judgements within each domain carry forward to an overall risk of bias judgement across bias domains for the outcome being assessedNon-randomised studies of the effects of interventions (NRSI) are critical to many areas of healthcare evaluation. Designs of NRSI that can be used to evaluate the effects of interventions include observational studies such as cohort studies and case-control studies in which intervention groups are allocated during the course of usual treatment decisions, and quasi-randomised studies in which the method of allocation falls short of full randomisation. Non-randomised studies can provide evidence additional to that available from randomised trials about long term outcomes, rare events, adverse effects and populations that are …","container-title":"BMJ","DOI":"10.1136/bmj.i4919","note":"Citation Key: Sterne2016","page":"i4919","title":"ROBINS-I: A tool for assessing risk of bias in non-randomised studies of interventions","volume":"355","author":[{"family":"Sterne","given":"Jonathan A C."},{"family":"Hernán","given":"Miguel A"},{"family":"Reeves","given":"Barnaby C"},{"family":"Savović","given":"Jelena"},{"family":"Berkman","given":"Nancy D"},{"family":"Viswanathan","given":"Meera"},{"family":"Henry","given":"David"},{"family":"Altman","given":"Douglas G"},{"family":"Ansari","given":"Mohammed T"},{"family":"Boutron","given":"Isabelle"},{"family":"Carpenter","given":"James R"},{"family":"Chan","given":"An-Wen"},{"family":"Churchill","given":"Rachel"},{"family":"Deeks","given":"Jonathan J"},{"family":"Hróbjartsson","given":"Asbjørn"},{"family":"Kirkham","given":"Jamie"},{"family":"Jüni","given":"Peter"},{"family":"Loke","given":"Yoon K"},{"family":"Pigott","given":"Therese D."},{"family":"Ramsay","given":"Craig R"},{"family":"Regidor","given":"Deborah"},{"family":"Rothstein","given":"Hannah R."},{"family":"Sandhu","given":"Lakhbir"},{"family":"Santaguida","given":"Pasqualina L"},{"family":"Schünemann","given":"Holger J"},{"family":"Shea","given":"Beverly"},{"family":"Shrier","given":"Ian"},{"family":"Tugwell","given":"Peter"},{"family":"Turner","given":"Lucy"},{"family":"Valentine","given":"Jeffrey C"},{"family":"Waddington","given":"Hugh"},{"family":"Waters","given":"Elizabeth"},{"family":"Wells","given":"George A"},{"family":"Whiting","given":"Penny F"},{"family":"Higgins","given":"Julian P T"}],"issued":{"date-parts":[["2016",10,12]]}}}],"schema":"https://github.com/citation-style-language/schema/raw/master/csl-citation.json"} </w:instrText>
+        <w:instrText xml:space="preserve"> ADDIN ZOTERO_ITEM CSL_CITATION {"citationID":"7yJlh90X","properties":{"formattedCitation":"\\super 105\\uc0\\u8211{}109\\nosupersub{}","plainCitation":"105–109","noteIndex":0},"citationItems":[{"id":851,"uris":["http://zotero.org/users/17688719/items/4LPAEKIF"],"itemData":{"id":851,"type":"webpage","note":"Citation Key: Pustejovsky2016smd","title":"Alternative formulas for the standardized mean difference","URL":"https://www.jepusto.com/alternative-formulas-for-the-smd/","author":[{"family":"Pustejovsky","given":"James E."}],"issued":{"date-parts":[["2016"]]}}},{"id":67,"uris":["http://zotero.org/users/17688719/items/MEQ2V2F4"],"itemData":{"id":67,"type":"document","note":"Citation Key: WWC_clusterbias","publisher":"Institute of Education Sciences","title":"Supplement document for Appendix E and the What Works Clearinghouse procedures handbook, version 4.1","author":[{"literal":"WWC"}],"issued":{"date-parts":[["2021"]]}}},{"id":1073,"uris":["http://zotero.org/users/17688719/items/N6T68UC9"],"itemData":{"id":1073,"type":"article-journal","container-title":"Journal of Educational Statistics","DOI":"10.2307/1164588","ISSN":"0362-9791","issue":"2","note":"publisher: Sage Publications Sage CA: Thousand Oaks, CA\nCitation Key: Hedges1981","page":"107-128","title":"Distribution theory for Glass's estimator of effect size and related estimators","volume":"6","author":[{"family":"Hedges","given":"Larry V."}],"issued":{"date-parts":[["1981"]]}}},{"id":133,"uris":["http://zotero.org/users/17688719/items/C9HX3H6V"],"itemData":{"id":133,"type":"article-journal","note":"publisher: George Mason University\nCitation Key: Wilson2016","title":"Formulas used by the \"Practical Meta-Analysis Effect Size Calculator\"","author":[{"family":"Wilson","given":"David B"}],"issued":{"date-parts":[["2016"]]}}},{"id":24,"uris":["http://zotero.org/users/17688719/items/59FBWAXB"],"itemData":{"id":24,"type":"chapter","container-title":"The handbook of research synthesis and meta-analysis","note":"Citation Key: Borenstein2019","page":"207-242","publisher":"Russell Sage Foundation West Sussex","title":"Effect sizes for meta-analysis","author":[{"family":"Borenstein","given":"Micahel"},{"family":"Hedges","given":"Larry V."}],"editor":[{"family":"Cooper","given":"Harris"},{"family":"Hedges","given":"Larry V."},{"family":"Valentine","given":"Jeffrey C."}],"issued":{"date-parts":[["2019"]]}}}],"schema":"https://github.com/citation-style-language/schema/raw/master/csl-citation.json"} </w:instrText>
       </w:r>
       <w:r>
         <w:fldChar w:fldCharType="separate"/>
@@ -17904,19 +18789,13 @@
           <w:kern w:val="0"/>
           <w:vertAlign w:val="superscript"/>
         </w:rPr>
-        <w:t>97</w:t>
+        <w:t>105–109</w:t>
       </w:r>
       <w:r>
         <w:fldChar w:fldCharType="end"/>
       </w:r>
       <w:r>
-        <w:t>, with particular attention to confounding, participant selection, intervention classification, deviations from intended interventions, missing data, outcome measurement</w:t>
-      </w:r>
-      <w:r>
-        <w:t>,</w:t>
-      </w:r>
-      <w:r>
-        <w:t xml:space="preserve"> and selective reporting.</w:t>
+        <w:t xml:space="preserve"> and coded all effects so that positive values favored group-based interventions. Odds ratios were calculated for one study only and were not analyzed further.</w:t>
       </w:r>
     </w:p>
     <w:p>
@@ -17924,58 +18803,13 @@
         <w:jc w:val="both"/>
       </w:pPr>
       <w:r>
-        <w:t>For non-randomized studies, we assessed whether authors established baseline equivalence or adequately controlled for key confounders, including age, gender, psychiatric diagnosis</w:t>
-      </w:r>
-      <w:r>
-        <w:t>,</w:t>
-      </w:r>
-      <w:r>
-        <w:t xml:space="preserve"> and comorbid social or personal problems. Across tools, studies with four non-low domain judgments were moved to the next overall risk category. </w:t>
-      </w:r>
-      <w:r>
-        <w:t>Following the tool guideline, s</w:t>
-      </w:r>
-      <w:r>
-        <w:t>tudies judged to be at critical risk of bias were excluded from the meta-analysis.</w:t>
-      </w:r>
-      <w:r>
-        <w:tab/>
-      </w:r>
-      <w:r>
-        <w:br/>
-      </w:r>
-    </w:p>
-    <w:p>
-      <w:pPr>
-        <w:pStyle w:val="Heading3"/>
-      </w:pPr>
-      <w:r>
-        <w:lastRenderedPageBreak/>
-        <w:t>Effect size calculation</w:t>
-      </w:r>
-    </w:p>
-    <w:p>
-      <w:pPr>
-        <w:jc w:val="both"/>
-      </w:pPr>
-      <w:r>
-        <w:t xml:space="preserve">Treatment effects were estimated by comparing group-based interventions with eligible control conditions. We used standardized mean differences, calculated as Hedges’ </w:t>
-      </w:r>
-      <w:r>
-        <w:rPr>
-          <w:i/>
-          <w:iCs/>
-        </w:rPr>
-        <w:t>g</w:t>
-      </w:r>
-      <w:r>
-        <w:t>,</w:t>
+        <w:t>For all but one study</w:t>
       </w:r>
       <w:r>
         <w:fldChar w:fldCharType="begin"/>
       </w:r>
       <w:r>
-        <w:instrText xml:space="preserve"> ADDIN ZOTERO_ITEM CSL_CITATION {"citationID":"7yJlh90X","properties":{"formattedCitation":"\\super 105\\uc0\\u8211{}109\\nosupersub{}","plainCitation":"105–109","noteIndex":0},"citationItems":[{"id":851,"uris":["http://zotero.org/users/17688719/items/4LPAEKIF"],"itemData":{"id":851,"type":"webpage","note":"Citation Key: Pustejovsky2016smd","title":"Alternative formulas for the standardized mean difference","URL":"https://www.jepusto.com/alternative-formulas-for-the-smd/","author":[{"family":"Pustejovsky","given":"James E."}],"issued":{"date-parts":[["2016"]]}}},{"id":67,"uris":["http://zotero.org/users/17688719/items/MEQ2V2F4"],"itemData":{"id":67,"type":"document","note":"Citation Key: WWC_clusterbias","publisher":"Institute of Education Sciences","title":"Supplement document for Appendix E and the What Works Clearinghouse procedures handbook, version 4.1","author":[{"literal":"WWC"}],"issued":{"date-parts":[["2021"]]}}},{"id":1073,"uris":["http://zotero.org/users/17688719/items/N6T68UC9"],"itemData":{"id":1073,"type":"article-journal","container-title":"Journal of Educational Statistics","DOI":"10.2307/1164588","ISSN":"0362-9791","issue":"2","note":"publisher: Sage Publications Sage CA: Thousand Oaks, CA\nCitation Key: Hedges1981","page":"107-128","title":"Distribution theory for Glass's estimator of effect size and related estimators","volume":"6","author":[{"family":"Hedges","given":"Larry V."}],"issued":{"date-parts":[["1981"]]}}},{"id":133,"uris":["http://zotero.org/users/17688719/items/C9HX3H6V"],"itemData":{"id":133,"type":"article-journal","note":"publisher: George Mason University\nCitation Key: Wilson2016","title":"Formulas used by the \"Practical Meta-Analysis Effect Size Calculator\"","author":[{"family":"Wilson","given":"David B"}],"issued":{"date-parts":[["2016"]]}}},{"id":24,"uris":["http://zotero.org/users/17688719/items/59FBWAXB"],"itemData":{"id":24,"type":"chapter","container-title":"The handbook of research synthesis and meta-analysis","note":"Citation Key: Borenstein2019","page":"207-242","publisher":"Russell Sage Foundation West Sussex","title":"Effect sizes for meta-analysis","author":[{"family":"Borenstein","given":"Micahel"},{"family":"Hedges","given":"Larry V."}],"editor":[{"family":"Cooper","given":"Harris"},{"family":"Hedges","given":"Larry V."},{"family":"Valentine","given":"Jeffrey C."}],"issued":{"date-parts":[["2019"]]}}}],"schema":"https://github.com/citation-style-language/schema/raw/master/csl-citation.json"} </w:instrText>
+        <w:instrText xml:space="preserve"> ADDIN ZOTERO_ITEM CSL_CITATION {"citationID":"a1rkmk02beb","properties":{"formattedCitation":"\\super 83\\nosupersub{}","plainCitation":"83","noteIndex":0},"citationItems":[{"id":1174,"uris":["http://zotero.org/users/17688719/items/XWUVDG45"],"itemData":{"id":1174,"type":"article-journal","container-title":"Psychiatric Services","DOI":"10.1176/appi.ps.201400510","ISSN":"1075-2730","issue":"10","note":"publisher: Am Psychiatric Assoc\nCitation Key: Bond2015","page":"1027-1034","title":"A controlled trial of supported employment for people with severe mental illness and justice involvement","volume":"66","author":[{"family":"Bond","given":"Gary R"},{"family":"Kim","given":"Sunny Jung"},{"family":"Becker","given":"Deborah R"},{"family":"Swanson","given":"Sarah J"},{"family":"Drake","given":"Robert E"},{"family":"Krzos","given":"Izabela M"},{"family":"Fraser","given":"Virginia V"},{"family":"O'Neill","given":"Sheila"},{"family":"Frounfelker","given":"Rochelle L"}],"issued":{"date-parts":[["2015"]]}}}],"schema":"https://github.com/citation-style-language/schema/raw/master/csl-citation.json"} </w:instrText>
       </w:r>
       <w:r>
         <w:fldChar w:fldCharType="separate"/>
@@ -17986,27 +18820,28 @@
           <w:kern w:val="0"/>
           <w:vertAlign w:val="superscript"/>
         </w:rPr>
-        <w:t>105–109</w:t>
+        <w:t>83</w:t>
       </w:r>
       <w:r>
         <w:fldChar w:fldCharType="end"/>
       </w:r>
       <w:r>
-        <w:t xml:space="preserve"> and coded all effects so that positive values favored group-based interventions. Odds ratios were calculated for one study only and were not analyzed further.</w:t>
-      </w:r>
-    </w:p>
-    <w:p>
-      <w:pPr>
-        <w:jc w:val="both"/>
-      </w:pPr>
-      <w:r>
-        <w:t>For all but one study</w:t>
+        <w:t>,</w:t>
+      </w:r>
+      <w:r>
+        <w:t xml:space="preserve"> effect</w:t>
+      </w:r>
+      <w:r>
+        <w:t xml:space="preserve"> sizes</w:t>
+      </w:r>
+      <w:r>
+        <w:t xml:space="preserve"> were baseline- or covariate-adjusted to improve precision and internal validity.</w:t>
       </w:r>
       <w:r>
         <w:fldChar w:fldCharType="begin"/>
       </w:r>
       <w:r>
-        <w:instrText xml:space="preserve"> ADDIN ZOTERO_ITEM CSL_CITATION {"citationID":"a1rkmk02beb","properties":{"formattedCitation":"\\super 83\\nosupersub{}","plainCitation":"83","noteIndex":0},"citationItems":[{"id":1174,"uris":["http://zotero.org/users/17688719/items/XWUVDG45"],"itemData":{"id":1174,"type":"article-journal","container-title":"Psychiatric Services","DOI":"10.1176/appi.ps.201400510","ISSN":"1075-2730","issue":"10","note":"publisher: Am Psychiatric Assoc\nCitation Key: Bond2015","page":"1027-1034","title":"A controlled trial of supported employment for people with severe mental illness and justice involvement","volume":"66","author":[{"family":"Bond","given":"Gary R"},{"family":"Kim","given":"Sunny Jung"},{"family":"Becker","given":"Deborah R"},{"family":"Swanson","given":"Sarah J"},{"family":"Drake","given":"Robert E"},{"family":"Krzos","given":"Izabela M"},{"family":"Fraser","given":"Virginia V"},{"family":"O'Neill","given":"Sheila"},{"family":"Frounfelker","given":"Rochelle L"}],"issued":{"date-parts":[["2015"]]}}}],"schema":"https://github.com/citation-style-language/schema/raw/master/csl-citation.json"} </w:instrText>
+        <w:instrText xml:space="preserve"> ADDIN ZOTERO_ITEM CSL_CITATION {"citationID":"a5i0gld5eg","properties":{"formattedCitation":"\\super 110\\nosupersub{}","plainCitation":"110","noteIndex":0},"citationItems":[{"id":1197,"uris":["http://zotero.org/users/17688719/items/QBJEZAES"],"itemData":{"id":1197,"type":"article-journal","abstract":"Abstract It is common practice in both randomized and quasi-experiments to adjust for baseline characteristics when estimating the average effect of an intervention. The inclusion of a pre-test, for example, can reduce both the standard error of this estimate and?in non-randomized designs?its bias. At the same time, it is also standard to report the effect of an intervention in standardized effect size units, thereby making it comparable to other interventions and studies. Curiously, the estimation of this effect size, including covariate adjustment, has received little attention. In this article, we provide a framework for defining effect sizes in designs with a pre-test (e.g., difference-in-differences and analysis of covariance) and propose estimators of those effect sizes. The estimators and approximations to their sampling distributions are evaluated using a simulation study and then demonstrated using an example from published data.","container-title":"British Journal of Mathematical and Statistical Psychology","DOI":"10.1111/bmsp.12296","ISSN":"0007-1102","issue":"2","note":"publisher: John Wiley &amp; Sons, Ltd\nCitation Key: Hedges2023_es_ancova","page":"259-282","title":"Effect sizes in ANCOVA and difference-in-differences designs","volume":"76","author":[{"family":"Hedges","given":"Larry V."},{"family":"Tipton","given":"Elizabeth"},{"family":"Zejnullahi","given":"Rrita"},{"family":"Diaz","given":"Karina G"}],"issued":{"date-parts":[["2023",1,2]]}}}],"schema":"https://github.com/citation-style-language/schema/raw/master/csl-citation.json"} </w:instrText>
       </w:r>
       <w:r>
         <w:fldChar w:fldCharType="separate"/>
@@ -18017,28 +18852,19 @@
           <w:kern w:val="0"/>
           <w:vertAlign w:val="superscript"/>
         </w:rPr>
-        <w:t>83</w:t>
+        <w:t>110</w:t>
       </w:r>
       <w:r>
         <w:fldChar w:fldCharType="end"/>
       </w:r>
       <w:r>
-        <w:t>,</w:t>
-      </w:r>
-      <w:r>
-        <w:t xml:space="preserve"> effect</w:t>
-      </w:r>
-      <w:r>
-        <w:t xml:space="preserve"> sizes</w:t>
-      </w:r>
-      <w:r>
-        <w:t xml:space="preserve"> were baseline- or covariate-adjusted to improve precision and internal validity.</w:t>
+        <w:t xml:space="preserve"> Where studies reported results for non-prespecified subgroups, these were aggregated to reduce artificial within-study variation.</w:t>
       </w:r>
       <w:r>
         <w:fldChar w:fldCharType="begin"/>
       </w:r>
       <w:r>
-        <w:instrText xml:space="preserve"> ADDIN ZOTERO_ITEM CSL_CITATION {"citationID":"a5i0gld5eg","properties":{"formattedCitation":"\\super 110\\nosupersub{}","plainCitation":"110","noteIndex":0},"citationItems":[{"id":1197,"uris":["http://zotero.org/users/17688719/items/QBJEZAES"],"itemData":{"id":1197,"type":"article-journal","abstract":"Abstract It is common practice in both randomized and quasi-experiments to adjust for baseline characteristics when estimating the average effect of an intervention. The inclusion of a pre-test, for example, can reduce both the standard error of this estimate and?in non-randomized designs?its bias. At the same time, it is also standard to report the effect of an intervention in standardized effect size units, thereby making it comparable to other interventions and studies. Curiously, the estimation of this effect size, including covariate adjustment, has received little attention. In this article, we provide a framework for defining effect sizes in designs with a pre-test (e.g., difference-in-differences and analysis of covariance) and propose estimators of those effect sizes. The estimators and approximations to their sampling distributions are evaluated using a simulation study and then demonstrated using an example from published data.","container-title":"British Journal of Mathematical and Statistical Psychology","DOI":"10.1111/bmsp.12296","ISSN":"0007-1102","issue":"2","note":"publisher: John Wiley &amp; Sons, Ltd\nCitation Key: Hedges2023_es_ancova","page":"259-282","title":"Effect sizes in ANCOVA and difference-in-differences designs","volume":"76","author":[{"family":"Hedges","given":"Larry V."},{"family":"Tipton","given":"Elizabeth"},{"family":"Zejnullahi","given":"Rrita"},{"family":"Diaz","given":"Karina G"}],"issued":{"date-parts":[["2023",1,2]]}}}],"schema":"https://github.com/citation-style-language/schema/raw/master/csl-citation.json"} </w:instrText>
+        <w:instrText xml:space="preserve"> ADDIN ZOTERO_ITEM CSL_CITATION {"citationID":"SJWnMFff","properties":{"formattedCitation":"\\super 111\\nosupersub{}","plainCitation":"111","noteIndex":0},"citationItems":[{"id":1130,"uris":["http://zotero.org/users/17688719/items/NLIE79MS"],"itemData":{"id":1130,"type":"article-journal","abstract":"Abstract Sample size and statistical power are important factors to consider when planning a research synthesis. Power analysis methods have been developed for fixed effect or random effects models, but until recently these methods were limited to simple data structures with a single, independent effect per study. Recent work has provided power approximation formulas for meta-analyses involving studies with multiple, dependent effect size estimates, which are common in syntheses of social science research. Prior work focused on developing and validating the approximations but did not address the practice challenges encountered in applying them for purposes of planning a synthesis involving dependent effect sizes. We aim to facilitate the application of these recent developments by providing practical guidance on how to conduct power analysis for planning a meta-analysis of dependent effect sizes and by introducing a new R package, POMADE, designed for this purpose. We present a comprehensive overview of resources for finding information about the study design features and model parameters needed to conduct power analysis, along with detailed worked examples using the POMADE package. For presenting power analysis findings, we emphasize graphical tools that can depict power under a range of plausible assumptions and introduce a novel plot, the traffic light power plot, for conveying the degree of certainty in one's assumptions.","container-title":"Research Synthesis Methods","DOI":"https://doi.org/10.1002/jrsm.1752","ISSN":"1759-2879","issue":"6","note":"publisher: John Wiley &amp; Sons, Ltd","page":"1214-1230","title":"Conducting power analysis for meta-analysis with dependent effect sizes: Common guidelines and an introduction to the POMADE R package","volume":"15","author":[{"family":"Vembye","given":"Mikkel Helding"},{"family":"Pustejovsky","given":"James Eric"},{"family":"Pigott","given":"Therese Deocampo"}],"issued":{"date-parts":[["2024",11,1]]}}}],"schema":"https://github.com/citation-style-language/schema/raw/master/csl-citation.json"} </w:instrText>
       </w:r>
       <w:r>
         <w:fldChar w:fldCharType="separate"/>
@@ -18049,19 +18875,19 @@
           <w:kern w:val="0"/>
           <w:vertAlign w:val="superscript"/>
         </w:rPr>
-        <w:t>110</w:t>
+        <w:t>111</w:t>
       </w:r>
       <w:r>
         <w:fldChar w:fldCharType="end"/>
       </w:r>
       <w:r>
-        <w:t xml:space="preserve"> Where studies reported results for non-prespecified subgroups, these were aggregated to reduce artificial within-study variation.</w:t>
+        <w:t xml:space="preserve"> When more than five studies reported effects using the same scale, we computed the population-based standard deviation obtained from the control group</w:t>
       </w:r>
       <w:r>
         <w:fldChar w:fldCharType="begin"/>
       </w:r>
       <w:r>
-        <w:instrText xml:space="preserve"> ADDIN ZOTERO_ITEM CSL_CITATION {"citationID":"SJWnMFff","properties":{"formattedCitation":"\\super 111\\nosupersub{}","plainCitation":"111","noteIndex":0},"citationItems":[{"id":1130,"uris":["http://zotero.org/users/17688719/items/NLIE79MS"],"itemData":{"id":1130,"type":"article-journal","abstract":"Abstract Sample size and statistical power are important factors to consider when planning a research synthesis. Power analysis methods have been developed for fixed effect or random effects models, but until recently these methods were limited to simple data structures with a single, independent effect per study. Recent work has provided power approximation formulas for meta-analyses involving studies with multiple, dependent effect size estimates, which are common in syntheses of social science research. Prior work focused on developing and validating the approximations but did not address the practice challenges encountered in applying them for purposes of planning a synthesis involving dependent effect sizes. We aim to facilitate the application of these recent developments by providing practical guidance on how to conduct power analysis for planning a meta-analysis of dependent effect sizes and by introducing a new R package, POMADE, designed for this purpose. We present a comprehensive overview of resources for finding information about the study design features and model parameters needed to conduct power analysis, along with detailed worked examples using the POMADE package. For presenting power analysis findings, we emphasize graphical tools that can depict power under a range of plausible assumptions and introduce a novel plot, the traffic light power plot, for conveying the degree of certainty in one's assumptions.","container-title":"Research Synthesis Methods","DOI":"https://doi.org/10.1002/jrsm.1752","ISSN":"1759-2879","issue":"6","note":"publisher: John Wiley &amp; Sons, Ltd","page":"1214-1230","title":"Conducting power analysis for meta-analysis with dependent effect sizes: Common guidelines and an introduction to the POMADE R package","volume":"15","author":[{"family":"Vembye","given":"Mikkel Helding"},{"family":"Pustejovsky","given":"James Eric"},{"family":"Pigott","given":"Therese Deocampo"}],"issued":{"date-parts":[["2024",11,1]]}}}],"schema":"https://github.com/citation-style-language/schema/raw/master/csl-citation.json"} </w:instrText>
+        <w:instrText xml:space="preserve"> ADDIN ZOTERO_ITEM CSL_CITATION {"citationID":"nd7uzoa5","properties":{"formattedCitation":"\\super 112\\nosupersub{}","plainCitation":"112","noteIndex":0},"citationItems":[{"id":1214,"uris":["http://zotero.org/users/17688719/items/D6PRGF4G"],"itemData":{"id":1214,"type":"article-journal","abstract":"This article presents methods for using extant data to improve the properties of estimators of the standardized mean difference (SMD) effect size. Because samples recruited into education research studies are often more homogeneous than the populations of policy interest, the variation in educational outcomes can be smaller in these samples than is reflective of the true variation in the population. This affects effect size estimation since the sample standard deviation is used in the denominator of the SMD. We propose leveraging extant data on sample variance estimates from multiple studies, made available via clearinghouse databases such as the What Works Clearinghouse, to standardize a mean difference. This allows effect sizes to be benchmarked across a common and broad population, thus enabling better comparability across studies and interventions. We derive the new estimators of the population variance and the corresponding SMD, which pool sample variances from multiple studies using both an analysis of variance and a meta-analytic framework. We demonstrate the properties of these estimators via analytic and simulation results and offer recommendations for when these estimators are appropriate in practice.","container-title":"Journal of Educational and Behavioral Statistics","DOI":"10.3102/10769986241238478","ISSN":"1076-9986","issue":"1","journalAbbreviation":"Journal of Educational and Behavioral Statistics","note":"publisher: American Educational Research Association\nCitation Key: Fitzgerald2024","page":"128-148","title":"Using Extant Data to Improve Estimation of the Standardized Mean Difference","volume":"50","author":[{"family":"Fitzgerald","given":"Kaitlyn G"},{"family":"Tipton","given":"Elizabeth"}],"issued":{"date-parts":[["2025"]]}}}],"schema":"https://github.com/citation-style-language/schema/raw/master/csl-citation.json"} </w:instrText>
       </w:r>
       <w:r>
         <w:fldChar w:fldCharType="separate"/>
@@ -18072,19 +18898,27 @@
           <w:kern w:val="0"/>
           <w:vertAlign w:val="superscript"/>
         </w:rPr>
-        <w:t>111</w:t>
+        <w:t>112</w:t>
       </w:r>
       <w:r>
         <w:fldChar w:fldCharType="end"/>
       </w:r>
       <w:r>
-        <w:t xml:space="preserve"> When more than five studies reported effects using the same scale, we computed the population-based standard deviation obtained from the control group</w:t>
+        <w:t xml:space="preserve"> to increase the generalizability. </w:t>
+      </w:r>
+    </w:p>
+    <w:p>
+      <w:pPr>
+        <w:jc w:val="both"/>
+      </w:pPr>
+      <w:r>
+        <w:t>Because group-based interventions create dependence among participants treated in the same group, we adjusted effect sizes and variances for partial clustering in the intervention arm.</w:t>
       </w:r>
       <w:r>
         <w:fldChar w:fldCharType="begin"/>
       </w:r>
       <w:r>
-        <w:instrText xml:space="preserve"> ADDIN ZOTERO_ITEM CSL_CITATION {"citationID":"nd7uzoa5","properties":{"formattedCitation":"\\super 112\\nosupersub{}","plainCitation":"112","noteIndex":0},"citationItems":[{"id":1214,"uris":["http://zotero.org/users/17688719/items/D6PRGF4G"],"itemData":{"id":1214,"type":"article-journal","abstract":"This article presents methods for using extant data to improve the properties of estimators of the standardized mean difference (SMD) effect size. Because samples recruited into education research studies are often more homogeneous than the populations of policy interest, the variation in educational outcomes can be smaller in these samples than is reflective of the true variation in the population. This affects effect size estimation since the sample standard deviation is used in the denominator of the SMD. We propose leveraging extant data on sample variance estimates from multiple studies, made available via clearinghouse databases such as the What Works Clearinghouse, to standardize a mean difference. This allows effect sizes to be benchmarked across a common and broad population, thus enabling better comparability across studies and interventions. We derive the new estimators of the population variance and the corresponding SMD, which pool sample variances from multiple studies using both an analysis of variance and a meta-analytic framework. We demonstrate the properties of these estimators via analytic and simulation results and offer recommendations for when these estimators are appropriate in practice.","container-title":"Journal of Educational and Behavioral Statistics","DOI":"10.3102/10769986241238478","ISSN":"1076-9986","issue":"1","journalAbbreviation":"Journal of Educational and Behavioral Statistics","note":"publisher: American Educational Research Association\nCitation Key: Fitzgerald2024","page":"128-148","title":"Using Extant Data to Improve Estimation of the Standardized Mean Difference","volume":"50","author":[{"family":"Fitzgerald","given":"Kaitlyn G"},{"family":"Tipton","given":"Elizabeth"}],"issued":{"date-parts":[["2025"]]}}}],"schema":"https://github.com/citation-style-language/schema/raw/master/csl-citation.json"} </w:instrText>
+        <w:instrText xml:space="preserve"> ADDIN ZOTERO_ITEM CSL_CITATION {"citationID":"KaS0y0fV","properties":{"formattedCitation":"\\super 113\\nosupersub{}","plainCitation":"113","noteIndex":0},"citationItems":[{"id":90,"uris":["http://zotero.org/users/17688719/items/3EBDM8D2"],"itemData":{"id":90,"type":"article-journal","abstract":"Some experimental designs involve clustering within only one treatment group. Such designs may involve group tutoring, therapy administered by multiple therapists, or interventions administered by clinics for the treatment group, whereas the control group receives no treatment. In such cases, the data analysis often proceeds as if there were no clustering within the treatment group. A consequence is that the actual significance level of the treatment effects is larger (i.e., actual p values are larger) than nominal. Additionally, biases will be introduced in estimates of the effect sizes and their variances, leading to inflated effects and underestimated variances when clustering in the treatment group is not taken into account. These consequences of clustering can seriously compromise the interpretation of study results. This article shows how information on the intraclass correlation can be used to obtain a correction for biases in the effect sizes and their variances, and also to obtain an adjustment to the significance test for the effects of clustering.","container-title":"Behavior Research Methods","DOI":"10.3758/s13428-014-0538-z","ISSN":"1554-3528","issue":"4","note":"Citation Key: Hedges2015_onetreatcluster","page":"1295-1308","title":"Estimating effect size when there is clustering in one treatment group","volume":"47","author":[{"family":"Hedges","given":"Larry V."},{"family":"Citkowicz","given":"Martyna"}],"issued":{"date-parts":[["2015"]]}}}],"schema":"https://github.com/citation-style-language/schema/raw/master/csl-citation.json"} </w:instrText>
       </w:r>
       <w:r>
         <w:fldChar w:fldCharType="separate"/>
@@ -18095,49 +18929,18 @@
           <w:kern w:val="0"/>
           <w:vertAlign w:val="superscript"/>
         </w:rPr>
-        <w:t>112</w:t>
+        <w:t>113</w:t>
       </w:r>
       <w:r>
         <w:fldChar w:fldCharType="end"/>
       </w:r>
       <w:r>
-        <w:t xml:space="preserve"> to increase the generalizability. </w:t>
-      </w:r>
-    </w:p>
-    <w:p>
-      <w:pPr>
-        <w:jc w:val="both"/>
-      </w:pPr>
-      <w:r>
-        <w:t>Because group-based interventions create dependence among participants treated in the same group, we adjusted effect sizes and variances for partial clustering in the intervention arm.</w:t>
-      </w:r>
-      <w:r>
-        <w:fldChar w:fldCharType="begin"/>
-      </w:r>
-      <w:r>
-        <w:instrText xml:space="preserve"> ADDIN ZOTERO_ITEM CSL_CITATION {"citationID":"KaS0y0fV","properties":{"formattedCitation":"\\super 113\\nosupersub{}","plainCitation":"113","noteIndex":0},"citationItems":[{"id":90,"uris":["http://zotero.org/users/17688719/items/3EBDM8D2"],"itemData":{"id":90,"type":"article-journal","abstract":"Some experimental designs involve clustering within only one treatment group. Such designs may involve group tutoring, therapy administered by multiple therapists, or interventions administered by clinics for the treatment group, whereas the control group receives no treatment. In such cases, the data analysis often proceeds as if there were no clustering within the treatment group. A consequence is that the actual significance level of the treatment effects is larger (i.e., actual p values are larger) than nominal. Additionally, biases will be introduced in estimates of the effect sizes and their variances, leading to inflated effects and underestimated variances when clustering in the treatment group is not taken into account. These consequences of clustering can seriously compromise the interpretation of study results. This article shows how information on the intraclass correlation can be used to obtain a correction for biases in the effect sizes and their variances, and also to obtain an adjustment to the significance test for the effects of clustering.","container-title":"Behavior Research Methods","DOI":"10.3758/s13428-014-0538-z","ISSN":"1554-3528","issue":"4","note":"Citation Key: Hedges2015_onetreatcluster","page":"1295-1308","title":"Estimating effect size when there is clustering in one treatment group","volume":"47","author":[{"family":"Hedges","given":"Larry V."},{"family":"Citkowicz","given":"Martyna"}],"issued":{"date-parts":[["2015"]]}}}],"schema":"https://github.com/citation-style-language/schema/raw/master/csl-citation.json"} </w:instrText>
-      </w:r>
-      <w:r>
-        <w:fldChar w:fldCharType="separate"/>
-      </w:r>
-      <w:r>
-        <w:rPr>
-          <w:rFonts w:cs="Times New Roman"/>
-          <w:kern w:val="0"/>
-          <w:vertAlign w:val="superscript"/>
-        </w:rPr>
-        <w:t>113</w:t>
-      </w:r>
-      <w:r>
-        <w:fldChar w:fldCharType="end"/>
-      </w:r>
-      <w:r>
         <w:t xml:space="preserve"> When intraclass correlations were not reported, we imputed an ICC of 0.10 in the main analyses and tested alternative values in sensitivity analyses. </w:t>
       </w:r>
       <w:r>
         <w:t xml:space="preserve">All formulas behind this calculation can be found at </w:t>
       </w:r>
-      <w:hyperlink r:id="rId14" w:history="1">
+      <w:hyperlink r:id="rId15" w:history="1">
         <w:r>
           <w:rPr>
             <w:rStyle w:val="Hyperlink"/>
@@ -18750,66 +19553,6 @@
       <w:r>
         <w:t xml:space="preserve"> behind this study can be found at </w:t>
       </w:r>
-      <w:hyperlink r:id="rId15" w:history="1">
-        <w:r>
-          <w:rPr>
-            <w:rStyle w:val="Hyperlink"/>
-          </w:rPr>
-          <w:t>https://osf.io/s2j9a</w:t>
-        </w:r>
-      </w:hyperlink>
-      <w:r>
-        <w:t>. This includes search string</w:t>
-      </w:r>
-      <w:r>
-        <w:t xml:space="preserve"> examples</w:t>
-      </w:r>
-      <w:r>
-        <w:t>, all data extraction</w:t>
-      </w:r>
-      <w:r>
-        <w:t>s</w:t>
-      </w:r>
-      <w:r>
-        <w:t>, risk of bias assessments, effect size calculations, and meta-analysis code and data</w:t>
-      </w:r>
-      <w:r>
-        <w:t>, etc.</w:t>
-      </w:r>
-      <w:r>
-        <w:t xml:space="preserve"> A full variable description is available in the second sheet of the gb_dat.x</w:t>
-      </w:r>
-      <w:r>
-        <w:t>l</w:t>
-      </w:r>
-      <w:r>
-        <w:t xml:space="preserve">sx data.  </w:t>
-      </w:r>
-    </w:p>
-    <w:p>
-      <w:pPr>
-        <w:pStyle w:val="Heading3"/>
-      </w:pPr>
-      <w:r>
-        <w:t>Code availability</w:t>
-      </w:r>
-    </w:p>
-    <w:p>
-      <w:r>
-        <w:t>All codes</w:t>
-      </w:r>
-      <w:r>
-        <w:t xml:space="preserve"> can be found</w:t>
-      </w:r>
-      <w:r>
-        <w:t xml:space="preserve"> </w:t>
-      </w:r>
-      <w:r>
-        <w:t>in the following online material</w:t>
-      </w:r>
-      <w:r>
-        <w:t xml:space="preserve"> stored at </w:t>
-      </w:r>
       <w:hyperlink r:id="rId16" w:history="1">
         <w:r>
           <w:rPr>
@@ -18819,6 +19562,66 @@
         </w:r>
       </w:hyperlink>
       <w:r>
+        <w:t>. This includes search string</w:t>
+      </w:r>
+      <w:r>
+        <w:t xml:space="preserve"> examples</w:t>
+      </w:r>
+      <w:r>
+        <w:t>, all data extraction</w:t>
+      </w:r>
+      <w:r>
+        <w:t>s</w:t>
+      </w:r>
+      <w:r>
+        <w:t>, risk of bias assessments, effect size calculations, and meta-analysis code and data</w:t>
+      </w:r>
+      <w:r>
+        <w:t>, etc.</w:t>
+      </w:r>
+      <w:r>
+        <w:t xml:space="preserve"> A full variable description is available in the second sheet of the gb_dat.x</w:t>
+      </w:r>
+      <w:r>
+        <w:t>l</w:t>
+      </w:r>
+      <w:r>
+        <w:t xml:space="preserve">sx data.  </w:t>
+      </w:r>
+    </w:p>
+    <w:p>
+      <w:pPr>
+        <w:pStyle w:val="Heading3"/>
+      </w:pPr>
+      <w:r>
+        <w:t>Code availability</w:t>
+      </w:r>
+    </w:p>
+    <w:p>
+      <w:r>
+        <w:t>All codes</w:t>
+      </w:r>
+      <w:r>
+        <w:t xml:space="preserve"> can be found</w:t>
+      </w:r>
+      <w:r>
+        <w:t xml:space="preserve"> </w:t>
+      </w:r>
+      <w:r>
+        <w:t>in the following online material</w:t>
+      </w:r>
+      <w:r>
+        <w:t xml:space="preserve"> stored at </w:t>
+      </w:r>
+      <w:hyperlink r:id="rId17" w:history="1">
+        <w:r>
+          <w:rPr>
+            <w:rStyle w:val="Hyperlink"/>
+          </w:rPr>
+          <w:t>https://osf.io/s2j9a</w:t>
+        </w:r>
+      </w:hyperlink>
+      <w:r>
         <w:t>:</w:t>
       </w:r>
     </w:p>
@@ -18852,15 +19655,7 @@
         <w:t>Appendix B:</w:t>
       </w:r>
       <w:r>
-        <w:t xml:space="preserve"> Data manipulation, </w:t>
-      </w:r>
-      <w:proofErr w:type="spellStart"/>
-      <w:r>
-        <w:t>RoB</w:t>
-      </w:r>
-      <w:proofErr w:type="spellEnd"/>
-      <w:r>
-        <w:t xml:space="preserve"> visualization, and PRIMED workflow</w:t>
+        <w:t xml:space="preserve"> Data manipulation, RoB visualization, and PRIMED workflow</w:t>
       </w:r>
     </w:p>
     <w:p>
@@ -23325,18 +24120,258 @@
     </w:p>
     <w:p>
       <w:pPr>
-        <w:spacing w:line="240" w:lineRule="auto"/>
-        <w:rPr>
-          <w:lang w:val="da-DK"/>
-        </w:rPr>
-      </w:pPr>
-      <w:r>
-        <w:rPr>
-          <w:rFonts w:cs="Times New Roman"/>
-        </w:rPr>
+        <w:pStyle w:val="Heading2"/>
+      </w:pPr>
+      <w:r>
         <w:lastRenderedPageBreak/>
         <w:fldChar w:fldCharType="end"/>
       </w:r>
+      <w:r>
+        <w:t>Acknowledgements</w:t>
+      </w:r>
+    </w:p>
+    <w:p>
+      <w:pPr>
+        <w:spacing w:line="240" w:lineRule="auto"/>
+        <w:rPr>
+          <w:rFonts w:cs="Times New Roman"/>
+        </w:rPr>
+      </w:pPr>
+      <w:r>
+        <w:rPr>
+          <w:rFonts w:cs="Times New Roman"/>
+        </w:rPr>
+        <w:t>The authors would like</w:t>
+      </w:r>
+      <w:r>
+        <w:rPr>
+          <w:rFonts w:cs="Times New Roman"/>
+        </w:rPr>
+        <w:t xml:space="preserve"> </w:t>
+      </w:r>
+      <w:r>
+        <w:rPr>
+          <w:rFonts w:cs="Times New Roman"/>
+        </w:rPr>
+        <w:t xml:space="preserve">to </w:t>
+      </w:r>
+      <w:r>
+        <w:rPr>
+          <w:rFonts w:cs="Times New Roman"/>
+        </w:rPr>
+        <w:t>thank</w:t>
+      </w:r>
+      <w:r>
+        <w:rPr>
+          <w:rFonts w:cs="Times New Roman"/>
+        </w:rPr>
+        <w:t xml:space="preserve"> Jens Dietrichson and</w:t>
+      </w:r>
+      <w:r>
+        <w:rPr>
+          <w:rFonts w:cs="Times New Roman"/>
+        </w:rPr>
+        <w:t xml:space="preserve"> research assistants Rune Klitg</w:t>
+      </w:r>
+      <w:r>
+        <w:rPr>
+          <w:rFonts w:cs="Times New Roman" w:hint="eastAsia"/>
+        </w:rPr>
+        <w:t>å</w:t>
+      </w:r>
+      <w:r>
+        <w:rPr>
+          <w:rFonts w:cs="Times New Roman"/>
+        </w:rPr>
+        <w:t>rd and Julie Mulla Reich</w:t>
+      </w:r>
+      <w:r>
+        <w:rPr>
+          <w:rFonts w:cs="Times New Roman"/>
+        </w:rPr>
+        <w:t xml:space="preserve">. </w:t>
+      </w:r>
+    </w:p>
+    <w:p>
+      <w:pPr>
+        <w:pStyle w:val="Heading2"/>
+      </w:pPr>
+      <w:r>
+        <w:t>Author contributions</w:t>
+      </w:r>
+    </w:p>
+    <w:p>
+      <w:pPr>
+        <w:spacing w:after="0" w:line="240" w:lineRule="auto"/>
+      </w:pPr>
+      <w:r>
+        <w:t xml:space="preserve">Conceptualization: </w:t>
+      </w:r>
+      <w:r>
+        <w:t>N.T.D, M.C.F.J, and M.H.V</w:t>
+      </w:r>
+    </w:p>
+    <w:p>
+      <w:pPr>
+        <w:spacing w:after="0" w:line="240" w:lineRule="auto"/>
+      </w:pPr>
+      <w:r>
+        <w:t>Methodology: the search strategy, literature search</w:t>
+      </w:r>
+      <w:r>
+        <w:t>: E.B</w:t>
+      </w:r>
+      <w:r>
+        <w:t xml:space="preserve"> and</w:t>
+      </w:r>
+      <w:r>
+        <w:t xml:space="preserve"> N.T.D</w:t>
+      </w:r>
+    </w:p>
+    <w:p>
+      <w:pPr>
+        <w:spacing w:after="0" w:line="240" w:lineRule="auto"/>
+      </w:pPr>
+      <w:r>
+        <w:t>D</w:t>
+      </w:r>
+      <w:r>
+        <w:t>ata</w:t>
+      </w:r>
+      <w:r>
+        <w:t xml:space="preserve"> </w:t>
+      </w:r>
+      <w:r>
+        <w:t xml:space="preserve">extraction </w:t>
+      </w:r>
+      <w:r>
+        <w:t>conceptualization</w:t>
+      </w:r>
+      <w:r>
+        <w:t>: N.T.D, M.C.F.J, and M.H.V</w:t>
+      </w:r>
+    </w:p>
+    <w:p>
+      <w:pPr>
+        <w:spacing w:after="0" w:line="240" w:lineRule="auto"/>
+      </w:pPr>
+      <w:r>
+        <w:t>Abstract screening</w:t>
+      </w:r>
+      <w:r>
+        <w:t>: J.K.J, J.S.A, N.T.D.</w:t>
+      </w:r>
+      <w:r>
+        <w:t>, and</w:t>
+      </w:r>
+      <w:r>
+        <w:t xml:space="preserve"> M.H.V.</w:t>
+      </w:r>
+    </w:p>
+    <w:p>
+      <w:pPr>
+        <w:spacing w:after="0" w:line="240" w:lineRule="auto"/>
+      </w:pPr>
+      <w:r>
+        <w:t>Full-text screening</w:t>
+      </w:r>
+      <w:r>
+        <w:t>:</w:t>
+      </w:r>
+      <w:r>
+        <w:t xml:space="preserve"> J.K.J, J.S.A, N.T.D., and M.H.V.</w:t>
+      </w:r>
+    </w:p>
+    <w:p>
+      <w:pPr>
+        <w:spacing w:after="0" w:line="240" w:lineRule="auto"/>
+      </w:pPr>
+      <w:r>
+        <w:t>Data</w:t>
+      </w:r>
+      <w:r>
+        <w:t xml:space="preserve"> </w:t>
+      </w:r>
+      <w:r>
+        <w:t>coding and extraction</w:t>
+      </w:r>
+      <w:r>
+        <w:t>: J.K.J, J.S.A, N.T.D., and M.H.V.</w:t>
+      </w:r>
+    </w:p>
+    <w:p>
+      <w:pPr>
+        <w:spacing w:after="0" w:line="240" w:lineRule="auto"/>
+      </w:pPr>
+      <w:r>
+        <w:t>Statistical analysis</w:t>
+      </w:r>
+      <w:r>
+        <w:t>: M.H.V and J.K.J</w:t>
+      </w:r>
+    </w:p>
+    <w:p>
+      <w:pPr>
+        <w:spacing w:after="0" w:line="240" w:lineRule="auto"/>
+      </w:pPr>
+      <w:r>
+        <w:t>Formal analysis and investigation:</w:t>
+      </w:r>
+      <w:r>
+        <w:t xml:space="preserve"> M.H.V, N.T.D, and J.K.J</w:t>
+      </w:r>
+    </w:p>
+    <w:p>
+      <w:pPr>
+        <w:spacing w:after="0" w:line="240" w:lineRule="auto"/>
+      </w:pPr>
+      <w:r>
+        <w:t>Writing</w:t>
+      </w:r>
+      <w:r>
+        <w:t xml:space="preserve"> </w:t>
+      </w:r>
+      <w:r>
+        <w:t>(original draft preparation)</w:t>
+      </w:r>
+      <w:r>
+        <w:t>: M.H.V</w:t>
+      </w:r>
+      <w:r>
+        <w:t>, N.T.D, and M.C.F.J</w:t>
+      </w:r>
+    </w:p>
+    <w:p>
+      <w:pPr>
+        <w:pStyle w:val="Heading2"/>
+      </w:pPr>
+      <w:r>
+        <w:t>Funding</w:t>
+      </w:r>
+    </w:p>
+    <w:p>
+      <w:pPr>
+        <w:spacing w:line="240" w:lineRule="auto"/>
+      </w:pPr>
+      <w:r>
+        <w:t>Internally funded by VIVE – The Danish Center for Social Science Research</w:t>
+      </w:r>
+    </w:p>
+    <w:p>
+      <w:pPr>
+        <w:pStyle w:val="Heading2"/>
+      </w:pPr>
+      <w:r>
+        <w:t>Competing interests</w:t>
+      </w:r>
+    </w:p>
+    <w:p>
+      <w:pPr>
+        <w:spacing w:line="240" w:lineRule="auto"/>
+      </w:pPr>
+      <w:r>
+        <w:t>The authors declare no competing interests.</w:t>
+      </w:r>
     </w:p>
     <w:p>
       <w:pPr>
@@ -23344,12 +24379,11 @@
         <w:jc w:val="both"/>
         <w:rPr>
           <w:rFonts w:cs="Times New Roman"/>
-          <w:lang w:val="da-DK"/>
         </w:rPr>
       </w:pPr>
     </w:p>
     <w:sectPr>
-      <w:headerReference w:type="default" r:id="rId17"/>
+      <w:headerReference w:type="default" r:id="rId18"/>
       <w:pgSz w:w="12240" w:h="15840"/>
       <w:pgMar w:top="1701" w:right="1134" w:bottom="1701" w:left="1134" w:header="708" w:footer="708" w:gutter="0"/>
       <w:cols w:space="708"/>

</xml_diff>